<commit_message>
Correções na entidade pessoa e adiciona DD-ImovelJa
</commit_message>
<xml_diff>
--- a/Requisitos/Documentos de Casos de Uso/DD-ImovelJa.docx
+++ b/Requisitos/Documentos de Casos de Uso/DD-ImovelJa.docx
@@ -24,7 +24,18 @@
           <w:sz w:val="36"/>
           <w:szCs w:val="36"/>
         </w:rPr>
-        <w:t>ImóvelJá</w:t>
+        <w:t>Imóv</w:t>
+      </w:r>
+      <w:bookmarkStart w:id="0" w:name="_GoBack"/>
+      <w:bookmarkEnd w:id="0"/>
+      <w:r>
+        <w:rPr>
+          <w:b/>
+          <w:bCs/>
+          <w:sz w:val="36"/>
+          <w:szCs w:val="36"/>
+        </w:rPr>
+        <w:t>elJá</w:t>
       </w:r>
       <w:proofErr w:type="spellEnd"/>
     </w:p>
@@ -251,7 +262,6 @@
             </w:tcBorders>
           </w:tcPr>
           <w:p>
-            <w:bookmarkStart w:id="0" w:name="_GoBack"/>
             <w:r>
               <w:rPr>
                 <w:sz w:val="28"/>
@@ -368,7 +378,6 @@
           <w:p/>
         </w:tc>
       </w:tr>
-      <w:bookmarkEnd w:id="0"/>
       <w:tr>
         <w:tc>
           <w:tcPr>
@@ -3599,7 +3608,6 @@
                 <w:sz w:val="28"/>
                 <w:szCs w:val="28"/>
               </w:rPr>
-              <w:lastRenderedPageBreak/>
               <w:t>Pessoa Física (especializa Usuário)</w:t>
             </w:r>
           </w:p>
@@ -3660,7 +3668,7 @@
                 <w:sz w:val="28"/>
                 <w:szCs w:val="28"/>
               </w:rPr>
-              <w:t>14</w:t>
+              <w:t>11</w:t>
             </w:r>
           </w:p>
         </w:tc>
@@ -3714,15 +3722,7 @@
               <w:right w:val="single" w:sz="4" w:space="0" w:color="000000"/>
             </w:tcBorders>
           </w:tcPr>
-          <w:p>
-            <w:r>
-              <w:rPr>
-                <w:sz w:val="28"/>
-                <w:szCs w:val="28"/>
-              </w:rPr>
-              <w:t>Formato 000.000.000-00</w:t>
-            </w:r>
-          </w:p>
+          <w:p/>
         </w:tc>
       </w:tr>
       <w:tr>
@@ -3862,10 +3862,16 @@
             </w:tcBorders>
           </w:tcPr>
           <w:p>
-            <w:r>
-              <w:rPr>
-                <w:sz w:val="28"/>
-                <w:szCs w:val="28"/>
+            <w:pPr>
+              <w:rPr>
+                <w:u w:val="single"/>
+              </w:rPr>
+            </w:pPr>
+            <w:r>
+              <w:rPr>
+                <w:sz w:val="28"/>
+                <w:szCs w:val="28"/>
+                <w:u w:val="single"/>
               </w:rPr>
               <w:t>Pessoa Jurídica (especializa Usuário)</w:t>
             </w:r>
@@ -3882,10 +3888,16 @@
             </w:tcBorders>
           </w:tcPr>
           <w:p>
-            <w:r>
-              <w:rPr>
-                <w:sz w:val="28"/>
-                <w:szCs w:val="28"/>
+            <w:pPr>
+              <w:rPr>
+                <w:u w:val="single"/>
+              </w:rPr>
+            </w:pPr>
+            <w:r>
+              <w:rPr>
+                <w:sz w:val="28"/>
+                <w:szCs w:val="28"/>
+                <w:u w:val="single"/>
               </w:rPr>
               <w:t>CNPJ</w:t>
             </w:r>
@@ -3902,10 +3914,16 @@
             </w:tcBorders>
           </w:tcPr>
           <w:p>
-            <w:r>
-              <w:rPr>
-                <w:sz w:val="28"/>
-                <w:szCs w:val="28"/>
+            <w:pPr>
+              <w:rPr>
+                <w:u w:val="single"/>
+              </w:rPr>
+            </w:pPr>
+            <w:r>
+              <w:rPr>
+                <w:sz w:val="28"/>
+                <w:szCs w:val="28"/>
+                <w:u w:val="single"/>
               </w:rPr>
               <w:t>Char</w:t>
             </w:r>
@@ -3922,12 +3940,18 @@
             </w:tcBorders>
           </w:tcPr>
           <w:p>
-            <w:r>
-              <w:rPr>
-                <w:sz w:val="28"/>
-                <w:szCs w:val="28"/>
-              </w:rPr>
-              <w:t>18</w:t>
+            <w:pPr>
+              <w:rPr>
+                <w:u w:val="single"/>
+              </w:rPr>
+            </w:pPr>
+            <w:r>
+              <w:rPr>
+                <w:sz w:val="28"/>
+                <w:szCs w:val="28"/>
+                <w:u w:val="single"/>
+              </w:rPr>
+              <w:t>14</w:t>
             </w:r>
           </w:p>
         </w:tc>
@@ -3942,10 +3966,16 @@
             </w:tcBorders>
           </w:tcPr>
           <w:p>
-            <w:r>
-              <w:rPr>
-                <w:sz w:val="28"/>
-                <w:szCs w:val="28"/>
+            <w:pPr>
+              <w:rPr>
+                <w:u w:val="single"/>
+              </w:rPr>
+            </w:pPr>
+            <w:r>
+              <w:rPr>
+                <w:sz w:val="28"/>
+                <w:szCs w:val="28"/>
+                <w:u w:val="single"/>
               </w:rPr>
               <w:t>*</w:t>
             </w:r>
@@ -3962,10 +3992,16 @@
             </w:tcBorders>
           </w:tcPr>
           <w:p>
-            <w:r>
-              <w:rPr>
-                <w:sz w:val="28"/>
-                <w:szCs w:val="28"/>
+            <w:pPr>
+              <w:rPr>
+                <w:u w:val="single"/>
+              </w:rPr>
+            </w:pPr>
+            <w:r>
+              <w:rPr>
+                <w:sz w:val="28"/>
+                <w:szCs w:val="28"/>
+                <w:u w:val="single"/>
               </w:rPr>
               <w:t>*</w:t>
             </w:r>
@@ -3982,13 +4018,11 @@
             </w:tcBorders>
           </w:tcPr>
           <w:p>
-            <w:r>
-              <w:rPr>
-                <w:sz w:val="28"/>
-                <w:szCs w:val="28"/>
-              </w:rPr>
-              <w:t xml:space="preserve">Formato 00.000.000/0000-00. </w:t>
-            </w:r>
+            <w:pPr>
+              <w:rPr>
+                <w:u w:val="single"/>
+              </w:rPr>
+            </w:pPr>
           </w:p>
         </w:tc>
       </w:tr>

</xml_diff>

<commit_message>
docs: renomeia Anúncio para Imóvel e Usuário para Pessoa no dicionário de dados e no glossário, removendo senha. Issue #30
</commit_message>
<xml_diff>
--- a/Requisitos/Documentos de Casos de Uso/DD-ImovelJa.docx
+++ b/Requisitos/Documentos de Casos de Uso/DD-ImovelJa.docx
@@ -16,7 +16,6 @@
         </w:rPr>
         <w:t xml:space="preserve">DD: </w:t>
       </w:r>
-      <w:proofErr w:type="spellStart"/>
       <w:r>
         <w:rPr>
           <w:b/>
@@ -37,7 +36,6 @@
         </w:rPr>
         <w:t>elJá</w:t>
       </w:r>
-      <w:proofErr w:type="spellEnd"/>
     </w:p>
     <w:p/>
     <w:tbl>
@@ -267,7 +265,7 @@
                 <w:sz w:val="28"/>
                 <w:szCs w:val="28"/>
               </w:rPr>
-              <w:t>Anúncio</w:t>
+              <w:t>Imóvel</w:t>
             </w:r>
           </w:p>
         </w:tc>
@@ -282,7 +280,6 @@
             </w:tcBorders>
           </w:tcPr>
           <w:p>
-            <w:proofErr w:type="spellStart"/>
             <w:r>
               <w:rPr>
                 <w:sz w:val="28"/>
@@ -290,7 +287,6 @@
               </w:rPr>
               <w:t>codigo</w:t>
             </w:r>
-            <w:proofErr w:type="spellEnd"/>
           </w:p>
         </w:tc>
         <w:tc>
@@ -546,7 +542,6 @@
             </w:tcBorders>
           </w:tcPr>
           <w:p>
-            <w:proofErr w:type="spellStart"/>
             <w:r>
               <w:rPr>
                 <w:sz w:val="28"/>
@@ -554,7 +549,6 @@
               </w:rPr>
               <w:t>descricao</w:t>
             </w:r>
-            <w:proofErr w:type="spellEnd"/>
           </w:p>
         </w:tc>
         <w:tc>
@@ -833,7 +827,6 @@
             </w:tcBorders>
           </w:tcPr>
           <w:p>
-            <w:proofErr w:type="spellStart"/>
             <w:r>
               <w:rPr>
                 <w:sz w:val="28"/>
@@ -841,7 +834,6 @@
               </w:rPr>
               <w:t>areaTotal</w:t>
             </w:r>
-            <w:proofErr w:type="spellEnd"/>
           </w:p>
         </w:tc>
         <w:tc>
@@ -855,7 +847,6 @@
             </w:tcBorders>
           </w:tcPr>
           <w:p>
-            <w:proofErr w:type="spellStart"/>
             <w:r>
               <w:rPr>
                 <w:sz w:val="28"/>
@@ -863,7 +854,6 @@
               </w:rPr>
               <w:t>Float</w:t>
             </w:r>
-            <w:proofErr w:type="spellEnd"/>
           </w:p>
         </w:tc>
         <w:tc>
@@ -960,7 +950,6 @@
             </w:tcBorders>
           </w:tcPr>
           <w:p>
-            <w:proofErr w:type="spellStart"/>
             <w:r>
               <w:rPr>
                 <w:sz w:val="28"/>
@@ -968,7 +957,6 @@
               </w:rPr>
               <w:t>nBanheiros</w:t>
             </w:r>
-            <w:proofErr w:type="spellEnd"/>
           </w:p>
         </w:tc>
         <w:tc>
@@ -1085,7 +1073,6 @@
             </w:tcBorders>
           </w:tcPr>
           <w:p>
-            <w:proofErr w:type="spellStart"/>
             <w:r>
               <w:rPr>
                 <w:sz w:val="28"/>
@@ -1093,7 +1080,6 @@
               </w:rPr>
               <w:t>nQuartos</w:t>
             </w:r>
-            <w:proofErr w:type="spellEnd"/>
           </w:p>
         </w:tc>
         <w:tc>
@@ -1202,7 +1188,6 @@
             </w:tcBorders>
           </w:tcPr>
           <w:p>
-            <w:proofErr w:type="spellStart"/>
             <w:r>
               <w:rPr>
                 <w:sz w:val="28"/>
@@ -1210,7 +1195,6 @@
               </w:rPr>
               <w:t>areaGaragem</w:t>
             </w:r>
-            <w:proofErr w:type="spellEnd"/>
           </w:p>
         </w:tc>
         <w:tc>
@@ -1224,7 +1208,6 @@
             </w:tcBorders>
           </w:tcPr>
           <w:p>
-            <w:proofErr w:type="spellStart"/>
             <w:r>
               <w:rPr>
                 <w:sz w:val="28"/>
@@ -1232,7 +1215,6 @@
               </w:rPr>
               <w:t>Float</w:t>
             </w:r>
-            <w:proofErr w:type="spellEnd"/>
           </w:p>
         </w:tc>
         <w:tc>
@@ -1321,7 +1303,6 @@
             </w:tcBorders>
           </w:tcPr>
           <w:p>
-            <w:proofErr w:type="spellStart"/>
             <w:r>
               <w:rPr>
                 <w:sz w:val="28"/>
@@ -1329,7 +1310,6 @@
               </w:rPr>
               <w:t>areaCozinha</w:t>
             </w:r>
-            <w:proofErr w:type="spellEnd"/>
           </w:p>
         </w:tc>
         <w:tc>
@@ -1343,7 +1323,6 @@
             </w:tcBorders>
           </w:tcPr>
           <w:p>
-            <w:proofErr w:type="spellStart"/>
             <w:r>
               <w:rPr>
                 <w:sz w:val="28"/>
@@ -1351,7 +1330,6 @@
               </w:rPr>
               <w:t>Float</w:t>
             </w:r>
-            <w:proofErr w:type="spellEnd"/>
           </w:p>
         </w:tc>
         <w:tc>
@@ -1440,7 +1418,6 @@
             </w:tcBorders>
           </w:tcPr>
           <w:p>
-            <w:proofErr w:type="spellStart"/>
             <w:r>
               <w:rPr>
                 <w:sz w:val="28"/>
@@ -1448,7 +1425,6 @@
               </w:rPr>
               <w:t>areaSala</w:t>
             </w:r>
-            <w:proofErr w:type="spellEnd"/>
           </w:p>
         </w:tc>
         <w:tc>
@@ -1462,7 +1438,6 @@
             </w:tcBorders>
           </w:tcPr>
           <w:p>
-            <w:proofErr w:type="spellStart"/>
             <w:r>
               <w:rPr>
                 <w:sz w:val="28"/>
@@ -1470,7 +1445,6 @@
               </w:rPr>
               <w:t>Float</w:t>
             </w:r>
-            <w:proofErr w:type="spellEnd"/>
           </w:p>
         </w:tc>
         <w:tc>
@@ -1559,7 +1533,6 @@
             </w:tcBorders>
           </w:tcPr>
           <w:p>
-            <w:proofErr w:type="spellStart"/>
             <w:r>
               <w:rPr>
                 <w:sz w:val="28"/>
@@ -1567,7 +1540,6 @@
               </w:rPr>
               <w:t>areaQuintal</w:t>
             </w:r>
-            <w:proofErr w:type="spellEnd"/>
           </w:p>
         </w:tc>
         <w:tc>
@@ -1581,7 +1553,6 @@
             </w:tcBorders>
           </w:tcPr>
           <w:p>
-            <w:proofErr w:type="spellStart"/>
             <w:r>
               <w:rPr>
                 <w:sz w:val="28"/>
@@ -1589,7 +1560,6 @@
               </w:rPr>
               <w:t>Float</w:t>
             </w:r>
-            <w:proofErr w:type="spellEnd"/>
           </w:p>
         </w:tc>
         <w:tc>
@@ -1678,7 +1648,6 @@
             </w:tcBorders>
           </w:tcPr>
           <w:p>
-            <w:proofErr w:type="spellStart"/>
             <w:r>
               <w:rPr>
                 <w:sz w:val="28"/>
@@ -1686,7 +1655,6 @@
               </w:rPr>
               <w:t>areaLavanderia</w:t>
             </w:r>
-            <w:proofErr w:type="spellEnd"/>
           </w:p>
         </w:tc>
         <w:tc>
@@ -1700,7 +1668,6 @@
             </w:tcBorders>
           </w:tcPr>
           <w:p>
-            <w:proofErr w:type="spellStart"/>
             <w:r>
               <w:rPr>
                 <w:sz w:val="28"/>
@@ -1708,7 +1675,6 @@
               </w:rPr>
               <w:t>Float</w:t>
             </w:r>
-            <w:proofErr w:type="spellEnd"/>
           </w:p>
         </w:tc>
         <w:tc>
@@ -2448,7 +2414,6 @@
             </w:tcBorders>
           </w:tcPr>
           <w:p>
-            <w:proofErr w:type="spellStart"/>
             <w:r>
               <w:rPr>
                 <w:sz w:val="28"/>
@@ -2456,7 +2421,6 @@
               </w:rPr>
               <w:t>Float</w:t>
             </w:r>
-            <w:proofErr w:type="spellEnd"/>
           </w:p>
         </w:tc>
         <w:tc>
@@ -2812,7 +2776,7 @@
                 <w:sz w:val="28"/>
                 <w:szCs w:val="28"/>
               </w:rPr>
-              <w:t>Usuário (superclasse)</w:t>
+              <w:t>Pessoa (superclasse)</w:t>
             </w:r>
           </w:p>
         </w:tc>
@@ -2827,7 +2791,6 @@
             </w:tcBorders>
           </w:tcPr>
           <w:p>
-            <w:proofErr w:type="spellStart"/>
             <w:r>
               <w:rPr>
                 <w:sz w:val="28"/>
@@ -2835,7 +2798,6 @@
               </w:rPr>
               <w:t>codigo</w:t>
             </w:r>
-            <w:proofErr w:type="spellEnd"/>
           </w:p>
         </w:tc>
         <w:tc>
@@ -3099,7 +3061,6 @@
             </w:tcBorders>
           </w:tcPr>
           <w:p>
-            <w:proofErr w:type="spellStart"/>
             <w:r>
               <w:rPr>
                 <w:sz w:val="28"/>
@@ -3107,7 +3068,6 @@
               </w:rPr>
               <w:t>email</w:t>
             </w:r>
-            <w:proofErr w:type="spellEnd"/>
           </w:p>
         </w:tc>
         <w:tc>
@@ -3237,7 +3197,7 @@
                 <w:sz w:val="28"/>
                 <w:szCs w:val="28"/>
               </w:rPr>
-              <w:t>senha</w:t>
+              <w:t>nome</w:t>
             </w:r>
           </w:p>
         </w:tc>
@@ -3277,7 +3237,7 @@
                 <w:sz w:val="28"/>
                 <w:szCs w:val="28"/>
               </w:rPr>
-              <w:t>30</w:t>
+              <w:t>100</w:t>
             </w:r>
           </w:p>
         </w:tc>
@@ -3368,7 +3328,7 @@
                 <w:sz w:val="28"/>
                 <w:szCs w:val="28"/>
               </w:rPr>
-              <w:t>nome</w:t>
+              <w:t>fotoPerfil</w:t>
             </w:r>
           </w:p>
         </w:tc>
@@ -3408,7 +3368,7 @@
                 <w:sz w:val="28"/>
                 <w:szCs w:val="28"/>
               </w:rPr>
-              <w:t>100</w:t>
+              <w:t>255</w:t>
             </w:r>
           </w:p>
         </w:tc>
@@ -3423,6 +3383,141 @@
             </w:tcBorders>
           </w:tcPr>
           <w:p/>
+        </w:tc>
+        <w:tc>
+          <w:tcPr>
+            <w:tcW w:w="1170" w:type="dxa"/>
+            <w:tcBorders>
+              <w:top w:val="single" w:sz="4" w:space="0" w:color="000000"/>
+              <w:left w:val="single" w:sz="4" w:space="0" w:color="000000"/>
+              <w:bottom w:val="single" w:sz="4" w:space="0" w:color="000000"/>
+              <w:right w:val="single" w:sz="4" w:space="0" w:color="000000"/>
+            </w:tcBorders>
+          </w:tcPr>
+          <w:p/>
+        </w:tc>
+        <w:tc>
+          <w:tcPr>
+            <w:tcW w:w="1980" w:type="dxa"/>
+            <w:tcBorders>
+              <w:top w:val="single" w:sz="4" w:space="0" w:color="000000"/>
+              <w:left w:val="single" w:sz="4" w:space="0" w:color="000000"/>
+              <w:bottom w:val="single" w:sz="4" w:space="0" w:color="000000"/>
+              <w:right w:val="single" w:sz="4" w:space="0" w:color="000000"/>
+            </w:tcBorders>
+          </w:tcPr>
+          <w:p>
+            <w:r>
+              <w:rPr>
+                <w:sz w:val="28"/>
+                <w:szCs w:val="28"/>
+              </w:rPr>
+              <w:t>Caminho/URL da imagem de perfil</w:t>
+            </w:r>
+          </w:p>
+        </w:tc>
+      </w:tr>
+      <w:tr>
+        <w:tc>
+          <w:tcPr>
+            <w:tcW w:w="1305" w:type="dxa"/>
+            <w:vMerge w:val="restart"/>
+            <w:tcBorders>
+              <w:top w:val="single" w:sz="4" w:space="0" w:color="000000"/>
+              <w:left w:val="single" w:sz="4" w:space="0" w:color="000000"/>
+              <w:bottom w:val="single" w:sz="4" w:space="0" w:color="000000"/>
+              <w:right w:val="single" w:sz="4" w:space="0" w:color="000000"/>
+            </w:tcBorders>
+          </w:tcPr>
+          <w:p>
+            <w:r>
+              <w:rPr>
+                <w:sz w:val="28"/>
+                <w:szCs w:val="28"/>
+              </w:rPr>
+              <w:t>Pessoa Física (especializa Pessoa)</w:t>
+            </w:r>
+          </w:p>
+        </w:tc>
+        <w:tc>
+          <w:tcPr>
+            <w:tcW w:w="2205" w:type="dxa"/>
+            <w:tcBorders>
+              <w:top w:val="single" w:sz="4" w:space="0" w:color="000000"/>
+              <w:left w:val="single" w:sz="4" w:space="0" w:color="000000"/>
+              <w:bottom w:val="single" w:sz="4" w:space="0" w:color="000000"/>
+              <w:right w:val="single" w:sz="4" w:space="0" w:color="000000"/>
+            </w:tcBorders>
+          </w:tcPr>
+          <w:p>
+            <w:r>
+              <w:rPr>
+                <w:sz w:val="28"/>
+                <w:szCs w:val="28"/>
+              </w:rPr>
+              <w:t>CPF</w:t>
+            </w:r>
+          </w:p>
+        </w:tc>
+        <w:tc>
+          <w:tcPr>
+            <w:tcW w:w="1200" w:type="dxa"/>
+            <w:tcBorders>
+              <w:top w:val="single" w:sz="4" w:space="0" w:color="000000"/>
+              <w:left w:val="single" w:sz="4" w:space="0" w:color="000000"/>
+              <w:bottom w:val="single" w:sz="4" w:space="0" w:color="000000"/>
+              <w:right w:val="single" w:sz="4" w:space="0" w:color="000000"/>
+            </w:tcBorders>
+          </w:tcPr>
+          <w:p>
+            <w:r>
+              <w:rPr>
+                <w:sz w:val="28"/>
+                <w:szCs w:val="28"/>
+              </w:rPr>
+              <w:t>Char</w:t>
+            </w:r>
+          </w:p>
+        </w:tc>
+        <w:tc>
+          <w:tcPr>
+            <w:tcW w:w="1440" w:type="dxa"/>
+            <w:tcBorders>
+              <w:top w:val="single" w:sz="4" w:space="0" w:color="000000"/>
+              <w:left w:val="single" w:sz="4" w:space="0" w:color="000000"/>
+              <w:bottom w:val="single" w:sz="4" w:space="0" w:color="000000"/>
+              <w:right w:val="single" w:sz="4" w:space="0" w:color="000000"/>
+            </w:tcBorders>
+          </w:tcPr>
+          <w:p>
+            <w:r>
+              <w:rPr>
+                <w:sz w:val="28"/>
+                <w:szCs w:val="28"/>
+              </w:rPr>
+              <w:t>11</w:t>
+            </w:r>
+          </w:p>
+        </w:tc>
+        <w:tc>
+          <w:tcPr>
+            <w:tcW w:w="1005" w:type="dxa"/>
+            <w:tcBorders>
+              <w:top w:val="single" w:sz="4" w:space="0" w:color="000000"/>
+              <w:left w:val="single" w:sz="4" w:space="0" w:color="000000"/>
+              <w:bottom w:val="single" w:sz="4" w:space="0" w:color="000000"/>
+              <w:right w:val="single" w:sz="4" w:space="0" w:color="000000"/>
+            </w:tcBorders>
+          </w:tcPr>
+          <w:p>
+            <w:r>
+              <w:rPr>
+                <w:sz w:val="28"/>
+                <w:szCs w:val="28"/>
+              </w:rPr>
+              <w:t>*</w:t>
+            </w:r>
+          </w:p>
         </w:tc>
         <w:tc>
           <w:tcPr>
@@ -3494,15 +3589,13 @@
             </w:tcBorders>
           </w:tcPr>
           <w:p>
-            <w:proofErr w:type="spellStart"/>
-            <w:r>
-              <w:rPr>
-                <w:sz w:val="28"/>
-                <w:szCs w:val="28"/>
-              </w:rPr>
-              <w:t>fotoPerfil</w:t>
-            </w:r>
-            <w:proofErr w:type="spellEnd"/>
+            <w:r>
+              <w:rPr>
+                <w:sz w:val="28"/>
+                <w:szCs w:val="28"/>
+              </w:rPr>
+              <w:t>dataNascimento</w:t>
+            </w:r>
           </w:p>
         </w:tc>
         <w:tc>
@@ -3521,7 +3614,7 @@
                 <w:sz w:val="28"/>
                 <w:szCs w:val="28"/>
               </w:rPr>
-              <w:t>Char</w:t>
+              <w:t>Date</w:t>
             </w:r>
           </w:p>
         </w:tc>
@@ -3535,15 +3628,7 @@
               <w:right w:val="single" w:sz="4" w:space="0" w:color="000000"/>
             </w:tcBorders>
           </w:tcPr>
-          <w:p>
-            <w:r>
-              <w:rPr>
-                <w:sz w:val="28"/>
-                <w:szCs w:val="28"/>
-              </w:rPr>
-              <w:t>255</w:t>
-            </w:r>
-          </w:p>
+          <w:p/>
         </w:tc>
         <w:tc>
           <w:tcPr>
@@ -3567,7 +3652,15 @@
               <w:right w:val="single" w:sz="4" w:space="0" w:color="000000"/>
             </w:tcBorders>
           </w:tcPr>
-          <w:p/>
+          <w:p>
+            <w:r>
+              <w:rPr>
+                <w:sz w:val="28"/>
+                <w:szCs w:val="28"/>
+              </w:rPr>
+              <w:t>*</w:t>
+            </w:r>
+          </w:p>
         </w:tc>
         <w:tc>
           <w:tcPr>
@@ -3579,21 +3672,189 @@
               <w:right w:val="single" w:sz="4" w:space="0" w:color="000000"/>
             </w:tcBorders>
           </w:tcPr>
-          <w:p>
-            <w:r>
-              <w:rPr>
-                <w:sz w:val="28"/>
-                <w:szCs w:val="28"/>
-              </w:rPr>
-              <w:t>Caminho/URL da imagem de perfil</w:t>
-            </w:r>
-          </w:p>
+          <w:p/>
         </w:tc>
       </w:tr>
       <w:tr>
         <w:tc>
           <w:tcPr>
             <w:tcW w:w="1305" w:type="dxa"/>
+            <w:tcBorders>
+              <w:top w:val="single" w:sz="4" w:space="0" w:color="000000"/>
+              <w:left w:val="single" w:sz="4" w:space="0" w:color="000000"/>
+              <w:bottom w:val="single" w:sz="4" w:space="0" w:color="000000"/>
+              <w:right w:val="single" w:sz="4" w:space="0" w:color="000000"/>
+            </w:tcBorders>
+          </w:tcPr>
+          <w:p>
+            <w:pPr>
+              <w:rPr>
+                <w:u w:val="single"/>
+              </w:rPr>
+            </w:pPr>
+            <w:r>
+              <w:rPr>
+                <w:sz w:val="28"/>
+                <w:szCs w:val="28"/>
+                <w:u w:val="single"/>
+              </w:rPr>
+              <w:t>Pessoa Jurídica (especializa Pessoa)</w:t>
+            </w:r>
+          </w:p>
+        </w:tc>
+        <w:tc>
+          <w:tcPr>
+            <w:tcW w:w="2205" w:type="dxa"/>
+            <w:tcBorders>
+              <w:top w:val="single" w:sz="4" w:space="0" w:color="000000"/>
+              <w:left w:val="single" w:sz="4" w:space="0" w:color="000000"/>
+              <w:bottom w:val="single" w:sz="4" w:space="0" w:color="000000"/>
+              <w:right w:val="single" w:sz="4" w:space="0" w:color="000000"/>
+            </w:tcBorders>
+          </w:tcPr>
+          <w:p>
+            <w:pPr>
+              <w:rPr>
+                <w:u w:val="single"/>
+              </w:rPr>
+            </w:pPr>
+            <w:r>
+              <w:rPr>
+                <w:sz w:val="28"/>
+                <w:szCs w:val="28"/>
+                <w:u w:val="single"/>
+              </w:rPr>
+              <w:t>CNPJ</w:t>
+            </w:r>
+          </w:p>
+        </w:tc>
+        <w:tc>
+          <w:tcPr>
+            <w:tcW w:w="1200" w:type="dxa"/>
+            <w:tcBorders>
+              <w:top w:val="single" w:sz="4" w:space="0" w:color="000000"/>
+              <w:left w:val="single" w:sz="4" w:space="0" w:color="000000"/>
+              <w:bottom w:val="single" w:sz="4" w:space="0" w:color="000000"/>
+              <w:right w:val="single" w:sz="4" w:space="0" w:color="000000"/>
+            </w:tcBorders>
+          </w:tcPr>
+          <w:p>
+            <w:pPr>
+              <w:rPr>
+                <w:u w:val="single"/>
+              </w:rPr>
+            </w:pPr>
+            <w:r>
+              <w:rPr>
+                <w:sz w:val="28"/>
+                <w:szCs w:val="28"/>
+                <w:u w:val="single"/>
+              </w:rPr>
+              <w:t>Char</w:t>
+            </w:r>
+          </w:p>
+        </w:tc>
+        <w:tc>
+          <w:tcPr>
+            <w:tcW w:w="1440" w:type="dxa"/>
+            <w:tcBorders>
+              <w:top w:val="single" w:sz="4" w:space="0" w:color="000000"/>
+              <w:left w:val="single" w:sz="4" w:space="0" w:color="000000"/>
+              <w:bottom w:val="single" w:sz="4" w:space="0" w:color="000000"/>
+              <w:right w:val="single" w:sz="4" w:space="0" w:color="000000"/>
+            </w:tcBorders>
+          </w:tcPr>
+          <w:p>
+            <w:pPr>
+              <w:rPr>
+                <w:u w:val="single"/>
+              </w:rPr>
+            </w:pPr>
+            <w:r>
+              <w:rPr>
+                <w:sz w:val="28"/>
+                <w:szCs w:val="28"/>
+                <w:u w:val="single"/>
+              </w:rPr>
+              <w:t>14</w:t>
+            </w:r>
+          </w:p>
+        </w:tc>
+        <w:tc>
+          <w:tcPr>
+            <w:tcW w:w="1005" w:type="dxa"/>
+            <w:tcBorders>
+              <w:top w:val="single" w:sz="4" w:space="0" w:color="000000"/>
+              <w:left w:val="single" w:sz="4" w:space="0" w:color="000000"/>
+              <w:bottom w:val="single" w:sz="4" w:space="0" w:color="000000"/>
+              <w:right w:val="single" w:sz="4" w:space="0" w:color="000000"/>
+            </w:tcBorders>
+          </w:tcPr>
+          <w:p>
+            <w:pPr>
+              <w:rPr>
+                <w:u w:val="single"/>
+              </w:rPr>
+            </w:pPr>
+            <w:r>
+              <w:rPr>
+                <w:sz w:val="28"/>
+                <w:szCs w:val="28"/>
+                <w:u w:val="single"/>
+              </w:rPr>
+              <w:t>*</w:t>
+            </w:r>
+          </w:p>
+        </w:tc>
+        <w:tc>
+          <w:tcPr>
+            <w:tcW w:w="1170" w:type="dxa"/>
+            <w:tcBorders>
+              <w:top w:val="single" w:sz="4" w:space="0" w:color="000000"/>
+              <w:left w:val="single" w:sz="4" w:space="0" w:color="000000"/>
+              <w:bottom w:val="single" w:sz="4" w:space="0" w:color="000000"/>
+              <w:right w:val="single" w:sz="4" w:space="0" w:color="000000"/>
+            </w:tcBorders>
+          </w:tcPr>
+          <w:p>
+            <w:pPr>
+              <w:rPr>
+                <w:u w:val="single"/>
+              </w:rPr>
+            </w:pPr>
+            <w:r>
+              <w:rPr>
+                <w:sz w:val="28"/>
+                <w:szCs w:val="28"/>
+                <w:u w:val="single"/>
+              </w:rPr>
+              <w:t>*</w:t>
+            </w:r>
+          </w:p>
+        </w:tc>
+        <w:tc>
+          <w:tcPr>
+            <w:tcW w:w="1980" w:type="dxa"/>
+            <w:tcBorders>
+              <w:top w:val="single" w:sz="4" w:space="0" w:color="000000"/>
+              <w:left w:val="single" w:sz="4" w:space="0" w:color="000000"/>
+              <w:bottom w:val="single" w:sz="4" w:space="0" w:color="000000"/>
+              <w:right w:val="single" w:sz="4" w:space="0" w:color="000000"/>
+            </w:tcBorders>
+          </w:tcPr>
+          <w:p>
+            <w:pPr>
+              <w:rPr>
+                <w:u w:val="single"/>
+              </w:rPr>
+            </w:pPr>
+          </w:p>
+        </w:tc>
+      </w:tr>
+      <w:tr>
+        <w:tc>
+          <w:tcPr>
+            <w:tcW w:w="1305" w:type="dxa"/>
             <w:vMerge w:val="restart"/>
             <w:tcBorders>
               <w:top w:val="single" w:sz="4" w:space="0" w:color="000000"/>
@@ -3608,7 +3869,7 @@
                 <w:sz w:val="28"/>
                 <w:szCs w:val="28"/>
               </w:rPr>
-              <w:t>Pessoa Física (especializa Usuário)</w:t>
+              <w:t>Aluguel</w:t>
             </w:r>
           </w:p>
         </w:tc>
@@ -3628,7 +3889,7 @@
                 <w:sz w:val="28"/>
                 <w:szCs w:val="28"/>
               </w:rPr>
-              <w:t>CPF</w:t>
+              <w:t>codigo</w:t>
             </w:r>
           </w:p>
         </w:tc>
@@ -3648,7 +3909,7 @@
                 <w:sz w:val="28"/>
                 <w:szCs w:val="28"/>
               </w:rPr>
-              <w:t>Char</w:t>
+              <w:t>Inteiro</w:t>
             </w:r>
           </w:p>
         </w:tc>
@@ -3662,15 +3923,7 @@
               <w:right w:val="single" w:sz="4" w:space="0" w:color="000000"/>
             </w:tcBorders>
           </w:tcPr>
-          <w:p>
-            <w:r>
-              <w:rPr>
-                <w:sz w:val="28"/>
-                <w:szCs w:val="28"/>
-              </w:rPr>
-              <w:t>11</w:t>
-            </w:r>
-          </w:p>
+          <w:p/>
         </w:tc>
         <w:tc>
           <w:tcPr>
@@ -3762,15 +4015,13 @@
             </w:tcBorders>
           </w:tcPr>
           <w:p>
-            <w:proofErr w:type="spellStart"/>
-            <w:r>
-              <w:rPr>
-                <w:sz w:val="28"/>
-                <w:szCs w:val="28"/>
-              </w:rPr>
-              <w:t>dataNascimento</w:t>
-            </w:r>
-            <w:proofErr w:type="spellEnd"/>
+            <w:r>
+              <w:rPr>
+                <w:sz w:val="28"/>
+                <w:szCs w:val="28"/>
+              </w:rPr>
+              <w:t>nomeInquilino</w:t>
+            </w:r>
           </w:p>
         </w:tc>
         <w:tc>
@@ -3789,7 +4040,7 @@
                 <w:sz w:val="28"/>
                 <w:szCs w:val="28"/>
               </w:rPr>
-              <w:t>Date</w:t>
+              <w:t>Char</w:t>
             </w:r>
           </w:p>
         </w:tc>
@@ -3803,7 +4054,15 @@
               <w:right w:val="single" w:sz="4" w:space="0" w:color="000000"/>
             </w:tcBorders>
           </w:tcPr>
-          <w:p/>
+          <w:p>
+            <w:r>
+              <w:rPr>
+                <w:sz w:val="28"/>
+                <w:szCs w:val="28"/>
+              </w:rPr>
+              <w:t>100</w:t>
+            </w:r>
+          </w:p>
         </w:tc>
         <w:tc>
           <w:tcPr>
@@ -3827,320 +4086,7 @@
               <w:right w:val="single" w:sz="4" w:space="0" w:color="000000"/>
             </w:tcBorders>
           </w:tcPr>
-          <w:p>
-            <w:r>
-              <w:rPr>
-                <w:sz w:val="28"/>
-                <w:szCs w:val="28"/>
-              </w:rPr>
-              <w:t>*</w:t>
-            </w:r>
-          </w:p>
-        </w:tc>
-        <w:tc>
-          <w:tcPr>
-            <w:tcW w:w="1980" w:type="dxa"/>
-            <w:tcBorders>
-              <w:top w:val="single" w:sz="4" w:space="0" w:color="000000"/>
-              <w:left w:val="single" w:sz="4" w:space="0" w:color="000000"/>
-              <w:bottom w:val="single" w:sz="4" w:space="0" w:color="000000"/>
-              <w:right w:val="single" w:sz="4" w:space="0" w:color="000000"/>
-            </w:tcBorders>
-          </w:tcPr>
-          <w:p/>
-        </w:tc>
-      </w:tr>
-      <w:tr>
-        <w:tc>
-          <w:tcPr>
-            <w:tcW w:w="1305" w:type="dxa"/>
-            <w:tcBorders>
-              <w:top w:val="single" w:sz="4" w:space="0" w:color="000000"/>
-              <w:left w:val="single" w:sz="4" w:space="0" w:color="000000"/>
-              <w:bottom w:val="single" w:sz="4" w:space="0" w:color="000000"/>
-              <w:right w:val="single" w:sz="4" w:space="0" w:color="000000"/>
-            </w:tcBorders>
-          </w:tcPr>
-          <w:p>
-            <w:pPr>
-              <w:rPr>
-                <w:u w:val="single"/>
-              </w:rPr>
-            </w:pPr>
-            <w:r>
-              <w:rPr>
-                <w:sz w:val="28"/>
-                <w:szCs w:val="28"/>
-                <w:u w:val="single"/>
-              </w:rPr>
-              <w:t>Pessoa Jurídica (especializa Usuário)</w:t>
-            </w:r>
-          </w:p>
-        </w:tc>
-        <w:tc>
-          <w:tcPr>
-            <w:tcW w:w="2205" w:type="dxa"/>
-            <w:tcBorders>
-              <w:top w:val="single" w:sz="4" w:space="0" w:color="000000"/>
-              <w:left w:val="single" w:sz="4" w:space="0" w:color="000000"/>
-              <w:bottom w:val="single" w:sz="4" w:space="0" w:color="000000"/>
-              <w:right w:val="single" w:sz="4" w:space="0" w:color="000000"/>
-            </w:tcBorders>
-          </w:tcPr>
-          <w:p>
-            <w:pPr>
-              <w:rPr>
-                <w:u w:val="single"/>
-              </w:rPr>
-            </w:pPr>
-            <w:r>
-              <w:rPr>
-                <w:sz w:val="28"/>
-                <w:szCs w:val="28"/>
-                <w:u w:val="single"/>
-              </w:rPr>
-              <w:t>CNPJ</w:t>
-            </w:r>
-          </w:p>
-        </w:tc>
-        <w:tc>
-          <w:tcPr>
-            <w:tcW w:w="1200" w:type="dxa"/>
-            <w:tcBorders>
-              <w:top w:val="single" w:sz="4" w:space="0" w:color="000000"/>
-              <w:left w:val="single" w:sz="4" w:space="0" w:color="000000"/>
-              <w:bottom w:val="single" w:sz="4" w:space="0" w:color="000000"/>
-              <w:right w:val="single" w:sz="4" w:space="0" w:color="000000"/>
-            </w:tcBorders>
-          </w:tcPr>
-          <w:p>
-            <w:pPr>
-              <w:rPr>
-                <w:u w:val="single"/>
-              </w:rPr>
-            </w:pPr>
-            <w:r>
-              <w:rPr>
-                <w:sz w:val="28"/>
-                <w:szCs w:val="28"/>
-                <w:u w:val="single"/>
-              </w:rPr>
-              <w:t>Char</w:t>
-            </w:r>
-          </w:p>
-        </w:tc>
-        <w:tc>
-          <w:tcPr>
-            <w:tcW w:w="1440" w:type="dxa"/>
-            <w:tcBorders>
-              <w:top w:val="single" w:sz="4" w:space="0" w:color="000000"/>
-              <w:left w:val="single" w:sz="4" w:space="0" w:color="000000"/>
-              <w:bottom w:val="single" w:sz="4" w:space="0" w:color="000000"/>
-              <w:right w:val="single" w:sz="4" w:space="0" w:color="000000"/>
-            </w:tcBorders>
-          </w:tcPr>
-          <w:p>
-            <w:pPr>
-              <w:rPr>
-                <w:u w:val="single"/>
-              </w:rPr>
-            </w:pPr>
-            <w:r>
-              <w:rPr>
-                <w:sz w:val="28"/>
-                <w:szCs w:val="28"/>
-                <w:u w:val="single"/>
-              </w:rPr>
-              <w:t>14</w:t>
-            </w:r>
-          </w:p>
-        </w:tc>
-        <w:tc>
-          <w:tcPr>
-            <w:tcW w:w="1005" w:type="dxa"/>
-            <w:tcBorders>
-              <w:top w:val="single" w:sz="4" w:space="0" w:color="000000"/>
-              <w:left w:val="single" w:sz="4" w:space="0" w:color="000000"/>
-              <w:bottom w:val="single" w:sz="4" w:space="0" w:color="000000"/>
-              <w:right w:val="single" w:sz="4" w:space="0" w:color="000000"/>
-            </w:tcBorders>
-          </w:tcPr>
-          <w:p>
-            <w:pPr>
-              <w:rPr>
-                <w:u w:val="single"/>
-              </w:rPr>
-            </w:pPr>
-            <w:r>
-              <w:rPr>
-                <w:sz w:val="28"/>
-                <w:szCs w:val="28"/>
-                <w:u w:val="single"/>
-              </w:rPr>
-              <w:t>*</w:t>
-            </w:r>
-          </w:p>
-        </w:tc>
-        <w:tc>
-          <w:tcPr>
-            <w:tcW w:w="1170" w:type="dxa"/>
-            <w:tcBorders>
-              <w:top w:val="single" w:sz="4" w:space="0" w:color="000000"/>
-              <w:left w:val="single" w:sz="4" w:space="0" w:color="000000"/>
-              <w:bottom w:val="single" w:sz="4" w:space="0" w:color="000000"/>
-              <w:right w:val="single" w:sz="4" w:space="0" w:color="000000"/>
-            </w:tcBorders>
-          </w:tcPr>
-          <w:p>
-            <w:pPr>
-              <w:rPr>
-                <w:u w:val="single"/>
-              </w:rPr>
-            </w:pPr>
-            <w:r>
-              <w:rPr>
-                <w:sz w:val="28"/>
-                <w:szCs w:val="28"/>
-                <w:u w:val="single"/>
-              </w:rPr>
-              <w:t>*</w:t>
-            </w:r>
-          </w:p>
-        </w:tc>
-        <w:tc>
-          <w:tcPr>
-            <w:tcW w:w="1980" w:type="dxa"/>
-            <w:tcBorders>
-              <w:top w:val="single" w:sz="4" w:space="0" w:color="000000"/>
-              <w:left w:val="single" w:sz="4" w:space="0" w:color="000000"/>
-              <w:bottom w:val="single" w:sz="4" w:space="0" w:color="000000"/>
-              <w:right w:val="single" w:sz="4" w:space="0" w:color="000000"/>
-            </w:tcBorders>
-          </w:tcPr>
-          <w:p>
-            <w:pPr>
-              <w:rPr>
-                <w:u w:val="single"/>
-              </w:rPr>
-            </w:pPr>
-          </w:p>
-        </w:tc>
-      </w:tr>
-      <w:tr>
-        <w:tc>
-          <w:tcPr>
-            <w:tcW w:w="1305" w:type="dxa"/>
-            <w:vMerge w:val="restart"/>
-            <w:tcBorders>
-              <w:top w:val="single" w:sz="4" w:space="0" w:color="000000"/>
-              <w:left w:val="single" w:sz="4" w:space="0" w:color="000000"/>
-              <w:bottom w:val="single" w:sz="4" w:space="0" w:color="000000"/>
-              <w:right w:val="single" w:sz="4" w:space="0" w:color="000000"/>
-            </w:tcBorders>
-          </w:tcPr>
-          <w:p>
-            <w:r>
-              <w:rPr>
-                <w:sz w:val="28"/>
-                <w:szCs w:val="28"/>
-              </w:rPr>
-              <w:t>Aluguel</w:t>
-            </w:r>
-          </w:p>
-        </w:tc>
-        <w:tc>
-          <w:tcPr>
-            <w:tcW w:w="2205" w:type="dxa"/>
-            <w:tcBorders>
-              <w:top w:val="single" w:sz="4" w:space="0" w:color="000000"/>
-              <w:left w:val="single" w:sz="4" w:space="0" w:color="000000"/>
-              <w:bottom w:val="single" w:sz="4" w:space="0" w:color="000000"/>
-              <w:right w:val="single" w:sz="4" w:space="0" w:color="000000"/>
-            </w:tcBorders>
-          </w:tcPr>
-          <w:p>
-            <w:proofErr w:type="spellStart"/>
-            <w:r>
-              <w:rPr>
-                <w:sz w:val="28"/>
-                <w:szCs w:val="28"/>
-              </w:rPr>
-              <w:t>codigo</w:t>
-            </w:r>
-            <w:proofErr w:type="spellEnd"/>
-          </w:p>
-        </w:tc>
-        <w:tc>
-          <w:tcPr>
-            <w:tcW w:w="1200" w:type="dxa"/>
-            <w:tcBorders>
-              <w:top w:val="single" w:sz="4" w:space="0" w:color="000000"/>
-              <w:left w:val="single" w:sz="4" w:space="0" w:color="000000"/>
-              <w:bottom w:val="single" w:sz="4" w:space="0" w:color="000000"/>
-              <w:right w:val="single" w:sz="4" w:space="0" w:color="000000"/>
-            </w:tcBorders>
-          </w:tcPr>
-          <w:p>
-            <w:r>
-              <w:rPr>
-                <w:sz w:val="28"/>
-                <w:szCs w:val="28"/>
-              </w:rPr>
-              <w:t>Inteiro</w:t>
-            </w:r>
-          </w:p>
-        </w:tc>
-        <w:tc>
-          <w:tcPr>
-            <w:tcW w:w="1440" w:type="dxa"/>
-            <w:tcBorders>
-              <w:top w:val="single" w:sz="4" w:space="0" w:color="000000"/>
-              <w:left w:val="single" w:sz="4" w:space="0" w:color="000000"/>
-              <w:bottom w:val="single" w:sz="4" w:space="0" w:color="000000"/>
-              <w:right w:val="single" w:sz="4" w:space="0" w:color="000000"/>
-            </w:tcBorders>
-          </w:tcPr>
-          <w:p/>
-        </w:tc>
-        <w:tc>
-          <w:tcPr>
-            <w:tcW w:w="1005" w:type="dxa"/>
-            <w:tcBorders>
-              <w:top w:val="single" w:sz="4" w:space="0" w:color="000000"/>
-              <w:left w:val="single" w:sz="4" w:space="0" w:color="000000"/>
-              <w:bottom w:val="single" w:sz="4" w:space="0" w:color="000000"/>
-              <w:right w:val="single" w:sz="4" w:space="0" w:color="000000"/>
-            </w:tcBorders>
-          </w:tcPr>
-          <w:p>
-            <w:r>
-              <w:rPr>
-                <w:sz w:val="28"/>
-                <w:szCs w:val="28"/>
-              </w:rPr>
-              <w:t>*</w:t>
-            </w:r>
-          </w:p>
-        </w:tc>
-        <w:tc>
-          <w:tcPr>
-            <w:tcW w:w="1170" w:type="dxa"/>
-            <w:tcBorders>
-              <w:top w:val="single" w:sz="4" w:space="0" w:color="000000"/>
-              <w:left w:val="single" w:sz="4" w:space="0" w:color="000000"/>
-              <w:bottom w:val="single" w:sz="4" w:space="0" w:color="000000"/>
-              <w:right w:val="single" w:sz="4" w:space="0" w:color="000000"/>
-            </w:tcBorders>
-          </w:tcPr>
-          <w:p>
-            <w:r>
-              <w:rPr>
-                <w:sz w:val="28"/>
-                <w:szCs w:val="28"/>
-              </w:rPr>
-              <w:t>*</w:t>
-            </w:r>
-          </w:p>
+          <w:p/>
         </w:tc>
         <w:tc>
           <w:tcPr>
@@ -4192,15 +4138,13 @@
             </w:tcBorders>
           </w:tcPr>
           <w:p>
-            <w:proofErr w:type="spellStart"/>
-            <w:r>
-              <w:rPr>
-                <w:sz w:val="28"/>
-                <w:szCs w:val="28"/>
-              </w:rPr>
-              <w:t>nomeInquilino</w:t>
-            </w:r>
-            <w:proofErr w:type="spellEnd"/>
+            <w:r>
+              <w:rPr>
+                <w:sz w:val="28"/>
+                <w:szCs w:val="28"/>
+              </w:rPr>
+              <w:t>documentoInquilino</w:t>
+            </w:r>
           </w:p>
         </w:tc>
         <w:tc>
@@ -4239,7 +4183,7 @@
                 <w:sz w:val="28"/>
                 <w:szCs w:val="28"/>
               </w:rPr>
-              <w:t>100</w:t>
+              <w:t>18</w:t>
             </w:r>
           </w:p>
         </w:tc>
@@ -4277,7 +4221,15 @@
               <w:right w:val="single" w:sz="4" w:space="0" w:color="000000"/>
             </w:tcBorders>
           </w:tcPr>
-          <w:p/>
+          <w:p>
+            <w:r>
+              <w:rPr>
+                <w:sz w:val="28"/>
+                <w:szCs w:val="28"/>
+              </w:rPr>
+              <w:t xml:space="preserve">CPF ou CNPJ. </w:t>
+            </w:r>
+          </w:p>
         </w:tc>
       </w:tr>
       <w:tr>
@@ -4317,15 +4269,13 @@
             </w:tcBorders>
           </w:tcPr>
           <w:p>
-            <w:proofErr w:type="spellStart"/>
-            <w:r>
-              <w:rPr>
-                <w:sz w:val="28"/>
-                <w:szCs w:val="28"/>
-              </w:rPr>
-              <w:t>documentoInquilino</w:t>
-            </w:r>
-            <w:proofErr w:type="spellEnd"/>
+            <w:r>
+              <w:rPr>
+                <w:sz w:val="28"/>
+                <w:szCs w:val="28"/>
+              </w:rPr>
+              <w:t>telefoneInquilino</w:t>
+            </w:r>
           </w:p>
         </w:tc>
         <w:tc>
@@ -4364,7 +4314,7 @@
                 <w:sz w:val="28"/>
                 <w:szCs w:val="28"/>
               </w:rPr>
-              <w:t>18</w:t>
+              <w:t>15</w:t>
             </w:r>
           </w:p>
         </w:tc>
@@ -4402,15 +4352,7 @@
               <w:right w:val="single" w:sz="4" w:space="0" w:color="000000"/>
             </w:tcBorders>
           </w:tcPr>
-          <w:p>
-            <w:r>
-              <w:rPr>
-                <w:sz w:val="28"/>
-                <w:szCs w:val="28"/>
-              </w:rPr>
-              <w:t xml:space="preserve">CPF ou CNPJ. </w:t>
-            </w:r>
-          </w:p>
+          <w:p/>
         </w:tc>
       </w:tr>
       <w:tr>
@@ -4450,15 +4392,13 @@
             </w:tcBorders>
           </w:tcPr>
           <w:p>
-            <w:proofErr w:type="spellStart"/>
-            <w:r>
-              <w:rPr>
-                <w:sz w:val="28"/>
-                <w:szCs w:val="28"/>
-              </w:rPr>
-              <w:t>telefoneInquilino</w:t>
-            </w:r>
-            <w:proofErr w:type="spellEnd"/>
+            <w:r>
+              <w:rPr>
+                <w:sz w:val="28"/>
+                <w:szCs w:val="28"/>
+              </w:rPr>
+              <w:t>diaPagamento</w:t>
+            </w:r>
           </w:p>
         </w:tc>
         <w:tc>
@@ -4477,7 +4417,7 @@
                 <w:sz w:val="28"/>
                 <w:szCs w:val="28"/>
               </w:rPr>
-              <w:t>Char</w:t>
+              <w:t>Date</w:t>
             </w:r>
           </w:p>
         </w:tc>
@@ -4491,15 +4431,7 @@
               <w:right w:val="single" w:sz="4" w:space="0" w:color="000000"/>
             </w:tcBorders>
           </w:tcPr>
-          <w:p>
-            <w:r>
-              <w:rPr>
-                <w:sz w:val="28"/>
-                <w:szCs w:val="28"/>
-              </w:rPr>
-              <w:t>15</w:t>
-            </w:r>
-          </w:p>
+          <w:p/>
         </w:tc>
         <w:tc>
           <w:tcPr>
@@ -4575,15 +4507,13 @@
             </w:tcBorders>
           </w:tcPr>
           <w:p>
-            <w:proofErr w:type="spellStart"/>
-            <w:r>
-              <w:rPr>
-                <w:sz w:val="28"/>
-                <w:szCs w:val="28"/>
-              </w:rPr>
-              <w:t>diaPagamento</w:t>
-            </w:r>
-            <w:proofErr w:type="spellEnd"/>
+            <w:r>
+              <w:rPr>
+                <w:sz w:val="28"/>
+                <w:szCs w:val="28"/>
+              </w:rPr>
+              <w:t>dataVencimentoProximo</w:t>
+            </w:r>
           </w:p>
         </w:tc>
         <w:tc>
@@ -4692,15 +4622,13 @@
             </w:tcBorders>
           </w:tcPr>
           <w:p>
-            <w:proofErr w:type="spellStart"/>
-            <w:r>
-              <w:rPr>
-                <w:sz w:val="28"/>
-                <w:szCs w:val="28"/>
-              </w:rPr>
-              <w:t>dataVencimentoProximo</w:t>
-            </w:r>
-            <w:proofErr w:type="spellEnd"/>
+            <w:r>
+              <w:rPr>
+                <w:sz w:val="28"/>
+                <w:szCs w:val="28"/>
+              </w:rPr>
+              <w:t>valorAluguel</w:t>
+            </w:r>
           </w:p>
         </w:tc>
         <w:tc>
@@ -4719,7 +4647,7 @@
                 <w:sz w:val="28"/>
                 <w:szCs w:val="28"/>
               </w:rPr>
-              <w:t>Date</w:t>
+              <w:t>Float</w:t>
             </w:r>
           </w:p>
         </w:tc>
@@ -4757,7 +4685,15 @@
               <w:right w:val="single" w:sz="4" w:space="0" w:color="000000"/>
             </w:tcBorders>
           </w:tcPr>
-          <w:p/>
+          <w:p>
+            <w:r>
+              <w:rPr>
+                <w:sz w:val="28"/>
+                <w:szCs w:val="28"/>
+              </w:rPr>
+              <w:t>*</w:t>
+            </w:r>
+          </w:p>
         </w:tc>
         <w:tc>
           <w:tcPr>
@@ -4809,15 +4745,13 @@
             </w:tcBorders>
           </w:tcPr>
           <w:p>
-            <w:proofErr w:type="spellStart"/>
-            <w:r>
-              <w:rPr>
-                <w:sz w:val="28"/>
-                <w:szCs w:val="28"/>
-              </w:rPr>
-              <w:t>valorAluguel</w:t>
-            </w:r>
-            <w:proofErr w:type="spellEnd"/>
+            <w:r>
+              <w:rPr>
+                <w:sz w:val="28"/>
+                <w:szCs w:val="28"/>
+              </w:rPr>
+              <w:t>arquivoContrato</w:t>
+            </w:r>
           </w:p>
         </w:tc>
         <w:tc>
@@ -4831,15 +4765,13 @@
             </w:tcBorders>
           </w:tcPr>
           <w:p>
-            <w:proofErr w:type="spellStart"/>
-            <w:r>
-              <w:rPr>
-                <w:sz w:val="28"/>
-                <w:szCs w:val="28"/>
-              </w:rPr>
-              <w:t>Float</w:t>
-            </w:r>
-            <w:proofErr w:type="spellEnd"/>
+            <w:r>
+              <w:rPr>
+                <w:sz w:val="28"/>
+                <w:szCs w:val="28"/>
+              </w:rPr>
+              <w:t>Char</w:t>
+            </w:r>
           </w:p>
         </w:tc>
         <w:tc>
@@ -4852,7 +4784,15 @@
               <w:right w:val="single" w:sz="4" w:space="0" w:color="000000"/>
             </w:tcBorders>
           </w:tcPr>
-          <w:p/>
+          <w:p>
+            <w:r>
+              <w:rPr>
+                <w:sz w:val="28"/>
+                <w:szCs w:val="28"/>
+              </w:rPr>
+              <w:t>255</w:t>
+            </w:r>
+          </w:p>
         </w:tc>
         <w:tc>
           <w:tcPr>
@@ -4876,15 +4816,7 @@
               <w:right w:val="single" w:sz="4" w:space="0" w:color="000000"/>
             </w:tcBorders>
           </w:tcPr>
-          <w:p>
-            <w:r>
-              <w:rPr>
-                <w:sz w:val="28"/>
-                <w:szCs w:val="28"/>
-              </w:rPr>
-              <w:t>*</w:t>
-            </w:r>
-          </w:p>
+          <w:p/>
         </w:tc>
         <w:tc>
           <w:tcPr>
@@ -4896,7 +4828,15 @@
               <w:right w:val="single" w:sz="4" w:space="0" w:color="000000"/>
             </w:tcBorders>
           </w:tcPr>
-          <w:p/>
+          <w:p>
+            <w:r>
+              <w:rPr>
+                <w:sz w:val="28"/>
+                <w:szCs w:val="28"/>
+              </w:rPr>
+              <w:t>PDF ou imagem do contrato anexado (opcional)</w:t>
+            </w:r>
+          </w:p>
         </w:tc>
       </w:tr>
       <w:tr>
@@ -4936,15 +4876,13 @@
             </w:tcBorders>
           </w:tcPr>
           <w:p>
-            <w:proofErr w:type="spellStart"/>
-            <w:r>
-              <w:rPr>
-                <w:sz w:val="28"/>
-                <w:szCs w:val="28"/>
-              </w:rPr>
-              <w:t>arquivoContrato</w:t>
-            </w:r>
-            <w:proofErr w:type="spellEnd"/>
+            <w:r>
+              <w:rPr>
+                <w:sz w:val="28"/>
+                <w:szCs w:val="28"/>
+              </w:rPr>
+              <w:t>status</w:t>
+            </w:r>
           </w:p>
         </w:tc>
         <w:tc>
@@ -4983,7 +4921,7 @@
                 <w:sz w:val="28"/>
                 <w:szCs w:val="28"/>
               </w:rPr>
-              <w:t>255</w:t>
+              <w:t>15</w:t>
             </w:r>
           </w:p>
         </w:tc>
@@ -5009,7 +4947,15 @@
               <w:right w:val="single" w:sz="4" w:space="0" w:color="000000"/>
             </w:tcBorders>
           </w:tcPr>
-          <w:p/>
+          <w:p>
+            <w:r>
+              <w:rPr>
+                <w:sz w:val="28"/>
+                <w:szCs w:val="28"/>
+              </w:rPr>
+              <w:t>*</w:t>
+            </w:r>
+          </w:p>
         </w:tc>
         <w:tc>
           <w:tcPr>
@@ -5027,9 +4973,136 @@
                 <w:sz w:val="28"/>
                 <w:szCs w:val="28"/>
               </w:rPr>
-              <w:t>PDF ou imagem do contrato anexado (opcional)</w:t>
-            </w:r>
-          </w:p>
+              <w:t>(Ativo, Encerrado)</w:t>
+            </w:r>
+          </w:p>
+        </w:tc>
+      </w:tr>
+      <w:tr>
+        <w:tc>
+          <w:tcPr>
+            <w:tcW w:w="1305" w:type="dxa"/>
+            <w:vMerge w:val="restart"/>
+            <w:tcBorders>
+              <w:top w:val="single" w:sz="4" w:space="0" w:color="000000"/>
+              <w:left w:val="single" w:sz="4" w:space="0" w:color="000000"/>
+              <w:bottom w:val="single" w:sz="4" w:space="0" w:color="000000"/>
+              <w:right w:val="single" w:sz="4" w:space="0" w:color="000000"/>
+            </w:tcBorders>
+          </w:tcPr>
+          <w:p>
+            <w:r>
+              <w:rPr>
+                <w:sz w:val="28"/>
+                <w:szCs w:val="28"/>
+              </w:rPr>
+              <w:t>Pagamento</w:t>
+            </w:r>
+          </w:p>
+        </w:tc>
+        <w:tc>
+          <w:tcPr>
+            <w:tcW w:w="2205" w:type="dxa"/>
+            <w:tcBorders>
+              <w:top w:val="single" w:sz="4" w:space="0" w:color="000000"/>
+              <w:left w:val="single" w:sz="4" w:space="0" w:color="000000"/>
+              <w:bottom w:val="single" w:sz="4" w:space="0" w:color="000000"/>
+              <w:right w:val="single" w:sz="4" w:space="0" w:color="000000"/>
+            </w:tcBorders>
+          </w:tcPr>
+          <w:p>
+            <w:r>
+              <w:rPr>
+                <w:sz w:val="28"/>
+                <w:szCs w:val="28"/>
+              </w:rPr>
+              <w:t>codigo</w:t>
+            </w:r>
+          </w:p>
+        </w:tc>
+        <w:tc>
+          <w:tcPr>
+            <w:tcW w:w="1200" w:type="dxa"/>
+            <w:tcBorders>
+              <w:top w:val="single" w:sz="4" w:space="0" w:color="000000"/>
+              <w:left w:val="single" w:sz="4" w:space="0" w:color="000000"/>
+              <w:bottom w:val="single" w:sz="4" w:space="0" w:color="000000"/>
+              <w:right w:val="single" w:sz="4" w:space="0" w:color="000000"/>
+            </w:tcBorders>
+          </w:tcPr>
+          <w:p>
+            <w:r>
+              <w:rPr>
+                <w:sz w:val="28"/>
+                <w:szCs w:val="28"/>
+              </w:rPr>
+              <w:t>Inteiro</w:t>
+            </w:r>
+          </w:p>
+        </w:tc>
+        <w:tc>
+          <w:tcPr>
+            <w:tcW w:w="1440" w:type="dxa"/>
+            <w:tcBorders>
+              <w:top w:val="single" w:sz="4" w:space="0" w:color="000000"/>
+              <w:left w:val="single" w:sz="4" w:space="0" w:color="000000"/>
+              <w:bottom w:val="single" w:sz="4" w:space="0" w:color="000000"/>
+              <w:right w:val="single" w:sz="4" w:space="0" w:color="000000"/>
+            </w:tcBorders>
+          </w:tcPr>
+          <w:p/>
+        </w:tc>
+        <w:tc>
+          <w:tcPr>
+            <w:tcW w:w="1005" w:type="dxa"/>
+            <w:tcBorders>
+              <w:top w:val="single" w:sz="4" w:space="0" w:color="000000"/>
+              <w:left w:val="single" w:sz="4" w:space="0" w:color="000000"/>
+              <w:bottom w:val="single" w:sz="4" w:space="0" w:color="000000"/>
+              <w:right w:val="single" w:sz="4" w:space="0" w:color="000000"/>
+            </w:tcBorders>
+          </w:tcPr>
+          <w:p>
+            <w:r>
+              <w:rPr>
+                <w:sz w:val="28"/>
+                <w:szCs w:val="28"/>
+              </w:rPr>
+              <w:t>*</w:t>
+            </w:r>
+          </w:p>
+        </w:tc>
+        <w:tc>
+          <w:tcPr>
+            <w:tcW w:w="1170" w:type="dxa"/>
+            <w:tcBorders>
+              <w:top w:val="single" w:sz="4" w:space="0" w:color="000000"/>
+              <w:left w:val="single" w:sz="4" w:space="0" w:color="000000"/>
+              <w:bottom w:val="single" w:sz="4" w:space="0" w:color="000000"/>
+              <w:right w:val="single" w:sz="4" w:space="0" w:color="000000"/>
+            </w:tcBorders>
+          </w:tcPr>
+          <w:p>
+            <w:r>
+              <w:rPr>
+                <w:sz w:val="28"/>
+                <w:szCs w:val="28"/>
+              </w:rPr>
+              <w:t>*</w:t>
+            </w:r>
+          </w:p>
+        </w:tc>
+        <w:tc>
+          <w:tcPr>
+            <w:tcW w:w="1980" w:type="dxa"/>
+            <w:tcBorders>
+              <w:top w:val="single" w:sz="4" w:space="0" w:color="000000"/>
+              <w:left w:val="single" w:sz="4" w:space="0" w:color="000000"/>
+              <w:bottom w:val="single" w:sz="4" w:space="0" w:color="000000"/>
+              <w:right w:val="single" w:sz="4" w:space="0" w:color="000000"/>
+            </w:tcBorders>
+          </w:tcPr>
+          <w:p/>
         </w:tc>
       </w:tr>
       <w:tr>
@@ -5074,7 +5147,7 @@
                 <w:sz w:val="28"/>
                 <w:szCs w:val="28"/>
               </w:rPr>
-              <w:t>status</w:t>
+              <w:t>mesReferencia</w:t>
             </w:r>
           </w:p>
         </w:tc>
@@ -5114,7 +5187,7 @@
                 <w:sz w:val="28"/>
                 <w:szCs w:val="28"/>
               </w:rPr>
-              <w:t>15</w:t>
+              <w:t>7</w:t>
             </w:r>
           </w:p>
         </w:tc>
@@ -5166,138 +5239,9 @@
                 <w:sz w:val="28"/>
                 <w:szCs w:val="28"/>
               </w:rPr>
-              <w:t>(Ativo, Encerrado)</w:t>
-            </w:r>
-          </w:p>
-        </w:tc>
-      </w:tr>
-      <w:tr>
-        <w:tc>
-          <w:tcPr>
-            <w:tcW w:w="1305" w:type="dxa"/>
-            <w:vMerge w:val="restart"/>
-            <w:tcBorders>
-              <w:top w:val="single" w:sz="4" w:space="0" w:color="000000"/>
-              <w:left w:val="single" w:sz="4" w:space="0" w:color="000000"/>
-              <w:bottom w:val="single" w:sz="4" w:space="0" w:color="000000"/>
-              <w:right w:val="single" w:sz="4" w:space="0" w:color="000000"/>
-            </w:tcBorders>
-          </w:tcPr>
-          <w:p>
-            <w:r>
-              <w:rPr>
-                <w:sz w:val="28"/>
-                <w:szCs w:val="28"/>
-              </w:rPr>
-              <w:t>Pagamento</w:t>
-            </w:r>
-          </w:p>
-        </w:tc>
-        <w:tc>
-          <w:tcPr>
-            <w:tcW w:w="2205" w:type="dxa"/>
-            <w:tcBorders>
-              <w:top w:val="single" w:sz="4" w:space="0" w:color="000000"/>
-              <w:left w:val="single" w:sz="4" w:space="0" w:color="000000"/>
-              <w:bottom w:val="single" w:sz="4" w:space="0" w:color="000000"/>
-              <w:right w:val="single" w:sz="4" w:space="0" w:color="000000"/>
-            </w:tcBorders>
-          </w:tcPr>
-          <w:p>
-            <w:proofErr w:type="spellStart"/>
-            <w:r>
-              <w:rPr>
-                <w:sz w:val="28"/>
-                <w:szCs w:val="28"/>
-              </w:rPr>
-              <w:t>codigo</w:t>
-            </w:r>
-            <w:proofErr w:type="spellEnd"/>
-          </w:p>
-        </w:tc>
-        <w:tc>
-          <w:tcPr>
-            <w:tcW w:w="1200" w:type="dxa"/>
-            <w:tcBorders>
-              <w:top w:val="single" w:sz="4" w:space="0" w:color="000000"/>
-              <w:left w:val="single" w:sz="4" w:space="0" w:color="000000"/>
-              <w:bottom w:val="single" w:sz="4" w:space="0" w:color="000000"/>
-              <w:right w:val="single" w:sz="4" w:space="0" w:color="000000"/>
-            </w:tcBorders>
-          </w:tcPr>
-          <w:p>
-            <w:r>
-              <w:rPr>
-                <w:sz w:val="28"/>
-                <w:szCs w:val="28"/>
-              </w:rPr>
-              <w:t>Inteiro</w:t>
-            </w:r>
-          </w:p>
-        </w:tc>
-        <w:tc>
-          <w:tcPr>
-            <w:tcW w:w="1440" w:type="dxa"/>
-            <w:tcBorders>
-              <w:top w:val="single" w:sz="4" w:space="0" w:color="000000"/>
-              <w:left w:val="single" w:sz="4" w:space="0" w:color="000000"/>
-              <w:bottom w:val="single" w:sz="4" w:space="0" w:color="000000"/>
-              <w:right w:val="single" w:sz="4" w:space="0" w:color="000000"/>
-            </w:tcBorders>
-          </w:tcPr>
-          <w:p/>
-        </w:tc>
-        <w:tc>
-          <w:tcPr>
-            <w:tcW w:w="1005" w:type="dxa"/>
-            <w:tcBorders>
-              <w:top w:val="single" w:sz="4" w:space="0" w:color="000000"/>
-              <w:left w:val="single" w:sz="4" w:space="0" w:color="000000"/>
-              <w:bottom w:val="single" w:sz="4" w:space="0" w:color="000000"/>
-              <w:right w:val="single" w:sz="4" w:space="0" w:color="000000"/>
-            </w:tcBorders>
-          </w:tcPr>
-          <w:p>
-            <w:r>
-              <w:rPr>
-                <w:sz w:val="28"/>
-                <w:szCs w:val="28"/>
-              </w:rPr>
-              <w:t>*</w:t>
-            </w:r>
-          </w:p>
-        </w:tc>
-        <w:tc>
-          <w:tcPr>
-            <w:tcW w:w="1170" w:type="dxa"/>
-            <w:tcBorders>
-              <w:top w:val="single" w:sz="4" w:space="0" w:color="000000"/>
-              <w:left w:val="single" w:sz="4" w:space="0" w:color="000000"/>
-              <w:bottom w:val="single" w:sz="4" w:space="0" w:color="000000"/>
-              <w:right w:val="single" w:sz="4" w:space="0" w:color="000000"/>
-            </w:tcBorders>
-          </w:tcPr>
-          <w:p>
-            <w:r>
-              <w:rPr>
-                <w:sz w:val="28"/>
-                <w:szCs w:val="28"/>
-              </w:rPr>
-              <w:t>*</w:t>
-            </w:r>
-          </w:p>
-        </w:tc>
-        <w:tc>
-          <w:tcPr>
-            <w:tcW w:w="1980" w:type="dxa"/>
-            <w:tcBorders>
-              <w:top w:val="single" w:sz="4" w:space="0" w:color="000000"/>
-              <w:left w:val="single" w:sz="4" w:space="0" w:color="000000"/>
-              <w:bottom w:val="single" w:sz="4" w:space="0" w:color="000000"/>
-              <w:right w:val="single" w:sz="4" w:space="0" w:color="000000"/>
-            </w:tcBorders>
-          </w:tcPr>
-          <w:p/>
+              <w:t>Formato MM/AAAA</w:t>
+            </w:r>
+          </w:p>
         </w:tc>
       </w:tr>
       <w:tr>
@@ -5337,15 +5281,13 @@
             </w:tcBorders>
           </w:tcPr>
           <w:p>
-            <w:proofErr w:type="spellStart"/>
-            <w:r>
-              <w:rPr>
-                <w:sz w:val="28"/>
-                <w:szCs w:val="28"/>
-              </w:rPr>
-              <w:t>mesReferencia</w:t>
-            </w:r>
-            <w:proofErr w:type="spellEnd"/>
+            <w:r>
+              <w:rPr>
+                <w:sz w:val="28"/>
+                <w:szCs w:val="28"/>
+              </w:rPr>
+              <w:t>valorPago</w:t>
+            </w:r>
           </w:p>
         </w:tc>
         <w:tc>
@@ -5364,7 +5306,7 @@
                 <w:sz w:val="28"/>
                 <w:szCs w:val="28"/>
               </w:rPr>
-              <w:t>Char</w:t>
+              <w:t>Float</w:t>
             </w:r>
           </w:p>
         </w:tc>
@@ -5378,15 +5320,7 @@
               <w:right w:val="single" w:sz="4" w:space="0" w:color="000000"/>
             </w:tcBorders>
           </w:tcPr>
-          <w:p>
-            <w:r>
-              <w:rPr>
-                <w:sz w:val="28"/>
-                <w:szCs w:val="28"/>
-              </w:rPr>
-              <w:t>7</w:t>
-            </w:r>
-          </w:p>
+          <w:p/>
         </w:tc>
         <w:tc>
           <w:tcPr>
@@ -5430,15 +5364,7 @@
               <w:right w:val="single" w:sz="4" w:space="0" w:color="000000"/>
             </w:tcBorders>
           </w:tcPr>
-          <w:p>
-            <w:r>
-              <w:rPr>
-                <w:sz w:val="28"/>
-                <w:szCs w:val="28"/>
-              </w:rPr>
-              <w:t>Formato MM/AAAA</w:t>
-            </w:r>
-          </w:p>
+          <w:p/>
         </w:tc>
       </w:tr>
       <w:tr>
@@ -5478,15 +5404,13 @@
             </w:tcBorders>
           </w:tcPr>
           <w:p>
-            <w:proofErr w:type="spellStart"/>
-            <w:r>
-              <w:rPr>
-                <w:sz w:val="28"/>
-                <w:szCs w:val="28"/>
-              </w:rPr>
-              <w:t>valorPago</w:t>
-            </w:r>
-            <w:proofErr w:type="spellEnd"/>
+            <w:r>
+              <w:rPr>
+                <w:sz w:val="28"/>
+                <w:szCs w:val="28"/>
+              </w:rPr>
+              <w:t>dataPagamento</w:t>
+            </w:r>
           </w:p>
         </w:tc>
         <w:tc>
@@ -5500,15 +5424,13 @@
             </w:tcBorders>
           </w:tcPr>
           <w:p>
-            <w:proofErr w:type="spellStart"/>
-            <w:r>
-              <w:rPr>
-                <w:sz w:val="28"/>
-                <w:szCs w:val="28"/>
-              </w:rPr>
-              <w:t>Float</w:t>
-            </w:r>
-            <w:proofErr w:type="spellEnd"/>
+            <w:r>
+              <w:rPr>
+                <w:sz w:val="28"/>
+                <w:szCs w:val="28"/>
+              </w:rPr>
+              <w:t>Date</w:t>
+            </w:r>
           </w:p>
         </w:tc>
         <w:tc>
@@ -5545,15 +5467,7 @@
               <w:right w:val="single" w:sz="4" w:space="0" w:color="000000"/>
             </w:tcBorders>
           </w:tcPr>
-          <w:p>
-            <w:r>
-              <w:rPr>
-                <w:sz w:val="28"/>
-                <w:szCs w:val="28"/>
-              </w:rPr>
-              <w:t>*</w:t>
-            </w:r>
-          </w:p>
+          <w:p/>
         </w:tc>
         <w:tc>
           <w:tcPr>
@@ -5605,15 +5519,13 @@
             </w:tcBorders>
           </w:tcPr>
           <w:p>
-            <w:proofErr w:type="spellStart"/>
-            <w:r>
-              <w:rPr>
-                <w:sz w:val="28"/>
-                <w:szCs w:val="28"/>
-              </w:rPr>
-              <w:t>dataPagamento</w:t>
-            </w:r>
-            <w:proofErr w:type="spellEnd"/>
+            <w:r>
+              <w:rPr>
+                <w:sz w:val="28"/>
+                <w:szCs w:val="28"/>
+              </w:rPr>
+              <w:t>comprovante</w:t>
+            </w:r>
           </w:p>
         </w:tc>
         <w:tc>
@@ -5632,7 +5544,7 @@
                 <w:sz w:val="28"/>
                 <w:szCs w:val="28"/>
               </w:rPr>
-              <w:t>Date</w:t>
+              <w:t>Char</w:t>
             </w:r>
           </w:p>
         </w:tc>
@@ -5646,7 +5558,15 @@
               <w:right w:val="single" w:sz="4" w:space="0" w:color="000000"/>
             </w:tcBorders>
           </w:tcPr>
-          <w:p/>
+          <w:p>
+            <w:r>
+              <w:rPr>
+                <w:sz w:val="28"/>
+                <w:szCs w:val="28"/>
+              </w:rPr>
+              <w:t>255</w:t>
+            </w:r>
+          </w:p>
         </w:tc>
         <w:tc>
           <w:tcPr>
@@ -5682,7 +5602,15 @@
               <w:right w:val="single" w:sz="4" w:space="0" w:color="000000"/>
             </w:tcBorders>
           </w:tcPr>
-          <w:p/>
+          <w:p>
+            <w:r>
+              <w:rPr>
+                <w:sz w:val="28"/>
+                <w:szCs w:val="28"/>
+              </w:rPr>
+              <w:t>PDF ou imagem anexado pelo inquilino ou proprietário</w:t>
+            </w:r>
+          </w:p>
         </w:tc>
       </w:tr>
       <w:tr>
@@ -5727,7 +5655,7 @@
                 <w:sz w:val="28"/>
                 <w:szCs w:val="28"/>
               </w:rPr>
-              <w:t>comprovante</w:t>
+              <w:t>status</w:t>
             </w:r>
           </w:p>
         </w:tc>
@@ -5767,7 +5695,7 @@
                 <w:sz w:val="28"/>
                 <w:szCs w:val="28"/>
               </w:rPr>
-              <w:t>255</w:t>
+              <w:t>15</w:t>
             </w:r>
           </w:p>
         </w:tc>
@@ -5793,7 +5721,15 @@
               <w:right w:val="single" w:sz="4" w:space="0" w:color="000000"/>
             </w:tcBorders>
           </w:tcPr>
-          <w:p/>
+          <w:p>
+            <w:r>
+              <w:rPr>
+                <w:sz w:val="28"/>
+                <w:szCs w:val="28"/>
+              </w:rPr>
+              <w:t>*</w:t>
+            </w:r>
+          </w:p>
         </w:tc>
         <w:tc>
           <w:tcPr>
@@ -5811,9 +5747,136 @@
                 <w:sz w:val="28"/>
                 <w:szCs w:val="28"/>
               </w:rPr>
-              <w:t>PDF ou imagem anexado pelo inquilino ou proprietário</w:t>
-            </w:r>
-          </w:p>
+              <w:t xml:space="preserve">(Pendente, Em atraso, Pago)</w:t>
+            </w:r>
+          </w:p>
+        </w:tc>
+      </w:tr>
+      <w:tr>
+        <w:tc>
+          <w:tcPr>
+            <w:tcW w:w="1305" w:type="dxa"/>
+            <w:vMerge w:val="restart"/>
+            <w:tcBorders>
+              <w:top w:val="single" w:sz="4" w:space="0" w:color="000000"/>
+              <w:left w:val="single" w:sz="4" w:space="0" w:color="000000"/>
+              <w:bottom w:val="single" w:sz="4" w:space="0" w:color="000000"/>
+              <w:right w:val="single" w:sz="4" w:space="0" w:color="000000"/>
+            </w:tcBorders>
+          </w:tcPr>
+          <w:p>
+            <w:r>
+              <w:rPr>
+                <w:sz w:val="28"/>
+                <w:szCs w:val="28"/>
+              </w:rPr>
+              <w:t>Conversa</w:t>
+            </w:r>
+          </w:p>
+        </w:tc>
+        <w:tc>
+          <w:tcPr>
+            <w:tcW w:w="2205" w:type="dxa"/>
+            <w:tcBorders>
+              <w:top w:val="single" w:sz="4" w:space="0" w:color="000000"/>
+              <w:left w:val="single" w:sz="4" w:space="0" w:color="000000"/>
+              <w:bottom w:val="single" w:sz="4" w:space="0" w:color="000000"/>
+              <w:right w:val="single" w:sz="4" w:space="0" w:color="000000"/>
+            </w:tcBorders>
+          </w:tcPr>
+          <w:p>
+            <w:r>
+              <w:rPr>
+                <w:sz w:val="28"/>
+                <w:szCs w:val="28"/>
+              </w:rPr>
+              <w:t>codigo</w:t>
+            </w:r>
+          </w:p>
+        </w:tc>
+        <w:tc>
+          <w:tcPr>
+            <w:tcW w:w="1200" w:type="dxa"/>
+            <w:tcBorders>
+              <w:top w:val="single" w:sz="4" w:space="0" w:color="000000"/>
+              <w:left w:val="single" w:sz="4" w:space="0" w:color="000000"/>
+              <w:bottom w:val="single" w:sz="4" w:space="0" w:color="000000"/>
+              <w:right w:val="single" w:sz="4" w:space="0" w:color="000000"/>
+            </w:tcBorders>
+          </w:tcPr>
+          <w:p>
+            <w:r>
+              <w:rPr>
+                <w:sz w:val="28"/>
+                <w:szCs w:val="28"/>
+              </w:rPr>
+              <w:t>Inteiro</w:t>
+            </w:r>
+          </w:p>
+        </w:tc>
+        <w:tc>
+          <w:tcPr>
+            <w:tcW w:w="1440" w:type="dxa"/>
+            <w:tcBorders>
+              <w:top w:val="single" w:sz="4" w:space="0" w:color="000000"/>
+              <w:left w:val="single" w:sz="4" w:space="0" w:color="000000"/>
+              <w:bottom w:val="single" w:sz="4" w:space="0" w:color="000000"/>
+              <w:right w:val="single" w:sz="4" w:space="0" w:color="000000"/>
+            </w:tcBorders>
+          </w:tcPr>
+          <w:p/>
+        </w:tc>
+        <w:tc>
+          <w:tcPr>
+            <w:tcW w:w="1005" w:type="dxa"/>
+            <w:tcBorders>
+              <w:top w:val="single" w:sz="4" w:space="0" w:color="000000"/>
+              <w:left w:val="single" w:sz="4" w:space="0" w:color="000000"/>
+              <w:bottom w:val="single" w:sz="4" w:space="0" w:color="000000"/>
+              <w:right w:val="single" w:sz="4" w:space="0" w:color="000000"/>
+            </w:tcBorders>
+          </w:tcPr>
+          <w:p>
+            <w:r>
+              <w:rPr>
+                <w:sz w:val="28"/>
+                <w:szCs w:val="28"/>
+              </w:rPr>
+              <w:t>*</w:t>
+            </w:r>
+          </w:p>
+        </w:tc>
+        <w:tc>
+          <w:tcPr>
+            <w:tcW w:w="1170" w:type="dxa"/>
+            <w:tcBorders>
+              <w:top w:val="single" w:sz="4" w:space="0" w:color="000000"/>
+              <w:left w:val="single" w:sz="4" w:space="0" w:color="000000"/>
+              <w:bottom w:val="single" w:sz="4" w:space="0" w:color="000000"/>
+              <w:right w:val="single" w:sz="4" w:space="0" w:color="000000"/>
+            </w:tcBorders>
+          </w:tcPr>
+          <w:p>
+            <w:r>
+              <w:rPr>
+                <w:sz w:val="28"/>
+                <w:szCs w:val="28"/>
+              </w:rPr>
+              <w:t>*</w:t>
+            </w:r>
+          </w:p>
+        </w:tc>
+        <w:tc>
+          <w:tcPr>
+            <w:tcW w:w="1980" w:type="dxa"/>
+            <w:tcBorders>
+              <w:top w:val="single" w:sz="4" w:space="0" w:color="000000"/>
+              <w:left w:val="single" w:sz="4" w:space="0" w:color="000000"/>
+              <w:bottom w:val="single" w:sz="4" w:space="0" w:color="000000"/>
+              <w:right w:val="single" w:sz="4" w:space="0" w:color="000000"/>
+            </w:tcBorders>
+          </w:tcPr>
+          <w:p/>
         </w:tc>
       </w:tr>
       <w:tr>
@@ -5858,7 +5921,7 @@
                 <w:sz w:val="28"/>
                 <w:szCs w:val="28"/>
               </w:rPr>
-              <w:t>status</w:t>
+              <w:t>dataCriacao</w:t>
             </w:r>
           </w:p>
         </w:tc>
@@ -5878,7 +5941,7 @@
                 <w:sz w:val="28"/>
                 <w:szCs w:val="28"/>
               </w:rPr>
-              <w:t>Char</w:t>
+              <w:t>Date</w:t>
             </w:r>
           </w:p>
         </w:tc>
@@ -5892,15 +5955,7 @@
               <w:right w:val="single" w:sz="4" w:space="0" w:color="000000"/>
             </w:tcBorders>
           </w:tcPr>
-          <w:p>
-            <w:r>
-              <w:rPr>
-                <w:sz w:val="28"/>
-                <w:szCs w:val="28"/>
-              </w:rPr>
-              <w:t>15</w:t>
-            </w:r>
-          </w:p>
+          <w:p/>
         </w:tc>
         <w:tc>
           <w:tcPr>
@@ -5944,31 +5999,7 @@
               <w:right w:val="single" w:sz="4" w:space="0" w:color="000000"/>
             </w:tcBorders>
           </w:tcPr>
-          <w:p>
-            <w:r>
-              <w:rPr>
-                <w:sz w:val="28"/>
-                <w:szCs w:val="28"/>
-              </w:rPr>
-              <w:t xml:space="preserve">(Pendente, </w:t>
-            </w:r>
-            <w:proofErr w:type="gramStart"/>
-            <w:r>
-              <w:rPr>
-                <w:sz w:val="28"/>
-                <w:szCs w:val="28"/>
-              </w:rPr>
-              <w:t>Em</w:t>
-            </w:r>
-            <w:proofErr w:type="gramEnd"/>
-            <w:r>
-              <w:rPr>
-                <w:sz w:val="28"/>
-                <w:szCs w:val="28"/>
-              </w:rPr>
-              <w:t xml:space="preserve"> atraso, Pago)</w:t>
-            </w:r>
-          </w:p>
+          <w:p/>
         </w:tc>
       </w:tr>
       <w:tr>
@@ -5989,7 +6020,7 @@
                 <w:sz w:val="28"/>
                 <w:szCs w:val="28"/>
               </w:rPr>
-              <w:t>Conversa</w:t>
+              <w:t>Mensagem</w:t>
             </w:r>
           </w:p>
         </w:tc>
@@ -6004,7 +6035,6 @@
             </w:tcBorders>
           </w:tcPr>
           <w:p>
-            <w:proofErr w:type="spellStart"/>
             <w:r>
               <w:rPr>
                 <w:sz w:val="28"/>
@@ -6012,7 +6042,6 @@
               </w:rPr>
               <w:t>codigo</w:t>
             </w:r>
-            <w:proofErr w:type="spellEnd"/>
           </w:p>
         </w:tc>
         <w:tc>
@@ -6137,15 +6166,13 @@
             </w:tcBorders>
           </w:tcPr>
           <w:p>
-            <w:proofErr w:type="spellStart"/>
-            <w:r>
-              <w:rPr>
-                <w:sz w:val="28"/>
-                <w:szCs w:val="28"/>
-              </w:rPr>
-              <w:t>dataCriacao</w:t>
-            </w:r>
-            <w:proofErr w:type="spellEnd"/>
+            <w:r>
+              <w:rPr>
+                <w:sz w:val="28"/>
+                <w:szCs w:val="28"/>
+              </w:rPr>
+              <w:t>texto</w:t>
+            </w:r>
           </w:p>
         </w:tc>
         <w:tc>
@@ -6164,7 +6191,7 @@
                 <w:sz w:val="28"/>
                 <w:szCs w:val="28"/>
               </w:rPr>
-              <w:t>Date</w:t>
+              <w:t>Char</w:t>
             </w:r>
           </w:p>
         </w:tc>
@@ -6178,7 +6205,15 @@
               <w:right w:val="single" w:sz="4" w:space="0" w:color="000000"/>
             </w:tcBorders>
           </w:tcPr>
-          <w:p/>
+          <w:p>
+            <w:r>
+              <w:rPr>
+                <w:sz w:val="28"/>
+                <w:szCs w:val="28"/>
+              </w:rPr>
+              <w:t>500</w:t>
+            </w:r>
+          </w:p>
         </w:tc>
         <w:tc>
           <w:tcPr>
@@ -6191,135 +6226,6 @@
             </w:tcBorders>
           </w:tcPr>
           <w:p/>
-        </w:tc>
-        <w:tc>
-          <w:tcPr>
-            <w:tcW w:w="1170" w:type="dxa"/>
-            <w:tcBorders>
-              <w:top w:val="single" w:sz="4" w:space="0" w:color="000000"/>
-              <w:left w:val="single" w:sz="4" w:space="0" w:color="000000"/>
-              <w:bottom w:val="single" w:sz="4" w:space="0" w:color="000000"/>
-              <w:right w:val="single" w:sz="4" w:space="0" w:color="000000"/>
-            </w:tcBorders>
-          </w:tcPr>
-          <w:p>
-            <w:r>
-              <w:rPr>
-                <w:sz w:val="28"/>
-                <w:szCs w:val="28"/>
-              </w:rPr>
-              <w:t>*</w:t>
-            </w:r>
-          </w:p>
-        </w:tc>
-        <w:tc>
-          <w:tcPr>
-            <w:tcW w:w="1980" w:type="dxa"/>
-            <w:tcBorders>
-              <w:top w:val="single" w:sz="4" w:space="0" w:color="000000"/>
-              <w:left w:val="single" w:sz="4" w:space="0" w:color="000000"/>
-              <w:bottom w:val="single" w:sz="4" w:space="0" w:color="000000"/>
-              <w:right w:val="single" w:sz="4" w:space="0" w:color="000000"/>
-            </w:tcBorders>
-          </w:tcPr>
-          <w:p/>
-        </w:tc>
-      </w:tr>
-      <w:tr>
-        <w:tc>
-          <w:tcPr>
-            <w:tcW w:w="1305" w:type="dxa"/>
-            <w:vMerge w:val="restart"/>
-            <w:tcBorders>
-              <w:top w:val="single" w:sz="4" w:space="0" w:color="000000"/>
-              <w:left w:val="single" w:sz="4" w:space="0" w:color="000000"/>
-              <w:bottom w:val="single" w:sz="4" w:space="0" w:color="000000"/>
-              <w:right w:val="single" w:sz="4" w:space="0" w:color="000000"/>
-            </w:tcBorders>
-          </w:tcPr>
-          <w:p>
-            <w:r>
-              <w:rPr>
-                <w:sz w:val="28"/>
-                <w:szCs w:val="28"/>
-              </w:rPr>
-              <w:t>Mensagem</w:t>
-            </w:r>
-          </w:p>
-        </w:tc>
-        <w:tc>
-          <w:tcPr>
-            <w:tcW w:w="2205" w:type="dxa"/>
-            <w:tcBorders>
-              <w:top w:val="single" w:sz="4" w:space="0" w:color="000000"/>
-              <w:left w:val="single" w:sz="4" w:space="0" w:color="000000"/>
-              <w:bottom w:val="single" w:sz="4" w:space="0" w:color="000000"/>
-              <w:right w:val="single" w:sz="4" w:space="0" w:color="000000"/>
-            </w:tcBorders>
-          </w:tcPr>
-          <w:p>
-            <w:proofErr w:type="spellStart"/>
-            <w:r>
-              <w:rPr>
-                <w:sz w:val="28"/>
-                <w:szCs w:val="28"/>
-              </w:rPr>
-              <w:t>codigo</w:t>
-            </w:r>
-            <w:proofErr w:type="spellEnd"/>
-          </w:p>
-        </w:tc>
-        <w:tc>
-          <w:tcPr>
-            <w:tcW w:w="1200" w:type="dxa"/>
-            <w:tcBorders>
-              <w:top w:val="single" w:sz="4" w:space="0" w:color="000000"/>
-              <w:left w:val="single" w:sz="4" w:space="0" w:color="000000"/>
-              <w:bottom w:val="single" w:sz="4" w:space="0" w:color="000000"/>
-              <w:right w:val="single" w:sz="4" w:space="0" w:color="000000"/>
-            </w:tcBorders>
-          </w:tcPr>
-          <w:p>
-            <w:r>
-              <w:rPr>
-                <w:sz w:val="28"/>
-                <w:szCs w:val="28"/>
-              </w:rPr>
-              <w:t>Inteiro</w:t>
-            </w:r>
-          </w:p>
-        </w:tc>
-        <w:tc>
-          <w:tcPr>
-            <w:tcW w:w="1440" w:type="dxa"/>
-            <w:tcBorders>
-              <w:top w:val="single" w:sz="4" w:space="0" w:color="000000"/>
-              <w:left w:val="single" w:sz="4" w:space="0" w:color="000000"/>
-              <w:bottom w:val="single" w:sz="4" w:space="0" w:color="000000"/>
-              <w:right w:val="single" w:sz="4" w:space="0" w:color="000000"/>
-            </w:tcBorders>
-          </w:tcPr>
-          <w:p/>
-        </w:tc>
-        <w:tc>
-          <w:tcPr>
-            <w:tcW w:w="1005" w:type="dxa"/>
-            <w:tcBorders>
-              <w:top w:val="single" w:sz="4" w:space="0" w:color="000000"/>
-              <w:left w:val="single" w:sz="4" w:space="0" w:color="000000"/>
-              <w:bottom w:val="single" w:sz="4" w:space="0" w:color="000000"/>
-              <w:right w:val="single" w:sz="4" w:space="0" w:color="000000"/>
-            </w:tcBorders>
-          </w:tcPr>
-          <w:p>
-            <w:r>
-              <w:rPr>
-                <w:sz w:val="28"/>
-                <w:szCs w:val="28"/>
-              </w:rPr>
-              <w:t>*</w:t>
-            </w:r>
-          </w:p>
         </w:tc>
         <w:tc>
           <w:tcPr>
@@ -6396,7 +6302,7 @@
                 <w:sz w:val="28"/>
                 <w:szCs w:val="28"/>
               </w:rPr>
-              <w:t>texto</w:t>
+              <w:t>dataHora</w:t>
             </w:r>
           </w:p>
         </w:tc>
@@ -6416,7 +6322,7 @@
                 <w:sz w:val="28"/>
                 <w:szCs w:val="28"/>
               </w:rPr>
-              <w:t>Char</w:t>
+              <w:t>Date</w:t>
             </w:r>
           </w:p>
         </w:tc>
@@ -6430,15 +6336,7 @@
               <w:right w:val="single" w:sz="4" w:space="0" w:color="000000"/>
             </w:tcBorders>
           </w:tcPr>
-          <w:p>
-            <w:r>
-              <w:rPr>
-                <w:sz w:val="28"/>
-                <w:szCs w:val="28"/>
-              </w:rPr>
-              <w:t>500</w:t>
-            </w:r>
-          </w:p>
+          <w:p/>
         </w:tc>
         <w:tc>
           <w:tcPr>
@@ -6451,6 +6349,133 @@
             </w:tcBorders>
           </w:tcPr>
           <w:p/>
+        </w:tc>
+        <w:tc>
+          <w:tcPr>
+            <w:tcW w:w="1170" w:type="dxa"/>
+            <w:tcBorders>
+              <w:top w:val="single" w:sz="4" w:space="0" w:color="000000"/>
+              <w:left w:val="single" w:sz="4" w:space="0" w:color="000000"/>
+              <w:bottom w:val="single" w:sz="4" w:space="0" w:color="000000"/>
+              <w:right w:val="single" w:sz="4" w:space="0" w:color="000000"/>
+            </w:tcBorders>
+          </w:tcPr>
+          <w:p>
+            <w:r>
+              <w:rPr>
+                <w:sz w:val="28"/>
+                <w:szCs w:val="28"/>
+              </w:rPr>
+              <w:t>*</w:t>
+            </w:r>
+          </w:p>
+        </w:tc>
+        <w:tc>
+          <w:tcPr>
+            <w:tcW w:w="1980" w:type="dxa"/>
+            <w:tcBorders>
+              <w:top w:val="single" w:sz="4" w:space="0" w:color="000000"/>
+              <w:left w:val="single" w:sz="4" w:space="0" w:color="000000"/>
+              <w:bottom w:val="single" w:sz="4" w:space="0" w:color="000000"/>
+              <w:right w:val="single" w:sz="4" w:space="0" w:color="000000"/>
+            </w:tcBorders>
+          </w:tcPr>
+          <w:p/>
+        </w:tc>
+      </w:tr>
+      <w:tr>
+        <w:tc>
+          <w:tcPr>
+            <w:tcW w:w="1305" w:type="dxa"/>
+            <w:vMerge w:val="restart"/>
+            <w:tcBorders>
+              <w:top w:val="single" w:sz="4" w:space="0" w:color="000000"/>
+              <w:left w:val="single" w:sz="4" w:space="0" w:color="000000"/>
+              <w:bottom w:val="single" w:sz="4" w:space="0" w:color="000000"/>
+              <w:right w:val="single" w:sz="4" w:space="0" w:color="000000"/>
+            </w:tcBorders>
+          </w:tcPr>
+          <w:p>
+            <w:r>
+              <w:rPr>
+                <w:sz w:val="28"/>
+                <w:szCs w:val="28"/>
+              </w:rPr>
+              <w:t>Plano</w:t>
+            </w:r>
+          </w:p>
+        </w:tc>
+        <w:tc>
+          <w:tcPr>
+            <w:tcW w:w="2205" w:type="dxa"/>
+            <w:tcBorders>
+              <w:top w:val="single" w:sz="4" w:space="0" w:color="000000"/>
+              <w:left w:val="single" w:sz="4" w:space="0" w:color="000000"/>
+              <w:bottom w:val="single" w:sz="4" w:space="0" w:color="000000"/>
+              <w:right w:val="single" w:sz="4" w:space="0" w:color="000000"/>
+            </w:tcBorders>
+          </w:tcPr>
+          <w:p>
+            <w:r>
+              <w:rPr>
+                <w:sz w:val="28"/>
+                <w:szCs w:val="28"/>
+              </w:rPr>
+              <w:t>codigo</w:t>
+            </w:r>
+          </w:p>
+        </w:tc>
+        <w:tc>
+          <w:tcPr>
+            <w:tcW w:w="1200" w:type="dxa"/>
+            <w:tcBorders>
+              <w:top w:val="single" w:sz="4" w:space="0" w:color="000000"/>
+              <w:left w:val="single" w:sz="4" w:space="0" w:color="000000"/>
+              <w:bottom w:val="single" w:sz="4" w:space="0" w:color="000000"/>
+              <w:right w:val="single" w:sz="4" w:space="0" w:color="000000"/>
+            </w:tcBorders>
+          </w:tcPr>
+          <w:p>
+            <w:r>
+              <w:rPr>
+                <w:sz w:val="28"/>
+                <w:szCs w:val="28"/>
+              </w:rPr>
+              <w:t>Inteiro</w:t>
+            </w:r>
+          </w:p>
+        </w:tc>
+        <w:tc>
+          <w:tcPr>
+            <w:tcW w:w="1440" w:type="dxa"/>
+            <w:tcBorders>
+              <w:top w:val="single" w:sz="4" w:space="0" w:color="000000"/>
+              <w:left w:val="single" w:sz="4" w:space="0" w:color="000000"/>
+              <w:bottom w:val="single" w:sz="4" w:space="0" w:color="000000"/>
+              <w:right w:val="single" w:sz="4" w:space="0" w:color="000000"/>
+            </w:tcBorders>
+          </w:tcPr>
+          <w:p/>
+        </w:tc>
+        <w:tc>
+          <w:tcPr>
+            <w:tcW w:w="1005" w:type="dxa"/>
+            <w:tcBorders>
+              <w:top w:val="single" w:sz="4" w:space="0" w:color="000000"/>
+              <w:left w:val="single" w:sz="4" w:space="0" w:color="000000"/>
+              <w:bottom w:val="single" w:sz="4" w:space="0" w:color="000000"/>
+              <w:right w:val="single" w:sz="4" w:space="0" w:color="000000"/>
+            </w:tcBorders>
+          </w:tcPr>
+          <w:p>
+            <w:r>
+              <w:rPr>
+                <w:sz w:val="28"/>
+                <w:szCs w:val="28"/>
+              </w:rPr>
+              <w:t>*</w:t>
+            </w:r>
+          </w:p>
         </w:tc>
         <w:tc>
           <w:tcPr>
@@ -6522,15 +6547,13 @@
             </w:tcBorders>
           </w:tcPr>
           <w:p>
-            <w:proofErr w:type="spellStart"/>
-            <w:r>
-              <w:rPr>
-                <w:sz w:val="28"/>
-                <w:szCs w:val="28"/>
-              </w:rPr>
-              <w:t>dataHora</w:t>
-            </w:r>
-            <w:proofErr w:type="spellEnd"/>
+            <w:r>
+              <w:rPr>
+                <w:sz w:val="28"/>
+                <w:szCs w:val="28"/>
+              </w:rPr>
+              <w:t>nome</w:t>
+            </w:r>
           </w:p>
         </w:tc>
         <w:tc>
@@ -6549,7 +6572,7 @@
                 <w:sz w:val="28"/>
                 <w:szCs w:val="28"/>
               </w:rPr>
-              <w:t>Date</w:t>
+              <w:t>Char</w:t>
             </w:r>
           </w:p>
         </w:tc>
@@ -6563,7 +6586,15 @@
               <w:right w:val="single" w:sz="4" w:space="0" w:color="000000"/>
             </w:tcBorders>
           </w:tcPr>
-          <w:p/>
+          <w:p>
+            <w:r>
+              <w:rPr>
+                <w:sz w:val="28"/>
+                <w:szCs w:val="28"/>
+              </w:rPr>
+              <w:t>30</w:t>
+            </w:r>
+          </w:p>
         </w:tc>
         <w:tc>
           <w:tcPr>
@@ -6607,136 +6638,15 @@
               <w:right w:val="single" w:sz="4" w:space="0" w:color="000000"/>
             </w:tcBorders>
           </w:tcPr>
-          <w:p/>
-        </w:tc>
-      </w:tr>
-      <w:tr>
-        <w:tc>
-          <w:tcPr>
-            <w:tcW w:w="1305" w:type="dxa"/>
-            <w:vMerge w:val="restart"/>
-            <w:tcBorders>
-              <w:top w:val="single" w:sz="4" w:space="0" w:color="000000"/>
-              <w:left w:val="single" w:sz="4" w:space="0" w:color="000000"/>
-              <w:bottom w:val="single" w:sz="4" w:space="0" w:color="000000"/>
-              <w:right w:val="single" w:sz="4" w:space="0" w:color="000000"/>
-            </w:tcBorders>
-          </w:tcPr>
-          <w:p>
-            <w:r>
-              <w:rPr>
-                <w:sz w:val="28"/>
-                <w:szCs w:val="28"/>
-              </w:rPr>
-              <w:t>Plano</w:t>
-            </w:r>
-          </w:p>
-        </w:tc>
-        <w:tc>
-          <w:tcPr>
-            <w:tcW w:w="2205" w:type="dxa"/>
-            <w:tcBorders>
-              <w:top w:val="single" w:sz="4" w:space="0" w:color="000000"/>
-              <w:left w:val="single" w:sz="4" w:space="0" w:color="000000"/>
-              <w:bottom w:val="single" w:sz="4" w:space="0" w:color="000000"/>
-              <w:right w:val="single" w:sz="4" w:space="0" w:color="000000"/>
-            </w:tcBorders>
-          </w:tcPr>
-          <w:p>
-            <w:proofErr w:type="spellStart"/>
-            <w:r>
-              <w:rPr>
-                <w:sz w:val="28"/>
-                <w:szCs w:val="28"/>
-              </w:rPr>
-              <w:t>codigo</w:t>
-            </w:r>
-            <w:proofErr w:type="spellEnd"/>
-          </w:p>
-        </w:tc>
-        <w:tc>
-          <w:tcPr>
-            <w:tcW w:w="1200" w:type="dxa"/>
-            <w:tcBorders>
-              <w:top w:val="single" w:sz="4" w:space="0" w:color="000000"/>
-              <w:left w:val="single" w:sz="4" w:space="0" w:color="000000"/>
-              <w:bottom w:val="single" w:sz="4" w:space="0" w:color="000000"/>
-              <w:right w:val="single" w:sz="4" w:space="0" w:color="000000"/>
-            </w:tcBorders>
-          </w:tcPr>
-          <w:p>
-            <w:r>
-              <w:rPr>
-                <w:sz w:val="28"/>
-                <w:szCs w:val="28"/>
-              </w:rPr>
-              <w:t>Inteiro</w:t>
-            </w:r>
-          </w:p>
-        </w:tc>
-        <w:tc>
-          <w:tcPr>
-            <w:tcW w:w="1440" w:type="dxa"/>
-            <w:tcBorders>
-              <w:top w:val="single" w:sz="4" w:space="0" w:color="000000"/>
-              <w:left w:val="single" w:sz="4" w:space="0" w:color="000000"/>
-              <w:bottom w:val="single" w:sz="4" w:space="0" w:color="000000"/>
-              <w:right w:val="single" w:sz="4" w:space="0" w:color="000000"/>
-            </w:tcBorders>
-          </w:tcPr>
-          <w:p/>
-        </w:tc>
-        <w:tc>
-          <w:tcPr>
-            <w:tcW w:w="1005" w:type="dxa"/>
-            <w:tcBorders>
-              <w:top w:val="single" w:sz="4" w:space="0" w:color="000000"/>
-              <w:left w:val="single" w:sz="4" w:space="0" w:color="000000"/>
-              <w:bottom w:val="single" w:sz="4" w:space="0" w:color="000000"/>
-              <w:right w:val="single" w:sz="4" w:space="0" w:color="000000"/>
-            </w:tcBorders>
-          </w:tcPr>
-          <w:p>
-            <w:r>
-              <w:rPr>
-                <w:sz w:val="28"/>
-                <w:szCs w:val="28"/>
-              </w:rPr>
-              <w:t>*</w:t>
-            </w:r>
-          </w:p>
-        </w:tc>
-        <w:tc>
-          <w:tcPr>
-            <w:tcW w:w="1170" w:type="dxa"/>
-            <w:tcBorders>
-              <w:top w:val="single" w:sz="4" w:space="0" w:color="000000"/>
-              <w:left w:val="single" w:sz="4" w:space="0" w:color="000000"/>
-              <w:bottom w:val="single" w:sz="4" w:space="0" w:color="000000"/>
-              <w:right w:val="single" w:sz="4" w:space="0" w:color="000000"/>
-            </w:tcBorders>
-          </w:tcPr>
-          <w:p>
-            <w:r>
-              <w:rPr>
-                <w:sz w:val="28"/>
-                <w:szCs w:val="28"/>
-              </w:rPr>
-              <w:t>*</w:t>
-            </w:r>
-          </w:p>
-        </w:tc>
-        <w:tc>
-          <w:tcPr>
-            <w:tcW w:w="1980" w:type="dxa"/>
-            <w:tcBorders>
-              <w:top w:val="single" w:sz="4" w:space="0" w:color="000000"/>
-              <w:left w:val="single" w:sz="4" w:space="0" w:color="000000"/>
-              <w:bottom w:val="single" w:sz="4" w:space="0" w:color="000000"/>
-              <w:right w:val="single" w:sz="4" w:space="0" w:color="000000"/>
-            </w:tcBorders>
-          </w:tcPr>
-          <w:p/>
+          <w:p>
+            <w:r>
+              <w:rPr>
+                <w:sz w:val="28"/>
+                <w:szCs w:val="28"/>
+              </w:rPr>
+              <w:t>(Básico, Profissional, Imobiliária)</w:t>
+            </w:r>
+          </w:p>
         </w:tc>
       </w:tr>
       <w:tr>
@@ -6781,7 +6691,7 @@
                 <w:sz w:val="28"/>
                 <w:szCs w:val="28"/>
               </w:rPr>
-              <w:t>nome</w:t>
+              <w:t>valor</w:t>
             </w:r>
           </w:p>
         </w:tc>
@@ -6801,7 +6711,7 @@
                 <w:sz w:val="28"/>
                 <w:szCs w:val="28"/>
               </w:rPr>
-              <w:t>Char</w:t>
+              <w:t>Float</w:t>
             </w:r>
           </w:p>
         </w:tc>
@@ -6815,15 +6725,7 @@
               <w:right w:val="single" w:sz="4" w:space="0" w:color="000000"/>
             </w:tcBorders>
           </w:tcPr>
-          <w:p>
-            <w:r>
-              <w:rPr>
-                <w:sz w:val="28"/>
-                <w:szCs w:val="28"/>
-              </w:rPr>
-              <w:t>30</w:t>
-            </w:r>
-          </w:p>
+          <w:p/>
         </w:tc>
         <w:tc>
           <w:tcPr>
@@ -6873,7 +6775,7 @@
                 <w:sz w:val="28"/>
                 <w:szCs w:val="28"/>
               </w:rPr>
-              <w:t>(Básico, Profissional, Imobiliária)</w:t>
+              <w:t>0 para o plano Básico</w:t>
             </w:r>
           </w:p>
         </w:tc>
@@ -6920,7 +6822,7 @@
                 <w:sz w:val="28"/>
                 <w:szCs w:val="28"/>
               </w:rPr>
-              <w:t>valor</w:t>
+              <w:t>limiteImoveisAnunciados</w:t>
             </w:r>
           </w:p>
         </w:tc>
@@ -6935,15 +6837,13 @@
             </w:tcBorders>
           </w:tcPr>
           <w:p>
-            <w:proofErr w:type="spellStart"/>
-            <w:r>
-              <w:rPr>
-                <w:sz w:val="28"/>
-                <w:szCs w:val="28"/>
-              </w:rPr>
-              <w:t>Float</w:t>
-            </w:r>
-            <w:proofErr w:type="spellEnd"/>
+            <w:r>
+              <w:rPr>
+                <w:sz w:val="28"/>
+                <w:szCs w:val="28"/>
+              </w:rPr>
+              <w:t>Inteiro</w:t>
+            </w:r>
           </w:p>
         </w:tc>
         <w:tc>
@@ -6980,15 +6880,7 @@
               <w:right w:val="single" w:sz="4" w:space="0" w:color="000000"/>
             </w:tcBorders>
           </w:tcPr>
-          <w:p>
-            <w:r>
-              <w:rPr>
-                <w:sz w:val="28"/>
-                <w:szCs w:val="28"/>
-              </w:rPr>
-              <w:t>*</w:t>
-            </w:r>
-          </w:p>
+          <w:p/>
         </w:tc>
         <w:tc>
           <w:tcPr>
@@ -7000,15 +6892,7 @@
               <w:right w:val="single" w:sz="4" w:space="0" w:color="000000"/>
             </w:tcBorders>
           </w:tcPr>
-          <w:p>
-            <w:r>
-              <w:rPr>
-                <w:sz w:val="28"/>
-                <w:szCs w:val="28"/>
-              </w:rPr>
-              <w:t>0 para o plano Básico</w:t>
-            </w:r>
-          </w:p>
+          <w:p/>
         </w:tc>
       </w:tr>
       <w:tr>
@@ -7048,15 +6932,13 @@
             </w:tcBorders>
           </w:tcPr>
           <w:p>
-            <w:proofErr w:type="spellStart"/>
-            <w:r>
-              <w:rPr>
-                <w:sz w:val="28"/>
-                <w:szCs w:val="28"/>
-              </w:rPr>
-              <w:t>limiteImoveisAnunciados</w:t>
-            </w:r>
-            <w:proofErr w:type="spellEnd"/>
+            <w:r>
+              <w:rPr>
+                <w:sz w:val="28"/>
+                <w:szCs w:val="28"/>
+              </w:rPr>
+              <w:t>beneficios</w:t>
+            </w:r>
           </w:p>
         </w:tc>
         <w:tc>
@@ -7075,6 +6957,133 @@
                 <w:sz w:val="28"/>
                 <w:szCs w:val="28"/>
               </w:rPr>
+              <w:t>Char</w:t>
+            </w:r>
+          </w:p>
+        </w:tc>
+        <w:tc>
+          <w:tcPr>
+            <w:tcW w:w="1440" w:type="dxa"/>
+            <w:tcBorders>
+              <w:top w:val="single" w:sz="4" w:space="0" w:color="000000"/>
+              <w:left w:val="single" w:sz="4" w:space="0" w:color="000000"/>
+              <w:bottom w:val="single" w:sz="4" w:space="0" w:color="000000"/>
+              <w:right w:val="single" w:sz="4" w:space="0" w:color="000000"/>
+            </w:tcBorders>
+          </w:tcPr>
+          <w:p>
+            <w:r>
+              <w:rPr>
+                <w:sz w:val="28"/>
+                <w:szCs w:val="28"/>
+              </w:rPr>
+              <w:t>300</w:t>
+            </w:r>
+          </w:p>
+        </w:tc>
+        <w:tc>
+          <w:tcPr>
+            <w:tcW w:w="1005" w:type="dxa"/>
+            <w:tcBorders>
+              <w:top w:val="single" w:sz="4" w:space="0" w:color="000000"/>
+              <w:left w:val="single" w:sz="4" w:space="0" w:color="000000"/>
+              <w:bottom w:val="single" w:sz="4" w:space="0" w:color="000000"/>
+              <w:right w:val="single" w:sz="4" w:space="0" w:color="000000"/>
+            </w:tcBorders>
+          </w:tcPr>
+          <w:p/>
+        </w:tc>
+        <w:tc>
+          <w:tcPr>
+            <w:tcW w:w="1170" w:type="dxa"/>
+            <w:tcBorders>
+              <w:top w:val="single" w:sz="4" w:space="0" w:color="000000"/>
+              <w:left w:val="single" w:sz="4" w:space="0" w:color="000000"/>
+              <w:bottom w:val="single" w:sz="4" w:space="0" w:color="000000"/>
+              <w:right w:val="single" w:sz="4" w:space="0" w:color="000000"/>
+            </w:tcBorders>
+          </w:tcPr>
+          <w:p/>
+        </w:tc>
+        <w:tc>
+          <w:tcPr>
+            <w:tcW w:w="1980" w:type="dxa"/>
+            <w:tcBorders>
+              <w:top w:val="single" w:sz="4" w:space="0" w:color="000000"/>
+              <w:left w:val="single" w:sz="4" w:space="0" w:color="000000"/>
+              <w:bottom w:val="single" w:sz="4" w:space="0" w:color="000000"/>
+              <w:right w:val="single" w:sz="4" w:space="0" w:color="000000"/>
+            </w:tcBorders>
+          </w:tcPr>
+          <w:p>
+            <w:r>
+              <w:rPr>
+                <w:sz w:val="28"/>
+                <w:szCs w:val="28"/>
+              </w:rPr>
+              <w:t>Descrição textual dos benefícios do plano</w:t>
+            </w:r>
+          </w:p>
+        </w:tc>
+      </w:tr>
+      <w:tr>
+        <w:tc>
+          <w:tcPr>
+            <w:tcW w:w="1305" w:type="dxa"/>
+            <w:vMerge w:val="restart"/>
+            <w:tcBorders>
+              <w:top w:val="single" w:sz="4" w:space="0" w:color="000000"/>
+              <w:left w:val="single" w:sz="4" w:space="0" w:color="000000"/>
+              <w:bottom w:val="single" w:sz="4" w:space="0" w:color="000000"/>
+              <w:right w:val="single" w:sz="4" w:space="0" w:color="000000"/>
+            </w:tcBorders>
+          </w:tcPr>
+          <w:p>
+            <w:r>
+              <w:rPr>
+                <w:sz w:val="28"/>
+                <w:szCs w:val="28"/>
+              </w:rPr>
+              <w:t>Assinatura</w:t>
+            </w:r>
+          </w:p>
+        </w:tc>
+        <w:tc>
+          <w:tcPr>
+            <w:tcW w:w="2205" w:type="dxa"/>
+            <w:tcBorders>
+              <w:top w:val="single" w:sz="4" w:space="0" w:color="000000"/>
+              <w:left w:val="single" w:sz="4" w:space="0" w:color="000000"/>
+              <w:bottom w:val="single" w:sz="4" w:space="0" w:color="000000"/>
+              <w:right w:val="single" w:sz="4" w:space="0" w:color="000000"/>
+            </w:tcBorders>
+          </w:tcPr>
+          <w:p>
+            <w:r>
+              <w:rPr>
+                <w:sz w:val="28"/>
+                <w:szCs w:val="28"/>
+              </w:rPr>
+              <w:t>codigo</w:t>
+            </w:r>
+          </w:p>
+        </w:tc>
+        <w:tc>
+          <w:tcPr>
+            <w:tcW w:w="1200" w:type="dxa"/>
+            <w:tcBorders>
+              <w:top w:val="single" w:sz="4" w:space="0" w:color="000000"/>
+              <w:left w:val="single" w:sz="4" w:space="0" w:color="000000"/>
+              <w:bottom w:val="single" w:sz="4" w:space="0" w:color="000000"/>
+              <w:right w:val="single" w:sz="4" w:space="0" w:color="000000"/>
+            </w:tcBorders>
+          </w:tcPr>
+          <w:p>
+            <w:r>
+              <w:rPr>
+                <w:sz w:val="28"/>
+                <w:szCs w:val="28"/>
+              </w:rPr>
               <w:t>Inteiro</w:t>
             </w:r>
           </w:p>
@@ -7101,7 +7110,15 @@
               <w:right w:val="single" w:sz="4" w:space="0" w:color="000000"/>
             </w:tcBorders>
           </w:tcPr>
-          <w:p/>
+          <w:p>
+            <w:r>
+              <w:rPr>
+                <w:sz w:val="28"/>
+                <w:szCs w:val="28"/>
+              </w:rPr>
+              <w:t>*</w:t>
+            </w:r>
+          </w:p>
         </w:tc>
         <w:tc>
           <w:tcPr>
@@ -7113,7 +7130,15 @@
               <w:right w:val="single" w:sz="4" w:space="0" w:color="000000"/>
             </w:tcBorders>
           </w:tcPr>
-          <w:p/>
+          <w:p>
+            <w:r>
+              <w:rPr>
+                <w:sz w:val="28"/>
+                <w:szCs w:val="28"/>
+              </w:rPr>
+              <w:t>*</w:t>
+            </w:r>
+          </w:p>
         </w:tc>
         <w:tc>
           <w:tcPr>
@@ -7165,15 +7190,13 @@
             </w:tcBorders>
           </w:tcPr>
           <w:p>
-            <w:proofErr w:type="spellStart"/>
-            <w:r>
-              <w:rPr>
-                <w:sz w:val="28"/>
-                <w:szCs w:val="28"/>
-              </w:rPr>
-              <w:t>beneficios</w:t>
-            </w:r>
-            <w:proofErr w:type="spellEnd"/>
+            <w:r>
+              <w:rPr>
+                <w:sz w:val="28"/>
+                <w:szCs w:val="28"/>
+              </w:rPr>
+              <w:t>dataContratacao</w:t>
+            </w:r>
           </w:p>
         </w:tc>
         <w:tc>
@@ -7192,7 +7215,7 @@
                 <w:sz w:val="28"/>
                 <w:szCs w:val="28"/>
               </w:rPr>
-              <w:t>Char</w:t>
+              <w:t>Date</w:t>
             </w:r>
           </w:p>
         </w:tc>
@@ -7206,15 +7229,7 @@
               <w:right w:val="single" w:sz="4" w:space="0" w:color="000000"/>
             </w:tcBorders>
           </w:tcPr>
-          <w:p>
-            <w:r>
-              <w:rPr>
-                <w:sz w:val="28"/>
-                <w:szCs w:val="28"/>
-              </w:rPr>
-              <w:t>300</w:t>
-            </w:r>
-          </w:p>
+          <w:p/>
         </w:tc>
         <w:tc>
           <w:tcPr>
@@ -7227,135 +7242,6 @@
             </w:tcBorders>
           </w:tcPr>
           <w:p/>
-        </w:tc>
-        <w:tc>
-          <w:tcPr>
-            <w:tcW w:w="1170" w:type="dxa"/>
-            <w:tcBorders>
-              <w:top w:val="single" w:sz="4" w:space="0" w:color="000000"/>
-              <w:left w:val="single" w:sz="4" w:space="0" w:color="000000"/>
-              <w:bottom w:val="single" w:sz="4" w:space="0" w:color="000000"/>
-              <w:right w:val="single" w:sz="4" w:space="0" w:color="000000"/>
-            </w:tcBorders>
-          </w:tcPr>
-          <w:p/>
-        </w:tc>
-        <w:tc>
-          <w:tcPr>
-            <w:tcW w:w="1980" w:type="dxa"/>
-            <w:tcBorders>
-              <w:top w:val="single" w:sz="4" w:space="0" w:color="000000"/>
-              <w:left w:val="single" w:sz="4" w:space="0" w:color="000000"/>
-              <w:bottom w:val="single" w:sz="4" w:space="0" w:color="000000"/>
-              <w:right w:val="single" w:sz="4" w:space="0" w:color="000000"/>
-            </w:tcBorders>
-          </w:tcPr>
-          <w:p>
-            <w:r>
-              <w:rPr>
-                <w:sz w:val="28"/>
-                <w:szCs w:val="28"/>
-              </w:rPr>
-              <w:t>Descrição textual dos benefícios do plano</w:t>
-            </w:r>
-          </w:p>
-        </w:tc>
-      </w:tr>
-      <w:tr>
-        <w:tc>
-          <w:tcPr>
-            <w:tcW w:w="1305" w:type="dxa"/>
-            <w:vMerge w:val="restart"/>
-            <w:tcBorders>
-              <w:top w:val="single" w:sz="4" w:space="0" w:color="000000"/>
-              <w:left w:val="single" w:sz="4" w:space="0" w:color="000000"/>
-              <w:bottom w:val="single" w:sz="4" w:space="0" w:color="000000"/>
-              <w:right w:val="single" w:sz="4" w:space="0" w:color="000000"/>
-            </w:tcBorders>
-          </w:tcPr>
-          <w:p>
-            <w:r>
-              <w:rPr>
-                <w:sz w:val="28"/>
-                <w:szCs w:val="28"/>
-              </w:rPr>
-              <w:t>Assinatura</w:t>
-            </w:r>
-          </w:p>
-        </w:tc>
-        <w:tc>
-          <w:tcPr>
-            <w:tcW w:w="2205" w:type="dxa"/>
-            <w:tcBorders>
-              <w:top w:val="single" w:sz="4" w:space="0" w:color="000000"/>
-              <w:left w:val="single" w:sz="4" w:space="0" w:color="000000"/>
-              <w:bottom w:val="single" w:sz="4" w:space="0" w:color="000000"/>
-              <w:right w:val="single" w:sz="4" w:space="0" w:color="000000"/>
-            </w:tcBorders>
-          </w:tcPr>
-          <w:p>
-            <w:proofErr w:type="spellStart"/>
-            <w:r>
-              <w:rPr>
-                <w:sz w:val="28"/>
-                <w:szCs w:val="28"/>
-              </w:rPr>
-              <w:t>codigo</w:t>
-            </w:r>
-            <w:proofErr w:type="spellEnd"/>
-          </w:p>
-        </w:tc>
-        <w:tc>
-          <w:tcPr>
-            <w:tcW w:w="1200" w:type="dxa"/>
-            <w:tcBorders>
-              <w:top w:val="single" w:sz="4" w:space="0" w:color="000000"/>
-              <w:left w:val="single" w:sz="4" w:space="0" w:color="000000"/>
-              <w:bottom w:val="single" w:sz="4" w:space="0" w:color="000000"/>
-              <w:right w:val="single" w:sz="4" w:space="0" w:color="000000"/>
-            </w:tcBorders>
-          </w:tcPr>
-          <w:p>
-            <w:r>
-              <w:rPr>
-                <w:sz w:val="28"/>
-                <w:szCs w:val="28"/>
-              </w:rPr>
-              <w:t>Inteiro</w:t>
-            </w:r>
-          </w:p>
-        </w:tc>
-        <w:tc>
-          <w:tcPr>
-            <w:tcW w:w="1440" w:type="dxa"/>
-            <w:tcBorders>
-              <w:top w:val="single" w:sz="4" w:space="0" w:color="000000"/>
-              <w:left w:val="single" w:sz="4" w:space="0" w:color="000000"/>
-              <w:bottom w:val="single" w:sz="4" w:space="0" w:color="000000"/>
-              <w:right w:val="single" w:sz="4" w:space="0" w:color="000000"/>
-            </w:tcBorders>
-          </w:tcPr>
-          <w:p/>
-        </w:tc>
-        <w:tc>
-          <w:tcPr>
-            <w:tcW w:w="1005" w:type="dxa"/>
-            <w:tcBorders>
-              <w:top w:val="single" w:sz="4" w:space="0" w:color="000000"/>
-              <w:left w:val="single" w:sz="4" w:space="0" w:color="000000"/>
-              <w:bottom w:val="single" w:sz="4" w:space="0" w:color="000000"/>
-              <w:right w:val="single" w:sz="4" w:space="0" w:color="000000"/>
-            </w:tcBorders>
-          </w:tcPr>
-          <w:p>
-            <w:r>
-              <w:rPr>
-                <w:sz w:val="28"/>
-                <w:szCs w:val="28"/>
-              </w:rPr>
-              <w:t>*</w:t>
-            </w:r>
-          </w:p>
         </w:tc>
         <w:tc>
           <w:tcPr>
@@ -7427,132 +7313,6 @@
             </w:tcBorders>
           </w:tcPr>
           <w:p>
-            <w:proofErr w:type="spellStart"/>
-            <w:r>
-              <w:rPr>
-                <w:sz w:val="28"/>
-                <w:szCs w:val="28"/>
-              </w:rPr>
-              <w:t>dataContratacao</w:t>
-            </w:r>
-            <w:proofErr w:type="spellEnd"/>
-          </w:p>
-        </w:tc>
-        <w:tc>
-          <w:tcPr>
-            <w:tcW w:w="1200" w:type="dxa"/>
-            <w:tcBorders>
-              <w:top w:val="single" w:sz="4" w:space="0" w:color="000000"/>
-              <w:left w:val="single" w:sz="4" w:space="0" w:color="000000"/>
-              <w:bottom w:val="single" w:sz="4" w:space="0" w:color="000000"/>
-              <w:right w:val="single" w:sz="4" w:space="0" w:color="000000"/>
-            </w:tcBorders>
-          </w:tcPr>
-          <w:p>
-            <w:r>
-              <w:rPr>
-                <w:sz w:val="28"/>
-                <w:szCs w:val="28"/>
-              </w:rPr>
-              <w:t>Date</w:t>
-            </w:r>
-          </w:p>
-        </w:tc>
-        <w:tc>
-          <w:tcPr>
-            <w:tcW w:w="1440" w:type="dxa"/>
-            <w:tcBorders>
-              <w:top w:val="single" w:sz="4" w:space="0" w:color="000000"/>
-              <w:left w:val="single" w:sz="4" w:space="0" w:color="000000"/>
-              <w:bottom w:val="single" w:sz="4" w:space="0" w:color="000000"/>
-              <w:right w:val="single" w:sz="4" w:space="0" w:color="000000"/>
-            </w:tcBorders>
-          </w:tcPr>
-          <w:p/>
-        </w:tc>
-        <w:tc>
-          <w:tcPr>
-            <w:tcW w:w="1005" w:type="dxa"/>
-            <w:tcBorders>
-              <w:top w:val="single" w:sz="4" w:space="0" w:color="000000"/>
-              <w:left w:val="single" w:sz="4" w:space="0" w:color="000000"/>
-              <w:bottom w:val="single" w:sz="4" w:space="0" w:color="000000"/>
-              <w:right w:val="single" w:sz="4" w:space="0" w:color="000000"/>
-            </w:tcBorders>
-          </w:tcPr>
-          <w:p/>
-        </w:tc>
-        <w:tc>
-          <w:tcPr>
-            <w:tcW w:w="1170" w:type="dxa"/>
-            <w:tcBorders>
-              <w:top w:val="single" w:sz="4" w:space="0" w:color="000000"/>
-              <w:left w:val="single" w:sz="4" w:space="0" w:color="000000"/>
-              <w:bottom w:val="single" w:sz="4" w:space="0" w:color="000000"/>
-              <w:right w:val="single" w:sz="4" w:space="0" w:color="000000"/>
-            </w:tcBorders>
-          </w:tcPr>
-          <w:p>
-            <w:r>
-              <w:rPr>
-                <w:sz w:val="28"/>
-                <w:szCs w:val="28"/>
-              </w:rPr>
-              <w:t>*</w:t>
-            </w:r>
-          </w:p>
-        </w:tc>
-        <w:tc>
-          <w:tcPr>
-            <w:tcW w:w="1980" w:type="dxa"/>
-            <w:tcBorders>
-              <w:top w:val="single" w:sz="4" w:space="0" w:color="000000"/>
-              <w:left w:val="single" w:sz="4" w:space="0" w:color="000000"/>
-              <w:bottom w:val="single" w:sz="4" w:space="0" w:color="000000"/>
-              <w:right w:val="single" w:sz="4" w:space="0" w:color="000000"/>
-            </w:tcBorders>
-          </w:tcPr>
-          <w:p/>
-        </w:tc>
-      </w:tr>
-      <w:tr>
-        <w:tc>
-          <w:tcPr>
-            <w:tcW w:w="1305" w:type="dxa"/>
-            <w:vMerge/>
-            <w:tcBorders>
-              <w:top w:val="single" w:sz="4" w:space="0" w:color="000000"/>
-              <w:left w:val="single" w:sz="4" w:space="0" w:color="000000"/>
-              <w:bottom w:val="single" w:sz="4" w:space="0" w:color="000000"/>
-              <w:right w:val="single" w:sz="4" w:space="0" w:color="000000"/>
-            </w:tcBorders>
-          </w:tcPr>
-          <w:p>
-            <w:pPr>
-              <w:widowControl w:val="0"/>
-              <w:pBdr>
-                <w:top w:val="nil"/>
-                <w:left w:val="nil"/>
-                <w:bottom w:val="nil"/>
-                <w:right w:val="nil"/>
-                <w:between w:val="nil"/>
-              </w:pBdr>
-              <w:spacing w:line="276" w:lineRule="auto"/>
-            </w:pPr>
-          </w:p>
-        </w:tc>
-        <w:tc>
-          <w:tcPr>
-            <w:tcW w:w="2205" w:type="dxa"/>
-            <w:tcBorders>
-              <w:top w:val="single" w:sz="4" w:space="0" w:color="000000"/>
-              <w:left w:val="single" w:sz="4" w:space="0" w:color="000000"/>
-              <w:bottom w:val="single" w:sz="4" w:space="0" w:color="000000"/>
-              <w:right w:val="single" w:sz="4" w:space="0" w:color="000000"/>
-            </w:tcBorders>
-          </w:tcPr>
-          <w:p>
-            <w:proofErr w:type="spellStart"/>
             <w:r>
               <w:rPr>
                 <w:sz w:val="28"/>
@@ -7560,7 +7320,6 @@
               </w:rPr>
               <w:t>dataProximaCobranca</w:t>
             </w:r>
-            <w:proofErr w:type="spellEnd"/>
           </w:p>
         </w:tc>
         <w:tc>

</xml_diff>

<commit_message>
renomeia atributos abreviados e padroniza id, cpf, cnpj, valor, data e dataEnvio no dicionário de dados. Issue #23
</commit_message>
<xml_diff>
--- a/Requisitos/Documentos de Casos de Uso/DD-ImovelJa.docx
+++ b/Requisitos/Documentos de Casos de Uso/DD-ImovelJa.docx
@@ -366,7 +366,7 @@
                 <w:szCs w:val="28"/>
                 <w:rtl w:val="0"/>
               </w:rPr>
-              <w:t xml:space="preserve">codigo</w:t>
+              <w:t xml:space="preserve">id</w:t>
             </w:r>
             <w:r>
               <w:rPr>
@@ -1344,7 +1344,7 @@
                 <w:szCs w:val="28"/>
                 <w:rtl w:val="0"/>
               </w:rPr>
-              <w:t xml:space="preserve">nBanheiros</w:t>
+              <w:t xml:space="preserve">quantidadeBanheiros</w:t>
             </w:r>
             <w:r>
               <w:rPr>
@@ -1530,7 +1530,7 @@
                 <w:szCs w:val="28"/>
                 <w:rtl w:val="0"/>
               </w:rPr>
-              <w:t xml:space="preserve">nQuartos</w:t>
+              <w:t xml:space="preserve">quantidadeQuartos</w:t>
             </w:r>
             <w:r>
               <w:rPr>
@@ -4329,7 +4329,7 @@
                 <w:szCs w:val="28"/>
                 <w:rtl w:val="0"/>
               </w:rPr>
-              <w:t xml:space="preserve">codigo</w:t>
+              <w:t xml:space="preserve">id</w:t>
             </w:r>
             <w:r>
               <w:rPr>
@@ -5502,7 +5502,7 @@
                 <w:szCs w:val="28"/>
                 <w:rtl w:val="0"/>
               </w:rPr>
-              <w:t xml:space="preserve">CPF</w:t>
+              <w:t xml:space="preserve">cpf</w:t>
             </w:r>
             <w:r>
               <w:rPr>
@@ -5882,7 +5882,7 @@
                 <w:szCs w:val="28"/>
                 <w:rtl w:val="0"/>
               </w:rPr>
-              <w:t xml:space="preserve">CNPJ</w:t>
+              <w:t xml:space="preserve">cnpj</w:t>
             </w:r>
             <w:r>
               <w:rPr>
@@ -6079,7 +6079,7 @@
                 <w:szCs w:val="28"/>
                 <w:rtl w:val="0"/>
               </w:rPr>
-              <w:t xml:space="preserve">codigo</w:t>
+              <w:t xml:space="preserve">id</w:t>
             </w:r>
             <w:r>
               <w:rPr>
@@ -7195,7 +7195,7 @@
                 <w:szCs w:val="28"/>
                 <w:rtl w:val="0"/>
               </w:rPr>
-              <w:t xml:space="preserve">valorAluguel</w:t>
+              <w:t xml:space="preserve">valor</w:t>
             </w:r>
             <w:r>
               <w:rPr>
@@ -7770,7 +7770,7 @@
                 <w:szCs w:val="28"/>
                 <w:rtl w:val="0"/>
               </w:rPr>
-              <w:t xml:space="preserve">codigo</w:t>
+              <w:t xml:space="preserve">id</w:t>
             </w:r>
             <w:r>
               <w:rPr>
@@ -8352,7 +8352,7 @@
                 <w:szCs w:val="28"/>
                 <w:rtl w:val="0"/>
               </w:rPr>
-              <w:t xml:space="preserve">dataPagamento</w:t>
+              <w:t xml:space="preserve">data</w:t>
             </w:r>
             <w:r>
               <w:rPr>
@@ -9292,7 +9292,7 @@
                 <w:szCs w:val="28"/>
                 <w:rtl w:val="0"/>
               </w:rPr>
-              <w:t xml:space="preserve">codigo</w:t>
+              <w:t xml:space="preserve">id</w:t>
             </w:r>
             <w:r>
               <w:rPr>
@@ -9680,7 +9680,7 @@
                 <w:szCs w:val="28"/>
                 <w:rtl w:val="0"/>
               </w:rPr>
-              <w:t xml:space="preserve">dataHora</w:t>
+              <w:t xml:space="preserve">dataEnvio</w:t>
             </w:r>
             <w:r>
               <w:rPr>
@@ -9859,7 +9859,7 @@
                 <w:szCs w:val="28"/>
                 <w:rtl w:val="0"/>
               </w:rPr>
-              <w:t xml:space="preserve">codigo</w:t>
+              <w:t xml:space="preserve">id</w:t>
             </w:r>
             <w:r>
               <w:rPr>
@@ -11016,7 +11016,7 @@
                 <w:szCs w:val="28"/>
                 <w:rtl w:val="0"/>
               </w:rPr>
-              <w:t xml:space="preserve">codigo</w:t>
+              <w:t xml:space="preserve">id</w:t>
             </w:r>
             <w:r>
               <w:rPr>

</xml_diff>

<commit_message>
docs: inclui o telefone da pessoa e ajusta tamanhos e valores válidos dos campos com tipo alterado no dicionário de dados. Issue #53
</commit_message>
<xml_diff>
--- a/Requisitos/Documentos de Casos de Uso/DD-ImovelJa.docx
+++ b/Requisitos/Documentos de Casos de Uso/DD-ImovelJa.docx
@@ -780,7 +780,7 @@
                 <w:sz w:val="28"/>
                 <w:szCs w:val="28"/>
               </w:rPr>
-              <w:t>200</w:t>
+              <w:t xml:space="preserve"/>
             </w:r>
           </w:p>
         </w:tc>
@@ -4822,7 +4822,7 @@
           </w:p>
         </w:tc>
       </w:tr>
-      <w:tr xmlns:wp14="http://schemas.microsoft.com/office/word/2010/wordml" wp14:textId="77777777">
+      <w:tr>
         <w:trPr/>
         <w:tc>
           <w:tcPr>
@@ -4834,7 +4834,7 @@
             </w:tcBorders>
             <w:tcMar/>
           </w:tcPr>
-          <w:p wp14:textId="77777777">
+          <w:p>
             <w:pPr>
               <w:pStyle w:val="Normal"/>
               <w:widowControl w:val="false"/>
@@ -4860,17 +4860,17 @@
             </w:tcBorders>
             <w:tcMar/>
           </w:tcPr>
-          <w:p wp14:textId="77777777">
-            <w:pPr>
-              <w:pStyle w:val="Normal"/>
-              <w:rPr/>
-            </w:pPr>
-            <w:r>
-              <w:rPr>
-                <w:sz w:val="28"/>
-                <w:szCs w:val="28"/>
-              </w:rPr>
-              <w:t>fotoPerfil</w:t>
+          <w:p>
+            <w:pPr>
+              <w:pStyle w:val="Normal"/>
+              <w:rPr/>
+            </w:pPr>
+            <w:r>
+              <w:rPr>
+                <w:sz w:val="28"/>
+                <w:szCs w:val="28"/>
+              </w:rPr>
+              <w:t xml:space="preserve">telefone</w:t>
             </w:r>
           </w:p>
         </w:tc>
@@ -4887,17 +4887,17 @@
             </w:tcBorders>
             <w:tcMar/>
           </w:tcPr>
-          <w:p wp14:textId="77777777">
-            <w:pPr>
-              <w:pStyle w:val="Normal"/>
-              <w:rPr/>
-            </w:pPr>
-            <w:r>
-              <w:rPr>
-                <w:sz w:val="28"/>
-                <w:szCs w:val="28"/>
-              </w:rPr>
-              <w:t>Mediumblob</w:t>
+          <w:p>
+            <w:pPr>
+              <w:pStyle w:val="Normal"/>
+              <w:rPr/>
+            </w:pPr>
+            <w:r>
+              <w:rPr>
+                <w:sz w:val="28"/>
+                <w:szCs w:val="28"/>
+              </w:rPr>
+              <w:t xml:space="preserve">Char</w:t>
             </w:r>
           </w:p>
         </w:tc>
@@ -4914,17 +4914,31 @@
             </w:tcBorders>
             <w:tcMar/>
           </w:tcPr>
-          <w:p wp14:textId="77777777">
-            <w:pPr>
-              <w:pStyle w:val="Normal"/>
-              <w:rPr/>
-            </w:pPr>
-            <w:r>
-              <w:rPr>
-                <w:sz w:val="28"/>
-                <w:szCs w:val="28"/>
-              </w:rPr>
-              <w:t>255</w:t>
+          <w:p>
+            <w:pPr>
+              <w:pStyle w:val="Normal"/>
+              <w:rPr/>
+            </w:pPr>
+            <w:r>
+              <w:rPr>
+                <w:sz w:val="28"/>
+                <w:szCs w:val="28"/>
+              </w:rPr>
+              <w:t xml:space="preserve">20</w:t>
+            </w:r>
+            <w:r>
+              <w:rPr>
+                <w:sz w:val="28"/>
+                <w:szCs w:val="28"/>
+              </w:rPr>
+              <w:t/>
+            </w:r>
+            <w:r>
+              <w:rPr>
+                <w:sz w:val="28"/>
+                <w:szCs w:val="28"/>
+              </w:rPr>
+              <w:t/>
             </w:r>
           </w:p>
         </w:tc>
@@ -4941,7 +4955,7 @@
             </w:tcBorders>
             <w:tcMar/>
           </w:tcPr>
-          <w:p wp14:textId="77777777">
+          <w:p>
             <w:pPr>
               <w:pStyle w:val="Normal"/>
               <w:rPr/>
@@ -4964,13 +4978,17 @@
             </w:tcBorders>
             <w:tcMar/>
           </w:tcPr>
-          <w:p wp14:textId="77777777">
-            <w:pPr>
-              <w:pStyle w:val="Normal"/>
-              <w:rPr/>
-            </w:pPr>
-            <w:r>
-              <w:rPr/>
+          <w:p>
+            <w:pPr>
+              <w:pStyle w:val="Normal"/>
+              <w:rPr/>
+            </w:pPr>
+            <w:r>
+              <w:rPr>
+                <w:sz w:val="28"/>
+                <w:szCs w:val="28"/>
+              </w:rPr>
+              <w:t xml:space="preserve"/>
             </w:r>
           </w:p>
         </w:tc>
@@ -4987,17 +5005,13 @@
             </w:tcBorders>
             <w:tcMar/>
           </w:tcPr>
-          <w:p wp14:textId="77777777">
-            <w:pPr>
-              <w:pStyle w:val="Normal"/>
-              <w:rPr/>
-            </w:pPr>
-            <w:r>
-              <w:rPr>
-                <w:sz w:val="28"/>
-                <w:szCs w:val="28"/>
-              </w:rPr>
-              <w:t>Caminho/URL da imagem de perfil</w:t>
+          <w:p>
+            <w:pPr>
+              <w:pStyle w:val="Normal"/>
+              <w:rPr/>
+            </w:pPr>
+            <w:r>
+              <w:rPr/>
             </w:r>
           </w:p>
         </w:tc>
@@ -5050,7 +5064,7 @@
                 <w:sz w:val="28"/>
                 <w:szCs w:val="28"/>
               </w:rPr>
-              <w:t>status</w:t>
+              <w:t>fotoPerfil</w:t>
             </w:r>
           </w:p>
         </w:tc>
@@ -5077,7 +5091,7 @@
                 <w:sz w:val="28"/>
                 <w:szCs w:val="28"/>
               </w:rPr>
-              <w:t>Char</w:t>
+              <w:t>Mediumblob</w:t>
             </w:r>
           </w:p>
         </w:tc>
@@ -5104,7 +5118,7 @@
                 <w:sz w:val="28"/>
                 <w:szCs w:val="28"/>
               </w:rPr>
-              <w:t>15</w:t>
+              <w:t xml:space="preserve"/>
             </w:r>
           </w:p>
         </w:tc>
@@ -5150,11 +5164,7 @@
               <w:rPr/>
             </w:pPr>
             <w:r>
-              <w:rPr>
-                <w:sz w:val="28"/>
-                <w:szCs w:val="28"/>
-              </w:rPr>
-              <w:t>*</w:t>
+              <w:rPr/>
             </w:r>
           </w:p>
         </w:tc>
@@ -5181,7 +5191,7 @@
                 <w:sz w:val="28"/>
                 <w:szCs w:val="28"/>
               </w:rPr>
-              <w:t>(Ativo, Bloqueado)</w:t>
+              <w:t xml:space="preserve">Arquivo da imagem de perfil (opcional)</w:t>
             </w:r>
           </w:p>
         </w:tc>
@@ -5191,28 +5201,23 @@
         <w:tc>
           <w:tcPr>
             <w:tcW w:w="1559" w:type="dxa"/>
-            <w:vMerge w:val="restart"/>
-            <w:tcBorders>
-              <w:top w:val="single" w:color="000000" w:themeColor="text1" w:sz="4" w:space="0"/>
-              <w:left w:val="single" w:color="000000" w:themeColor="text1" w:sz="4"/>
-              <w:start w:val="single" w:color="000000" w:sz="4" w:space="0"/>
-              <w:bottom w:val="single" w:color="000000" w:themeColor="text1" w:sz="4" w:space="0"/>
-              <w:right w:val="single" w:color="000000" w:themeColor="text1" w:sz="4"/>
-              <w:end w:val="single" w:color="000000" w:sz="4" w:space="0"/>
-            </w:tcBorders>
-            <w:tcMar/>
-          </w:tcPr>
-          <w:p wp14:textId="77777777">
-            <w:pPr>
-              <w:pStyle w:val="Normal"/>
-              <w:rPr/>
-            </w:pPr>
-            <w:r>
-              <w:rPr>
-                <w:sz w:val="28"/>
-                <w:szCs w:val="28"/>
-              </w:rPr>
-              <w:t>Pessoa Física (especializa Pessoa)</w:t>
+            <w:vMerge/>
+            <w:tcBorders>
+              <w:start w:val="single" w:color="000000" w:sz="4" w:space="0"/>
+              <w:end w:val="single" w:color="000000" w:sz="4" w:space="0"/>
+            </w:tcBorders>
+            <w:tcMar/>
+          </w:tcPr>
+          <w:p wp14:textId="77777777">
+            <w:pPr>
+              <w:pStyle w:val="Normal"/>
+              <w:widowControl w:val="false"/>
+              <w:pBdr/>
+              <w:spacing w:line="276" w:lineRule="auto"/>
+              <w:rPr/>
+            </w:pPr>
+            <w:r>
+              <w:rPr/>
             </w:r>
           </w:p>
         </w:tc>
@@ -5239,7 +5244,7 @@
                 <w:sz w:val="28"/>
                 <w:szCs w:val="28"/>
               </w:rPr>
-              <w:t>cpf</w:t>
+              <w:t>status</w:t>
             </w:r>
           </w:p>
         </w:tc>
@@ -5293,7 +5298,7 @@
                 <w:sz w:val="28"/>
                 <w:szCs w:val="28"/>
               </w:rPr>
-              <w:t>11</w:t>
+              <w:t>15</w:t>
             </w:r>
           </w:p>
         </w:tc>
@@ -5316,6 +5321,29 @@
               <w:rPr/>
             </w:pPr>
             <w:r>
+              <w:rPr/>
+            </w:r>
+          </w:p>
+        </w:tc>
+        <w:tc>
+          <w:tcPr>
+            <w:tcW w:w="1171" w:type="dxa"/>
+            <w:tcBorders>
+              <w:top w:val="single" w:color="000000" w:themeColor="text1" w:sz="4" w:space="0"/>
+              <w:left w:val="single" w:color="000000" w:themeColor="text1" w:sz="4"/>
+              <w:start w:val="single" w:color="000000" w:sz="4" w:space="0"/>
+              <w:bottom w:val="single" w:color="000000" w:themeColor="text1" w:sz="4" w:space="0"/>
+              <w:right w:val="single" w:color="000000" w:themeColor="text1" w:sz="4"/>
+              <w:end w:val="single" w:color="000000" w:sz="4" w:space="0"/>
+            </w:tcBorders>
+            <w:tcMar/>
+          </w:tcPr>
+          <w:p wp14:textId="77777777">
+            <w:pPr>
+              <w:pStyle w:val="Normal"/>
+              <w:rPr/>
+            </w:pPr>
+            <w:r>
               <w:rPr>
                 <w:sz w:val="28"/>
                 <w:szCs w:val="28"/>
@@ -5326,33 +5354,6 @@
         </w:tc>
         <w:tc>
           <w:tcPr>
-            <w:tcW w:w="1171" w:type="dxa"/>
-            <w:tcBorders>
-              <w:top w:val="single" w:color="000000" w:themeColor="text1" w:sz="4" w:space="0"/>
-              <w:left w:val="single" w:color="000000" w:themeColor="text1" w:sz="4"/>
-              <w:start w:val="single" w:color="000000" w:sz="4" w:space="0"/>
-              <w:bottom w:val="single" w:color="000000" w:themeColor="text1" w:sz="4" w:space="0"/>
-              <w:right w:val="single" w:color="000000" w:themeColor="text1" w:sz="4"/>
-              <w:end w:val="single" w:color="000000" w:sz="4" w:space="0"/>
-            </w:tcBorders>
-            <w:tcMar/>
-          </w:tcPr>
-          <w:p wp14:textId="77777777">
-            <w:pPr>
-              <w:pStyle w:val="Normal"/>
-              <w:rPr/>
-            </w:pPr>
-            <w:r>
-              <w:rPr>
-                <w:sz w:val="28"/>
-                <w:szCs w:val="28"/>
-              </w:rPr>
-              <w:t>*</w:t>
-            </w:r>
-          </w:p>
-        </w:tc>
-        <w:tc>
-          <w:tcPr>
             <w:tcW w:w="1980" w:type="dxa"/>
             <w:tcBorders>
               <w:top w:val="single" w:color="000000" w:themeColor="text1" w:sz="4" w:space="0"/>
@@ -5370,7 +5371,11 @@
               <w:rPr/>
             </w:pPr>
             <w:r>
-              <w:rPr/>
+              <w:rPr>
+                <w:sz w:val="28"/>
+                <w:szCs w:val="28"/>
+              </w:rPr>
+              <w:t>(Ativo, Bloqueado)</w:t>
             </w:r>
           </w:p>
         </w:tc>
@@ -5380,6 +5385,195 @@
         <w:tc>
           <w:tcPr>
             <w:tcW w:w="1559" w:type="dxa"/>
+            <w:vMerge w:val="restart"/>
+            <w:tcBorders>
+              <w:top w:val="single" w:color="000000" w:themeColor="text1" w:sz="4" w:space="0"/>
+              <w:left w:val="single" w:color="000000" w:themeColor="text1" w:sz="4"/>
+              <w:start w:val="single" w:color="000000" w:sz="4" w:space="0"/>
+              <w:bottom w:val="single" w:color="000000" w:themeColor="text1" w:sz="4" w:space="0"/>
+              <w:right w:val="single" w:color="000000" w:themeColor="text1" w:sz="4"/>
+              <w:end w:val="single" w:color="000000" w:sz="4" w:space="0"/>
+            </w:tcBorders>
+            <w:tcMar/>
+          </w:tcPr>
+          <w:p wp14:textId="77777777">
+            <w:pPr>
+              <w:pStyle w:val="Normal"/>
+              <w:rPr/>
+            </w:pPr>
+            <w:r>
+              <w:rPr>
+                <w:sz w:val="28"/>
+                <w:szCs w:val="28"/>
+              </w:rPr>
+              <w:t>Pessoa Física (especializa Pessoa)</w:t>
+            </w:r>
+          </w:p>
+        </w:tc>
+        <w:tc>
+          <w:tcPr>
+            <w:tcW w:w="2205" w:type="dxa"/>
+            <w:tcBorders>
+              <w:top w:val="single" w:color="000000" w:themeColor="text1" w:sz="4" w:space="0"/>
+              <w:left w:val="single" w:color="000000" w:themeColor="text1" w:sz="4"/>
+              <w:start w:val="single" w:color="000000" w:sz="4" w:space="0"/>
+              <w:bottom w:val="single" w:color="000000" w:themeColor="text1" w:sz="4" w:space="0"/>
+              <w:right w:val="single" w:color="000000" w:themeColor="text1" w:sz="4"/>
+              <w:end w:val="single" w:color="000000" w:sz="4" w:space="0"/>
+            </w:tcBorders>
+            <w:tcMar/>
+          </w:tcPr>
+          <w:p wp14:textId="77777777">
+            <w:pPr>
+              <w:pStyle w:val="Normal"/>
+              <w:rPr/>
+            </w:pPr>
+            <w:r>
+              <w:rPr>
+                <w:sz w:val="28"/>
+                <w:szCs w:val="28"/>
+              </w:rPr>
+              <w:t>cpf</w:t>
+            </w:r>
+          </w:p>
+        </w:tc>
+        <w:tc>
+          <w:tcPr>
+            <w:tcW w:w="1201" w:type="dxa"/>
+            <w:tcBorders>
+              <w:top w:val="single" w:color="000000" w:themeColor="text1" w:sz="4" w:space="0"/>
+              <w:left w:val="single" w:color="000000" w:themeColor="text1" w:sz="4"/>
+              <w:start w:val="single" w:color="000000" w:sz="4" w:space="0"/>
+              <w:bottom w:val="single" w:color="000000" w:themeColor="text1" w:sz="4" w:space="0"/>
+              <w:right w:val="single" w:color="000000" w:themeColor="text1" w:sz="4"/>
+              <w:end w:val="single" w:color="000000" w:sz="4" w:space="0"/>
+            </w:tcBorders>
+            <w:tcMar/>
+          </w:tcPr>
+          <w:p wp14:textId="77777777">
+            <w:pPr>
+              <w:pStyle w:val="Normal"/>
+              <w:rPr/>
+            </w:pPr>
+            <w:r>
+              <w:rPr>
+                <w:sz w:val="28"/>
+                <w:szCs w:val="28"/>
+              </w:rPr>
+              <w:t>Char</w:t>
+            </w:r>
+          </w:p>
+        </w:tc>
+        <w:tc>
+          <w:tcPr>
+            <w:tcW w:w="1439" w:type="dxa"/>
+            <w:tcBorders>
+              <w:top w:val="single" w:color="000000" w:themeColor="text1" w:sz="4" w:space="0"/>
+              <w:left w:val="single" w:color="000000" w:themeColor="text1" w:sz="4"/>
+              <w:start w:val="single" w:color="000000" w:sz="4" w:space="0"/>
+              <w:bottom w:val="single" w:color="000000" w:themeColor="text1" w:sz="4" w:space="0"/>
+              <w:right w:val="single" w:color="000000" w:themeColor="text1" w:sz="4"/>
+              <w:end w:val="single" w:color="000000" w:sz="4" w:space="0"/>
+            </w:tcBorders>
+            <w:tcMar/>
+          </w:tcPr>
+          <w:p wp14:textId="77777777">
+            <w:pPr>
+              <w:pStyle w:val="Normal"/>
+              <w:rPr/>
+            </w:pPr>
+            <w:r>
+              <w:rPr>
+                <w:sz w:val="28"/>
+                <w:szCs w:val="28"/>
+              </w:rPr>
+              <w:t>11</w:t>
+            </w:r>
+          </w:p>
+        </w:tc>
+        <w:tc>
+          <w:tcPr>
+            <w:tcW w:w="1005" w:type="dxa"/>
+            <w:tcBorders>
+              <w:top w:val="single" w:color="000000" w:themeColor="text1" w:sz="4" w:space="0"/>
+              <w:left w:val="single" w:color="000000" w:themeColor="text1" w:sz="4"/>
+              <w:start w:val="single" w:color="000000" w:sz="4" w:space="0"/>
+              <w:bottom w:val="single" w:color="000000" w:themeColor="text1" w:sz="4" w:space="0"/>
+              <w:right w:val="single" w:color="000000" w:themeColor="text1" w:sz="4"/>
+              <w:end w:val="single" w:color="000000" w:sz="4" w:space="0"/>
+            </w:tcBorders>
+            <w:tcMar/>
+          </w:tcPr>
+          <w:p wp14:textId="77777777">
+            <w:pPr>
+              <w:pStyle w:val="Normal"/>
+              <w:rPr/>
+            </w:pPr>
+            <w:r>
+              <w:rPr>
+                <w:sz w:val="28"/>
+                <w:szCs w:val="28"/>
+              </w:rPr>
+              <w:t>*</w:t>
+            </w:r>
+          </w:p>
+        </w:tc>
+        <w:tc>
+          <w:tcPr>
+            <w:tcW w:w="1171" w:type="dxa"/>
+            <w:tcBorders>
+              <w:top w:val="single" w:color="000000" w:themeColor="text1" w:sz="4" w:space="0"/>
+              <w:left w:val="single" w:color="000000" w:themeColor="text1" w:sz="4"/>
+              <w:start w:val="single" w:color="000000" w:sz="4" w:space="0"/>
+              <w:bottom w:val="single" w:color="000000" w:themeColor="text1" w:sz="4" w:space="0"/>
+              <w:right w:val="single" w:color="000000" w:themeColor="text1" w:sz="4"/>
+              <w:end w:val="single" w:color="000000" w:sz="4" w:space="0"/>
+            </w:tcBorders>
+            <w:tcMar/>
+          </w:tcPr>
+          <w:p wp14:textId="77777777">
+            <w:pPr>
+              <w:pStyle w:val="Normal"/>
+              <w:rPr/>
+            </w:pPr>
+            <w:r>
+              <w:rPr>
+                <w:sz w:val="28"/>
+                <w:szCs w:val="28"/>
+              </w:rPr>
+              <w:t>*</w:t>
+            </w:r>
+          </w:p>
+        </w:tc>
+        <w:tc>
+          <w:tcPr>
+            <w:tcW w:w="1980" w:type="dxa"/>
+            <w:tcBorders>
+              <w:top w:val="single" w:color="000000" w:themeColor="text1" w:sz="4" w:space="0"/>
+              <w:left w:val="single" w:color="000000" w:themeColor="text1" w:sz="4"/>
+              <w:start w:val="single" w:color="000000" w:sz="4" w:space="0"/>
+              <w:bottom w:val="single" w:color="000000" w:themeColor="text1" w:sz="4" w:space="0"/>
+              <w:right w:val="single" w:color="000000" w:themeColor="text1" w:sz="4"/>
+              <w:end w:val="single" w:color="000000" w:sz="4" w:space="0"/>
+            </w:tcBorders>
+            <w:tcMar/>
+          </w:tcPr>
+          <w:p wp14:textId="77777777">
+            <w:pPr>
+              <w:pStyle w:val="Normal"/>
+              <w:rPr/>
+            </w:pPr>
+            <w:r>
+              <w:rPr/>
+            </w:r>
+          </w:p>
+        </w:tc>
+      </w:tr>
+      <w:tr xmlns:wp14="http://schemas.microsoft.com/office/word/2010/wordml" wp14:textId="77777777">
+        <w:trPr/>
+        <w:tc>
+          <w:tcPr>
+            <w:tcW w:w="1559" w:type="dxa"/>
             <w:vMerge/>
             <w:tcBorders>
               <w:start w:val="single" w:color="000000" w:sz="4" w:space="0"/>
@@ -6561,7 +6755,7 @@
                 <w:sz w:val="28"/>
                 <w:szCs w:val="28"/>
               </w:rPr>
-              <w:t>Int</w:t>
+              <w:t xml:space="preserve">Inteiro</w:t>
             </w:r>
           </w:p>
         </w:tc>
@@ -6654,6 +6848,13 @@
             </w:pPr>
             <w:r>
               <w:rPr/>
+            </w:r>
+            <w:r>
+              <w:rPr>
+                <w:sz w:val="28"/>
+                <w:szCs w:val="28"/>
+              </w:rPr>
+              <w:t>Dia do mês (1 a 31)</w:t>
             </w:r>
           </w:p>
         </w:tc>
@@ -7108,7 +7309,7 @@
                 <w:sz w:val="28"/>
                 <w:szCs w:val="28"/>
               </w:rPr>
-              <w:t>255</w:t>
+              <w:t xml:space="preserve"/>
             </w:r>
           </w:p>
         </w:tc>
@@ -7680,7 +7881,7 @@
                 <w:sz w:val="28"/>
                 <w:szCs w:val="28"/>
               </w:rPr>
-              <w:t>7</w:t>
+              <w:t xml:space="preserve"/>
             </w:r>
           </w:p>
         </w:tc>
@@ -7757,7 +7958,7 @@
                 <w:sz w:val="28"/>
                 <w:szCs w:val="28"/>
               </w:rPr>
-              <w:t>Formato MM/AAAA</w:t>
+              <w:t xml:space="preserve">Primeiro dia do mês de referência</w:t>
             </w:r>
           </w:p>
         </w:tc>
@@ -8212,7 +8413,7 @@
                 <w:sz w:val="28"/>
                 <w:szCs w:val="28"/>
               </w:rPr>
-              <w:t>255</w:t>
+              <w:t xml:space="preserve"/>
             </w:r>
           </w:p>
         </w:tc>
@@ -8784,7 +8985,7 @@
                 <w:sz w:val="28"/>
                 <w:szCs w:val="28"/>
               </w:rPr>
-              <w:t>500</w:t>
+              <w:t xml:space="preserve"/>
             </w:r>
           </w:p>
         </w:tc>
@@ -9894,7 +10095,7 @@
                 <w:sz w:val="28"/>
                 <w:szCs w:val="28"/>
               </w:rPr>
-              <w:t>300</w:t>
+              <w:t xml:space="preserve"/>
             </w:r>
           </w:p>
         </w:tc>

</xml_diff>

<commit_message>
docs: ajusta o modelo do banco e o dicionário de dados para o scaffold. Issue #67
</commit_message>
<xml_diff>
--- a/Requisitos/Documentos de Casos de Uso/DD-ImovelJa.docx
+++ b/Requisitos/Documentos de Casos de Uso/DD-ImovelJa.docx
@@ -566,7 +566,7 @@
                 <w:sz w:val="28"/>
                 <w:szCs w:val="28"/>
               </w:rPr>
-              <w:t>Char</w:t>
+              <w:t xml:space="preserve">Varchar</w:t>
             </w:r>
           </w:p>
         </w:tc>
@@ -593,14 +593,7 @@
                 <w:sz w:val="28"/>
                 <w:szCs w:val="28"/>
               </w:rPr>
-              <w:t>1</w:t>
-            </w:r>
-            <w:r>
-              <w:rPr>
-                <w:sz w:val="28"/>
-                <w:szCs w:val="28"/>
-              </w:rPr>
-              <w:t>50</w:t>
+              <w:t>150</w:t>
             </w:r>
           </w:p>
         </w:tc>
@@ -825,13 +818,6 @@
               <w:pStyle w:val="Normal"/>
               <w:rPr/>
             </w:pPr>
-            <w:r>
-              <w:rPr>
-                <w:sz w:val="28"/>
-                <w:szCs w:val="28"/>
-              </w:rPr>
-              <w:t>*</w:t>
-            </w:r>
           </w:p>
         </w:tc>
         <w:tc>
@@ -933,7 +919,7 @@
                 <w:sz w:val="28"/>
                 <w:szCs w:val="28"/>
               </w:rPr>
-              <w:t>Char</w:t>
+              <w:t xml:space="preserve">Enum</w:t>
             </w:r>
           </w:p>
         </w:tc>
@@ -955,13 +941,6 @@
               <w:pStyle w:val="Normal"/>
               <w:rPr/>
             </w:pPr>
-            <w:r>
-              <w:rPr>
-                <w:sz w:val="28"/>
-                <w:szCs w:val="28"/>
-              </w:rPr>
-              <w:t>20</w:t>
-            </w:r>
           </w:p>
         </w:tc>
         <w:tc>
@@ -1037,7 +1016,7 @@
                 <w:sz w:val="28"/>
                 <w:szCs w:val="28"/>
               </w:rPr>
-              <w:t>Tipo do imóvel (ex.: casa, apartamento, terreno)</w:t>
+              <w:t xml:space="preserve">C = Casa, A = Apartamento, T = Terreno, S = Studio, CO = Comercial, O = Outro</w:t>
             </w:r>
           </w:p>
         </w:tc>
@@ -1117,7 +1096,7 @@
                 <w:sz w:val="28"/>
                 <w:szCs w:val="28"/>
               </w:rPr>
-              <w:t>Float</w:t>
+              <w:t xml:space="preserve">Decimal</w:t>
             </w:r>
           </w:p>
         </w:tc>
@@ -1140,7 +1119,11 @@
               <w:rPr/>
             </w:pPr>
             <w:r>
-              <w:rPr/>
+              <w:rPr>
+                <w:sz w:val="28"/>
+                <w:szCs w:val="28"/>
+              </w:rPr>
+              <w:t xml:space="preserve">10,2</w:t>
             </w:r>
           </w:p>
         </w:tc>
@@ -1185,13 +1168,6 @@
               <w:pStyle w:val="Normal"/>
               <w:rPr/>
             </w:pPr>
-            <w:r>
-              <w:rPr>
-                <w:sz w:val="28"/>
-                <w:szCs w:val="28"/>
-              </w:rPr>
-              <w:t>*</w:t>
-            </w:r>
           </w:p>
         </w:tc>
         <w:tc>
@@ -1213,7 +1189,11 @@
               <w:rPr/>
             </w:pPr>
             <w:r>
-              <w:rPr/>
+              <w:rPr>
+                <w:sz w:val="28"/>
+                <w:szCs w:val="28"/>
+              </w:rPr>
+              <w:t xml:space="preserve">Maior que zero</w:t>
             </w:r>
           </w:p>
         </w:tc>
@@ -1361,13 +1341,6 @@
               <w:pStyle w:val="Normal"/>
               <w:rPr/>
             </w:pPr>
-            <w:r>
-              <w:rPr>
-                <w:sz w:val="28"/>
-                <w:szCs w:val="28"/>
-              </w:rPr>
-              <w:t>*</w:t>
-            </w:r>
           </w:p>
         </w:tc>
         <w:tc>
@@ -1641,7 +1614,7 @@
                 <w:sz w:val="28"/>
                 <w:szCs w:val="28"/>
               </w:rPr>
-              <w:t>Float</w:t>
+              <w:t xml:space="preserve">Decimal</w:t>
             </w:r>
           </w:p>
         </w:tc>
@@ -1664,7 +1637,11 @@
               <w:rPr/>
             </w:pPr>
             <w:r>
-              <w:rPr/>
+              <w:rPr>
+                <w:sz w:val="28"/>
+                <w:szCs w:val="28"/>
+              </w:rPr>
+              <w:t xml:space="preserve">10,2</w:t>
             </w:r>
           </w:p>
         </w:tc>
@@ -1733,7 +1710,11 @@
               <w:rPr/>
             </w:pPr>
             <w:r>
-              <w:rPr/>
+              <w:rPr>
+                <w:sz w:val="28"/>
+                <w:szCs w:val="28"/>
+              </w:rPr>
+              <w:t xml:space="preserve">Maior que zero</w:t>
             </w:r>
           </w:p>
         </w:tc>
@@ -1813,7 +1794,7 @@
                 <w:sz w:val="28"/>
                 <w:szCs w:val="28"/>
               </w:rPr>
-              <w:t>Float</w:t>
+              <w:t xml:space="preserve">Decimal</w:t>
             </w:r>
           </w:p>
         </w:tc>
@@ -1836,7 +1817,11 @@
               <w:rPr/>
             </w:pPr>
             <w:r>
-              <w:rPr/>
+              <w:rPr>
+                <w:sz w:val="28"/>
+                <w:szCs w:val="28"/>
+              </w:rPr>
+              <w:t xml:space="preserve">10,2</w:t>
             </w:r>
           </w:p>
         </w:tc>
@@ -1905,7 +1890,11 @@
               <w:rPr/>
             </w:pPr>
             <w:r>
-              <w:rPr/>
+              <w:rPr>
+                <w:sz w:val="28"/>
+                <w:szCs w:val="28"/>
+              </w:rPr>
+              <w:t xml:space="preserve">Maior que zero</w:t>
             </w:r>
           </w:p>
         </w:tc>
@@ -1985,7 +1974,7 @@
                 <w:sz w:val="28"/>
                 <w:szCs w:val="28"/>
               </w:rPr>
-              <w:t>Float</w:t>
+              <w:t xml:space="preserve">Decimal</w:t>
             </w:r>
           </w:p>
         </w:tc>
@@ -2008,7 +1997,11 @@
               <w:rPr/>
             </w:pPr>
             <w:r>
-              <w:rPr/>
+              <w:rPr>
+                <w:sz w:val="28"/>
+                <w:szCs w:val="28"/>
+              </w:rPr>
+              <w:t xml:space="preserve">10,2</w:t>
             </w:r>
           </w:p>
         </w:tc>
@@ -2077,7 +2070,11 @@
               <w:rPr/>
             </w:pPr>
             <w:r>
-              <w:rPr/>
+              <w:rPr>
+                <w:sz w:val="28"/>
+                <w:szCs w:val="28"/>
+              </w:rPr>
+              <w:t xml:space="preserve">Maior que zero</w:t>
             </w:r>
           </w:p>
         </w:tc>
@@ -2157,7 +2154,7 @@
                 <w:sz w:val="28"/>
                 <w:szCs w:val="28"/>
               </w:rPr>
-              <w:t>Float</w:t>
+              <w:t xml:space="preserve">Decimal</w:t>
             </w:r>
           </w:p>
         </w:tc>
@@ -2180,7 +2177,11 @@
               <w:rPr/>
             </w:pPr>
             <w:r>
-              <w:rPr/>
+              <w:rPr>
+                <w:sz w:val="28"/>
+                <w:szCs w:val="28"/>
+              </w:rPr>
+              <w:t xml:space="preserve">10,2</w:t>
             </w:r>
           </w:p>
         </w:tc>
@@ -2249,7 +2250,11 @@
               <w:rPr/>
             </w:pPr>
             <w:r>
-              <w:rPr/>
+              <w:rPr>
+                <w:sz w:val="28"/>
+                <w:szCs w:val="28"/>
+              </w:rPr>
+              <w:t xml:space="preserve">Maior que zero</w:t>
             </w:r>
           </w:p>
         </w:tc>
@@ -2329,7 +2334,7 @@
                 <w:sz w:val="28"/>
                 <w:szCs w:val="28"/>
               </w:rPr>
-              <w:t>Float</w:t>
+              <w:t xml:space="preserve">Decimal</w:t>
             </w:r>
           </w:p>
         </w:tc>
@@ -2352,7 +2357,11 @@
               <w:rPr/>
             </w:pPr>
             <w:r>
-              <w:rPr/>
+              <w:rPr>
+                <w:sz w:val="28"/>
+                <w:szCs w:val="28"/>
+              </w:rPr>
+              <w:t xml:space="preserve">10,2</w:t>
             </w:r>
           </w:p>
         </w:tc>
@@ -2421,7 +2430,11 @@
               <w:rPr/>
             </w:pPr>
             <w:r>
-              <w:rPr/>
+              <w:rPr>
+                <w:sz w:val="28"/>
+                <w:szCs w:val="28"/>
+              </w:rPr>
+              <w:t xml:space="preserve">Maior que zero</w:t>
             </w:r>
           </w:p>
         </w:tc>
@@ -2501,7 +2514,7 @@
                 <w:sz w:val="28"/>
                 <w:szCs w:val="28"/>
               </w:rPr>
-              <w:t>Char</w:t>
+              <w:t xml:space="preserve">Varchar</w:t>
             </w:r>
           </w:p>
         </w:tc>
@@ -2528,14 +2541,7 @@
                 <w:sz w:val="28"/>
                 <w:szCs w:val="28"/>
               </w:rPr>
-              <w:t>1</w:t>
-            </w:r>
-            <w:r>
-              <w:rPr>
-                <w:sz w:val="28"/>
-                <w:szCs w:val="28"/>
-              </w:rPr>
-              <w:t>50</w:t>
+              <w:t>150</w:t>
             </w:r>
           </w:p>
         </w:tc>
@@ -2688,7 +2694,7 @@
                 <w:sz w:val="28"/>
                 <w:szCs w:val="28"/>
               </w:rPr>
-              <w:t>Char</w:t>
+              <w:t xml:space="preserve">Varchar</w:t>
             </w:r>
           </w:p>
         </w:tc>
@@ -2761,7 +2767,11 @@
               <w:rPr/>
             </w:pPr>
             <w:r>
-              <w:rPr/>
+              <w:rPr>
+                <w:sz w:val="28"/>
+                <w:szCs w:val="28"/>
+              </w:rPr>
+              <w:t xml:space="preserve">*</w:t>
             </w:r>
           </w:p>
         </w:tc>
@@ -2864,7 +2874,7 @@
                 <w:sz w:val="28"/>
                 <w:szCs w:val="28"/>
               </w:rPr>
-              <w:t>Char</w:t>
+              <w:t xml:space="preserve">Char</w:t>
             </w:r>
           </w:p>
         </w:tc>
@@ -2891,7 +2901,7 @@
                 <w:sz w:val="28"/>
                 <w:szCs w:val="28"/>
               </w:rPr>
-              <w:t>10</w:t>
+              <w:t xml:space="preserve">8</w:t>
             </w:r>
           </w:p>
         </w:tc>
@@ -2937,7 +2947,11 @@
               <w:rPr/>
             </w:pPr>
             <w:r>
-              <w:rPr/>
+              <w:rPr>
+                <w:sz w:val="28"/>
+                <w:szCs w:val="28"/>
+              </w:rPr>
+              <w:t xml:space="preserve">*</w:t>
             </w:r>
           </w:p>
         </w:tc>
@@ -2964,7 +2978,7 @@
                 <w:sz w:val="28"/>
                 <w:szCs w:val="28"/>
               </w:rPr>
-              <w:t>Formato 00000-000</w:t>
+              <w:t xml:space="preserve">Somente números (8 dígitos)</w:t>
             </w:r>
           </w:p>
         </w:tc>
@@ -3044,7 +3058,7 @@
                 <w:sz w:val="28"/>
                 <w:szCs w:val="28"/>
               </w:rPr>
-              <w:t>Char</w:t>
+              <w:t xml:space="preserve">Varchar</w:t>
             </w:r>
           </w:p>
         </w:tc>
@@ -3117,7 +3131,11 @@
               <w:rPr/>
             </w:pPr>
             <w:r>
-              <w:rPr/>
+              <w:rPr>
+                <w:sz w:val="28"/>
+                <w:szCs w:val="28"/>
+              </w:rPr>
+              <w:t xml:space="preserve">*</w:t>
             </w:r>
           </w:p>
         </w:tc>
@@ -3220,7 +3238,7 @@
                 <w:sz w:val="28"/>
                 <w:szCs w:val="28"/>
               </w:rPr>
-              <w:t>Char</w:t>
+              <w:t xml:space="preserve">Varchar</w:t>
             </w:r>
           </w:p>
         </w:tc>
@@ -3293,7 +3311,11 @@
               <w:rPr/>
             </w:pPr>
             <w:r>
-              <w:rPr/>
+              <w:rPr>
+                <w:sz w:val="28"/>
+                <w:szCs w:val="28"/>
+              </w:rPr>
+              <w:t xml:space="preserve">*</w:t>
             </w:r>
           </w:p>
         </w:tc>
@@ -3396,7 +3418,7 @@
                 <w:sz w:val="28"/>
                 <w:szCs w:val="28"/>
               </w:rPr>
-              <w:t>Float</w:t>
+              <w:t xml:space="preserve">Decimal</w:t>
             </w:r>
           </w:p>
         </w:tc>
@@ -3419,7 +3441,11 @@
               <w:rPr/>
             </w:pPr>
             <w:r>
-              <w:rPr/>
+              <w:rPr>
+                <w:sz w:val="28"/>
+                <w:szCs w:val="28"/>
+              </w:rPr>
+              <w:t xml:space="preserve">12,2</w:t>
             </w:r>
           </w:p>
         </w:tc>
@@ -3492,7 +3518,11 @@
               <w:rPr/>
             </w:pPr>
             <w:r>
-              <w:rPr/>
+              <w:rPr>
+                <w:sz w:val="28"/>
+                <w:szCs w:val="28"/>
+              </w:rPr>
+              <w:t xml:space="preserve">Maior que zero</w:t>
             </w:r>
           </w:p>
         </w:tc>
@@ -3572,7 +3602,7 @@
                 <w:sz w:val="28"/>
                 <w:szCs w:val="28"/>
               </w:rPr>
-              <w:t>Char</w:t>
+              <w:t xml:space="preserve">Enum</w:t>
             </w:r>
           </w:p>
         </w:tc>
@@ -3594,13 +3624,6 @@
               <w:pStyle w:val="Normal"/>
               <w:rPr/>
             </w:pPr>
-            <w:r>
-              <w:rPr>
-                <w:sz w:val="28"/>
-                <w:szCs w:val="28"/>
-              </w:rPr>
-              <w:t>10</w:t>
-            </w:r>
           </w:p>
         </w:tc>
         <w:tc>
@@ -3676,7 +3699,7 @@
                 <w:sz w:val="28"/>
                 <w:szCs w:val="28"/>
               </w:rPr>
-              <w:t>(Venda, Aluguel)</w:t>
+              <w:t xml:space="preserve">A = Aluguel, V = Venda</w:t>
             </w:r>
           </w:p>
         </w:tc>
@@ -3756,7 +3779,7 @@
                 <w:sz w:val="28"/>
                 <w:szCs w:val="28"/>
               </w:rPr>
-              <w:t>Char</w:t>
+              <w:t xml:space="preserve">Enum</w:t>
             </w:r>
           </w:p>
         </w:tc>
@@ -3778,13 +3801,6 @@
               <w:pStyle w:val="Normal"/>
               <w:rPr/>
             </w:pPr>
-            <w:r>
-              <w:rPr>
-                <w:sz w:val="28"/>
-                <w:szCs w:val="28"/>
-              </w:rPr>
-              <w:t>15</w:t>
-            </w:r>
           </w:p>
         </w:tc>
         <w:tc>
@@ -3860,7 +3876,7 @@
                 <w:sz w:val="28"/>
                 <w:szCs w:val="28"/>
               </w:rPr>
-              <w:t>(Disponível, Alugado, Vendido, Pausado)</w:t>
+              <w:t xml:space="preserve">D = Disponível, A = Alugado, V = Vendido, P = Pausado. Padrão: D</w:t>
             </w:r>
           </w:p>
         </w:tc>
@@ -3940,7 +3956,7 @@
                 <w:sz w:val="28"/>
                 <w:szCs w:val="28"/>
               </w:rPr>
-              <w:t>Char</w:t>
+              <w:t xml:space="preserve">Enum</w:t>
             </w:r>
           </w:p>
         </w:tc>
@@ -3962,13 +3978,6 @@
               <w:pStyle w:val="Normal"/>
               <w:rPr/>
             </w:pPr>
-            <w:r>
-              <w:rPr>
-                <w:sz w:val="28"/>
-                <w:szCs w:val="28"/>
-              </w:rPr>
-              <w:t>15</w:t>
-            </w:r>
           </w:p>
         </w:tc>
         <w:tc>
@@ -4044,7 +4053,7 @@
                 <w:sz w:val="28"/>
                 <w:szCs w:val="28"/>
               </w:rPr>
-              <w:t>(Pendente, Aprovado, Reprovado)</w:t>
+              <w:t xml:space="preserve">P = Pendente, A = Aprovado, R = Reprovado. Padrão: P</w:t>
             </w:r>
           </w:p>
         </w:tc>
@@ -4332,7 +4341,7 @@
                 <w:sz w:val="28"/>
                 <w:szCs w:val="28"/>
               </w:rPr>
-              <w:t>Char</w:t>
+              <w:t xml:space="preserve">Enum</w:t>
             </w:r>
           </w:p>
         </w:tc>
@@ -4354,13 +4363,6 @@
               <w:pStyle w:val="Normal"/>
               <w:rPr/>
             </w:pPr>
-            <w:r>
-              <w:rPr>
-                <w:sz w:val="28"/>
-                <w:szCs w:val="28"/>
-              </w:rPr>
-              <w:t>10</w:t>
-            </w:r>
           </w:p>
         </w:tc>
         <w:tc>
@@ -4436,7 +4438,7 @@
                 <w:sz w:val="28"/>
                 <w:szCs w:val="28"/>
               </w:rPr>
-              <w:t xml:space="preserve">(física, jurídica) </w:t>
+              <w:t xml:space="preserve">F = Física, J = Jurídica</w:t>
             </w:r>
           </w:p>
         </w:tc>
@@ -4516,7 +4518,7 @@
                 <w:sz w:val="28"/>
                 <w:szCs w:val="28"/>
               </w:rPr>
-              <w:t>Char</w:t>
+              <w:t xml:space="preserve">Varchar</w:t>
             </w:r>
           </w:p>
         </w:tc>
@@ -4543,14 +4545,7 @@
                 <w:sz w:val="28"/>
                 <w:szCs w:val="28"/>
               </w:rPr>
-              <w:t>1</w:t>
-            </w:r>
-            <w:r>
-              <w:rPr>
-                <w:sz w:val="28"/>
-                <w:szCs w:val="28"/>
-              </w:rPr>
-              <w:t>50</w:t>
+              <w:t>150</w:t>
             </w:r>
           </w:p>
         </w:tc>
@@ -4623,7 +4618,11 @@
               <w:rPr/>
             </w:pPr>
             <w:r>
-              <w:rPr/>
+              <w:rPr>
+                <w:sz w:val="28"/>
+                <w:szCs w:val="28"/>
+              </w:rPr>
+              <w:t xml:space="preserve">Único</w:t>
             </w:r>
           </w:p>
         </w:tc>
@@ -4703,7 +4702,7 @@
                 <w:sz w:val="28"/>
                 <w:szCs w:val="28"/>
               </w:rPr>
-              <w:t>Char</w:t>
+              <w:t xml:space="preserve">Varchar</w:t>
             </w:r>
           </w:p>
         </w:tc>
@@ -4730,21 +4729,7 @@
                 <w:sz w:val="28"/>
                 <w:szCs w:val="28"/>
               </w:rPr>
-              <w:t>1</w:t>
-            </w:r>
-            <w:r>
-              <w:rPr>
-                <w:sz w:val="28"/>
-                <w:szCs w:val="28"/>
-              </w:rPr>
-              <w:t>5</w:t>
-            </w:r>
-            <w:r>
-              <w:rPr>
-                <w:sz w:val="28"/>
-                <w:szCs w:val="28"/>
-              </w:rPr>
-              <w:t>0</w:t>
+              <w:t>150</w:t>
             </w:r>
           </w:p>
         </w:tc>
@@ -4897,7 +4882,7 @@
                 <w:sz w:val="28"/>
                 <w:szCs w:val="28"/>
               </w:rPr>
-              <w:t xml:space="preserve">Char</w:t>
+              <w:t xml:space="preserve">Varchar</w:t>
             </w:r>
           </w:p>
         </w:tc>
@@ -4925,20 +4910,6 @@
                 <w:szCs w:val="28"/>
               </w:rPr>
               <w:t xml:space="preserve">20</w:t>
-            </w:r>
-            <w:r>
-              <w:rPr>
-                <w:sz w:val="28"/>
-                <w:szCs w:val="28"/>
-              </w:rPr>
-              <w:t/>
-            </w:r>
-            <w:r>
-              <w:rPr>
-                <w:sz w:val="28"/>
-                <w:szCs w:val="28"/>
-              </w:rPr>
-              <w:t/>
             </w:r>
           </w:p>
         </w:tc>
@@ -5271,7 +5242,7 @@
                 <w:sz w:val="28"/>
                 <w:szCs w:val="28"/>
               </w:rPr>
-              <w:t>Char</w:t>
+              <w:t xml:space="preserve">Enum</w:t>
             </w:r>
           </w:p>
         </w:tc>
@@ -5293,13 +5264,6 @@
               <w:pStyle w:val="Normal"/>
               <w:rPr/>
             </w:pPr>
-            <w:r>
-              <w:rPr>
-                <w:sz w:val="28"/>
-                <w:szCs w:val="28"/>
-              </w:rPr>
-              <w:t>15</w:t>
-            </w:r>
           </w:p>
         </w:tc>
         <w:tc>
@@ -5375,7 +5339,7 @@
                 <w:sz w:val="28"/>
                 <w:szCs w:val="28"/>
               </w:rPr>
-              <w:t>(Ativo, Bloqueado)</w:t>
+              <w:t xml:space="preserve">A = Ativo, B = Bloqueado. Padrão: A</w:t>
             </w:r>
           </w:p>
         </w:tc>
@@ -5564,7 +5528,11 @@
               <w:rPr/>
             </w:pPr>
             <w:r>
-              <w:rPr/>
+              <w:rPr>
+                <w:sz w:val="28"/>
+                <w:szCs w:val="28"/>
+              </w:rPr>
+              <w:t xml:space="preserve">Único. Somente números (11 dígitos)</w:t>
             </w:r>
           </w:p>
         </w:tc>
@@ -5931,8 +5899,10 @@
             </w:pPr>
             <w:r>
               <w:rPr>
-                <w:u w:val="single"/>
-              </w:rPr>
+                <w:sz w:val="28"/>
+                <w:szCs w:val="28"/>
+              </w:rPr>
+              <w:t xml:space="preserve">Único. Somente números (14 dígitos)</w:t>
             </w:r>
           </w:p>
         </w:tc>
@@ -5986,7 +5956,7 @@
                 <w:szCs w:val="28"/>
                 <w:lang w:val="pt-BR"/>
               </w:rPr>
-              <w:t>Relacionamento: Refere-se a um Imóvel e tem um Inquilino (Pessoa).</w:t>
+              <w:t>Relacionamento: Refere-se a um Imóvel e pode ter um Inquilino (Pessoa) com conta na plataforma.</w:t>
             </w:r>
           </w:p>
         </w:tc>
@@ -6220,7 +6190,7 @@
                 <w:sz w:val="28"/>
                 <w:szCs w:val="28"/>
               </w:rPr>
-              <w:t>Char</w:t>
+              <w:t xml:space="preserve">Varchar</w:t>
             </w:r>
           </w:p>
         </w:tc>
@@ -6396,7 +6366,7 @@
                 <w:sz w:val="28"/>
                 <w:szCs w:val="28"/>
               </w:rPr>
-              <w:t>Char</w:t>
+              <w:t xml:space="preserve">Varchar</w:t>
             </w:r>
           </w:p>
         </w:tc>
@@ -6469,7 +6439,11 @@
               <w:rPr/>
             </w:pPr>
             <w:r>
-              <w:rPr/>
+              <w:rPr>
+                <w:sz w:val="28"/>
+                <w:szCs w:val="28"/>
+              </w:rPr>
+              <w:t xml:space="preserve">*</w:t>
             </w:r>
           </w:p>
         </w:tc>
@@ -6576,7 +6550,7 @@
                 <w:sz w:val="28"/>
                 <w:szCs w:val="28"/>
               </w:rPr>
-              <w:t>Char</w:t>
+              <w:t xml:space="preserve">Varchar</w:t>
             </w:r>
           </w:p>
         </w:tc>
@@ -6824,7 +6798,11 @@
               <w:rPr/>
             </w:pPr>
             <w:r>
-              <w:rPr/>
+              <w:rPr>
+                <w:sz w:val="28"/>
+                <w:szCs w:val="28"/>
+              </w:rPr>
+              <w:t xml:space="preserve">*</w:t>
             </w:r>
           </w:p>
         </w:tc>
@@ -7106,7 +7084,7 @@
                 <w:sz w:val="28"/>
                 <w:szCs w:val="28"/>
               </w:rPr>
-              <w:t>Float</w:t>
+              <w:t xml:space="preserve">Decimal</w:t>
             </w:r>
           </w:p>
         </w:tc>
@@ -7129,7 +7107,11 @@
               <w:rPr/>
             </w:pPr>
             <w:r>
-              <w:rPr/>
+              <w:rPr>
+                <w:sz w:val="28"/>
+                <w:szCs w:val="28"/>
+              </w:rPr>
+              <w:t xml:space="preserve">12,2</w:t>
             </w:r>
           </w:p>
         </w:tc>
@@ -7202,7 +7184,11 @@
               <w:rPr/>
             </w:pPr>
             <w:r>
-              <w:rPr/>
+              <w:rPr>
+                <w:sz w:val="28"/>
+                <w:szCs w:val="28"/>
+              </w:rPr>
+              <w:t xml:space="preserve">Maior que zero</w:t>
             </w:r>
           </w:p>
         </w:tc>
@@ -7462,7 +7448,7 @@
                 <w:sz w:val="28"/>
                 <w:szCs w:val="28"/>
               </w:rPr>
-              <w:t>Char</w:t>
+              <w:t xml:space="preserve">Enum</w:t>
             </w:r>
           </w:p>
         </w:tc>
@@ -7484,13 +7470,6 @@
               <w:pStyle w:val="Normal"/>
               <w:rPr/>
             </w:pPr>
-            <w:r>
-              <w:rPr>
-                <w:sz w:val="28"/>
-                <w:szCs w:val="28"/>
-              </w:rPr>
-              <w:t>15</w:t>
-            </w:r>
           </w:p>
         </w:tc>
         <w:tc>
@@ -7566,7 +7545,7 @@
                 <w:sz w:val="28"/>
                 <w:szCs w:val="28"/>
               </w:rPr>
-              <w:t>(Ativo, Encerrado)</w:t>
+              <w:t xml:space="preserve">A = Ativo, C = Cancelado. Padrão: A. Apenas um aluguel ativo por imóvel</w:t>
             </w:r>
           </w:p>
         </w:tc>
@@ -7958,7 +7937,7 @@
                 <w:sz w:val="28"/>
                 <w:szCs w:val="28"/>
               </w:rPr>
-              <w:t xml:space="preserve">Primeiro dia do mês de referência</w:t>
+              <w:t xml:space="preserve">Primeiro dia do mês de referência. Único por aluguel</w:t>
             </w:r>
           </w:p>
         </w:tc>
@@ -8038,7 +8017,7 @@
                 <w:sz w:val="28"/>
                 <w:szCs w:val="28"/>
               </w:rPr>
-              <w:t>Float</w:t>
+              <w:t xml:space="preserve">Decimal</w:t>
             </w:r>
           </w:p>
         </w:tc>
@@ -8061,7 +8040,11 @@
               <w:rPr/>
             </w:pPr>
             <w:r>
-              <w:rPr/>
+              <w:rPr>
+                <w:sz w:val="28"/>
+                <w:szCs w:val="28"/>
+              </w:rPr>
+              <w:t xml:space="preserve">12,2</w:t>
             </w:r>
           </w:p>
         </w:tc>
@@ -8106,13 +8089,6 @@
               <w:pStyle w:val="Normal"/>
               <w:rPr/>
             </w:pPr>
-            <w:r>
-              <w:rPr>
-                <w:sz w:val="28"/>
-                <w:szCs w:val="28"/>
-              </w:rPr>
-              <w:t>*</w:t>
-            </w:r>
           </w:p>
         </w:tc>
         <w:tc>
@@ -8134,7 +8110,11 @@
               <w:rPr/>
             </w:pPr>
             <w:r>
-              <w:rPr/>
+              <w:rPr>
+                <w:sz w:val="28"/>
+                <w:szCs w:val="28"/>
+              </w:rPr>
+              <w:t xml:space="preserve">Maior que zero. Obrigatório quando o status for Pago</w:t>
             </w:r>
           </w:p>
         </w:tc>
@@ -8187,7 +8167,7 @@
                 <w:sz w:val="28"/>
                 <w:szCs w:val="28"/>
               </w:rPr>
-              <w:t>data</w:t>
+              <w:t xml:space="preserve">dataPagamento</w:t>
             </w:r>
           </w:p>
         </w:tc>
@@ -8306,7 +8286,11 @@
               <w:rPr/>
             </w:pPr>
             <w:r>
-              <w:rPr/>
+              <w:rPr>
+                <w:sz w:val="28"/>
+                <w:szCs w:val="28"/>
+              </w:rPr>
+              <w:t xml:space="preserve">Obrigatória quando o status for Pago</w:t>
             </w:r>
           </w:p>
         </w:tc>
@@ -8566,7 +8550,7 @@
                 <w:sz w:val="28"/>
                 <w:szCs w:val="28"/>
               </w:rPr>
-              <w:t>Char</w:t>
+              <w:t xml:space="preserve">Enum</w:t>
             </w:r>
           </w:p>
         </w:tc>
@@ -8588,13 +8572,6 @@
               <w:pStyle w:val="Normal"/>
               <w:rPr/>
             </w:pPr>
-            <w:r>
-              <w:rPr>
-                <w:sz w:val="28"/>
-                <w:szCs w:val="28"/>
-              </w:rPr>
-              <w:t>15</w:t>
-            </w:r>
           </w:p>
         </w:tc>
         <w:tc>
@@ -8670,7 +8647,7 @@
                 <w:sz w:val="28"/>
                 <w:szCs w:val="28"/>
               </w:rPr>
-              <w:t>(Pendente, Em atraso, Pago)</w:t>
+              <w:t xml:space="preserve">PE = Pendente, EA = Em atraso, PA = Pago. Padrão: PE</w:t>
             </w:r>
           </w:p>
         </w:tc>
@@ -8724,7 +8701,7 @@
                 <w:szCs w:val="28"/>
                 <w:lang w:val="pt-BR"/>
               </w:rPr>
-              <w:t>Relacionamento: Tem uma Pessoa que enviou e uma Pessoa que recebeu.</w:t>
+              <w:t>Relacionamento: Tem uma Pessoa que enviou e uma Pessoa diferente que recebeu.</w:t>
             </w:r>
           </w:p>
         </w:tc>
@@ -9138,14 +9115,7 @@
                 <w:sz w:val="28"/>
                 <w:szCs w:val="28"/>
               </w:rPr>
-              <w:t>Date</w:t>
-            </w:r>
-            <w:r>
-              <w:rPr>
-                <w:sz w:val="28"/>
-                <w:szCs w:val="28"/>
-              </w:rPr>
-              <w:t>Time</w:t>
+              <w:t>DateTime</w:t>
             </w:r>
           </w:p>
         </w:tc>
@@ -9241,7 +9211,11 @@
               <w:rPr/>
             </w:pPr>
             <w:r>
-              <w:rPr/>
+              <w:rPr>
+                <w:sz w:val="28"/>
+                <w:szCs w:val="28"/>
+              </w:rPr>
+              <w:t xml:space="preserve">Padrão: data e hora do envio</w:t>
             </w:r>
           </w:p>
         </w:tc>
@@ -9529,7 +9503,7 @@
                 <w:sz w:val="28"/>
                 <w:szCs w:val="28"/>
               </w:rPr>
-              <w:t>Char</w:t>
+              <w:t xml:space="preserve">Varchar</w:t>
             </w:r>
           </w:p>
         </w:tc>
@@ -9713,7 +9687,7 @@
                 <w:sz w:val="28"/>
                 <w:szCs w:val="28"/>
               </w:rPr>
-              <w:t>Float</w:t>
+              <w:t xml:space="preserve">Decimal</w:t>
             </w:r>
           </w:p>
         </w:tc>
@@ -9736,7 +9710,11 @@
               <w:rPr/>
             </w:pPr>
             <w:r>
-              <w:rPr/>
+              <w:rPr>
+                <w:sz w:val="28"/>
+                <w:szCs w:val="28"/>
+              </w:rPr>
+              <w:t xml:space="preserve">10,2</w:t>
             </w:r>
           </w:p>
         </w:tc>
@@ -9813,7 +9791,7 @@
                 <w:sz w:val="28"/>
                 <w:szCs w:val="28"/>
               </w:rPr>
-              <w:t>0 para o plano Básico</w:t>
+              <w:t xml:space="preserve">0 para o plano Básico. Não pode ser negativo</w:t>
             </w:r>
           </w:p>
         </w:tc>
@@ -9962,7 +9940,11 @@
               <w:rPr/>
             </w:pPr>
             <w:r>
-              <w:rPr/>
+              <w:rPr>
+                <w:sz w:val="28"/>
+                <w:szCs w:val="28"/>
+              </w:rPr>
+              <w:t xml:space="preserve">*</w:t>
             </w:r>
           </w:p>
         </w:tc>
@@ -9985,7 +9967,11 @@
               <w:rPr/>
             </w:pPr>
             <w:r>
-              <w:rPr/>
+              <w:rPr>
+                <w:sz w:val="28"/>
+                <w:szCs w:val="28"/>
+              </w:rPr>
+              <w:t xml:space="preserve">Não pode ser negativo</w:t>
             </w:r>
           </w:p>
         </w:tc>
@@ -10248,7 +10234,7 @@
                 <w:sz w:val="28"/>
                 <w:szCs w:val="28"/>
               </w:rPr>
-              <w:t>Char</w:t>
+              <w:t xml:space="preserve">Enum</w:t>
             </w:r>
           </w:p>
         </w:tc>
@@ -10270,13 +10256,6 @@
               <w:pStyle w:val="Normal"/>
               <w:rPr/>
             </w:pPr>
-            <w:r>
-              <w:rPr>
-                <w:sz w:val="28"/>
-                <w:szCs w:val="28"/>
-              </w:rPr>
-              <w:t>15</w:t>
-            </w:r>
           </w:p>
         </w:tc>
         <w:tc>
@@ -10352,7 +10331,7 @@
                 <w:sz w:val="28"/>
                 <w:szCs w:val="28"/>
               </w:rPr>
-              <w:t>(Ativo, Inativo)</w:t>
+              <w:t xml:space="preserve">A = Ativo, I = Inativo. Padrão: A</w:t>
             </w:r>
           </w:p>
         </w:tc>
@@ -10406,7 +10385,7 @@
                 <w:szCs w:val="28"/>
                 <w:lang w:val="pt-BR"/>
               </w:rPr>
-              <w:t>Relacionamento: Pertence a uma Pessoa e a um Plano.</w:t>
+              <w:t>Relacionamento: Pertence a uma Pessoa (no máximo uma assinatura por pessoa) e a um Plano.</w:t>
             </w:r>
           </w:p>
         </w:tc>
@@ -10885,7 +10864,11 @@
               <w:rPr/>
             </w:pPr>
             <w:r>
-              <w:rPr/>
+              <w:rPr>
+                <w:sz w:val="28"/>
+                <w:szCs w:val="28"/>
+              </w:rPr>
+              <w:t xml:space="preserve">*</w:t>
             </w:r>
           </w:p>
         </w:tc>
@@ -10988,7 +10971,7 @@
                 <w:sz w:val="28"/>
                 <w:szCs w:val="28"/>
               </w:rPr>
-              <w:t>Char</w:t>
+              <w:t xml:space="preserve">Enum</w:t>
             </w:r>
           </w:p>
         </w:tc>
@@ -11010,13 +10993,6 @@
               <w:pStyle w:val="Normal"/>
               <w:rPr/>
             </w:pPr>
-            <w:r>
-              <w:rPr>
-                <w:sz w:val="28"/>
-                <w:szCs w:val="28"/>
-              </w:rPr>
-              <w:t>15</w:t>
-            </w:r>
           </w:p>
         </w:tc>
         <w:tc>
@@ -11092,7 +11068,7 @@
                 <w:sz w:val="28"/>
                 <w:szCs w:val="28"/>
               </w:rPr>
-              <w:t>(Ativo, Cancelado)</w:t>
+              <w:t xml:space="preserve">A = Ativo, C = Cancelado</w:t>
             </w:r>
           </w:p>
         </w:tc>

</xml_diff>

<commit_message>
docs: unifica Pessoa Física e Pessoa Jurídica na entidade Pessoa do dicionário de dados. Issue #80
</commit_message>
<xml_diff>
--- a/Requisitos/Documentos de Casos de Uso/DD-ImovelJa.docx
+++ b/Requisitos/Documentos de Casos de Uso/DD-ImovelJa.docx
@@ -4083,7 +4083,7 @@
                 <w:sz w:val="28"/>
                 <w:szCs w:val="28"/>
               </w:rPr>
-              <w:t>Pessoa (superclasse)</w:t>
+              <w:t>Pessoa</w:t>
             </w:r>
           </w:p>
           <w:p wp14:textId="7E11FD00">
@@ -4107,7 +4107,7 @@
                 <w:szCs w:val="28"/>
                 <w:lang w:val="pt-BR"/>
               </w:rPr>
-              <w:t>Relacionamento: Especializada em Pessoa Física e Pessoa Jurídica.</w:t>
+              <w:t>Relacionamento: Pode ser proprietária de Imóveis, inquilina em Aluguéis, ter uma Assinatura e enviar e receber Mensagens.</w:t>
             </w:r>
           </w:p>
         </w:tc>
@@ -4438,7 +4438,7 @@
                 <w:sz w:val="28"/>
                 <w:szCs w:val="28"/>
               </w:rPr>
-              <w:t xml:space="preserve">F = Física, J = Jurídica</w:t>
+              <w:t xml:space="preserve">F = Física, J = Jurídica. Define os campos obrigatórios (RN05)</w:t>
             </w:r>
           </w:p>
         </w:tc>
@@ -5167,7 +5167,7 @@
           </w:p>
         </w:tc>
       </w:tr>
-      <w:tr xmlns:wp14="http://schemas.microsoft.com/office/word/2010/wordml" wp14:textId="77777777">
+      <w:tr>
         <w:trPr/>
         <w:tc>
           <w:tcPr>
@@ -5179,7 +5179,7 @@
             </w:tcBorders>
             <w:tcMar/>
           </w:tcPr>
-          <w:p wp14:textId="77777777">
+          <w:p>
             <w:pPr>
               <w:pStyle w:val="Normal"/>
               <w:widowControl w:val="false"/>
@@ -5205,17 +5205,17 @@
             </w:tcBorders>
             <w:tcMar/>
           </w:tcPr>
-          <w:p wp14:textId="77777777">
-            <w:pPr>
-              <w:pStyle w:val="Normal"/>
-              <w:rPr/>
-            </w:pPr>
-            <w:r>
-              <w:rPr>
-                <w:sz w:val="28"/>
-                <w:szCs w:val="28"/>
-              </w:rPr>
-              <w:t>status</w:t>
+          <w:p>
+            <w:pPr>
+              <w:pStyle w:val="Normal"/>
+              <w:rPr/>
+            </w:pPr>
+            <w:r>
+              <w:rPr>
+                <w:sz w:val="28"/>
+                <w:szCs w:val="28"/>
+              </w:rPr>
+              <w:t>cpf</w:t>
             </w:r>
           </w:p>
         </w:tc>
@@ -5232,17 +5232,17 @@
             </w:tcBorders>
             <w:tcMar/>
           </w:tcPr>
-          <w:p wp14:textId="77777777">
-            <w:pPr>
-              <w:pStyle w:val="Normal"/>
-              <w:rPr/>
-            </w:pPr>
-            <w:r>
-              <w:rPr>
-                <w:sz w:val="28"/>
-                <w:szCs w:val="28"/>
-              </w:rPr>
-              <w:t xml:space="preserve">Enum</w:t>
+          <w:p>
+            <w:pPr>
+              <w:pStyle w:val="Normal"/>
+              <w:rPr/>
+            </w:pPr>
+            <w:r>
+              <w:rPr>
+                <w:sz w:val="28"/>
+                <w:szCs w:val="28"/>
+              </w:rPr>
+              <w:t>Char</w:t>
             </w:r>
           </w:p>
         </w:tc>
@@ -5259,11 +5259,18 @@
             </w:tcBorders>
             <w:tcMar/>
           </w:tcPr>
-          <w:p wp14:textId="77777777">
-            <w:pPr>
-              <w:pStyle w:val="Normal"/>
-              <w:rPr/>
-            </w:pPr>
+          <w:p>
+            <w:pPr>
+              <w:pStyle w:val="Normal"/>
+              <w:rPr/>
+            </w:pPr>
+            <w:r>
+              <w:rPr>
+                <w:sz w:val="28"/>
+                <w:szCs w:val="28"/>
+              </w:rPr>
+              <w:t>11</w:t>
+            </w:r>
           </w:p>
         </w:tc>
         <w:tc>
@@ -5279,13 +5286,17 @@
             </w:tcBorders>
             <w:tcMar/>
           </w:tcPr>
-          <w:p wp14:textId="77777777">
-            <w:pPr>
-              <w:pStyle w:val="Normal"/>
-              <w:rPr/>
-            </w:pPr>
-            <w:r>
-              <w:rPr/>
+          <w:p>
+            <w:pPr>
+              <w:pStyle w:val="Normal"/>
+              <w:rPr/>
+            </w:pPr>
+            <w:r>
+              <w:rPr>
+                <w:sz w:val="28"/>
+                <w:szCs w:val="28"/>
+              </w:rPr>
+              <w:t/>
             </w:r>
           </w:p>
         </w:tc>
@@ -5302,17 +5313,17 @@
             </w:tcBorders>
             <w:tcMar/>
           </w:tcPr>
-          <w:p wp14:textId="77777777">
-            <w:pPr>
-              <w:pStyle w:val="Normal"/>
-              <w:rPr/>
-            </w:pPr>
-            <w:r>
-              <w:rPr>
-                <w:sz w:val="28"/>
-                <w:szCs w:val="28"/>
-              </w:rPr>
-              <w:t>*</w:t>
+          <w:p>
+            <w:pPr>
+              <w:pStyle w:val="Normal"/>
+              <w:rPr/>
+            </w:pPr>
+            <w:r>
+              <w:rPr>
+                <w:sz w:val="28"/>
+                <w:szCs w:val="28"/>
+              </w:rPr>
+              <w:t/>
             </w:r>
           </w:p>
         </w:tc>
@@ -5329,17 +5340,391 @@
             </w:tcBorders>
             <w:tcMar/>
           </w:tcPr>
-          <w:p wp14:textId="77777777">
-            <w:pPr>
-              <w:pStyle w:val="Normal"/>
-              <w:rPr/>
-            </w:pPr>
-            <w:r>
-              <w:rPr>
-                <w:sz w:val="28"/>
-                <w:szCs w:val="28"/>
-              </w:rPr>
-              <w:t xml:space="preserve">A = Ativo, B = Bloqueado. Padrão: A</w:t>
+          <w:p>
+            <w:pPr>
+              <w:pStyle w:val="Normal"/>
+              <w:rPr/>
+            </w:pPr>
+            <w:r>
+              <w:rPr>
+                <w:sz w:val="28"/>
+                <w:szCs w:val="28"/>
+              </w:rPr>
+              <w:t xml:space="preserve">Único. Somente números (11 dígitos). Obrigatório quando o tipo for F (RN05)</w:t>
+            </w:r>
+          </w:p>
+        </w:tc>
+      </w:tr>
+      <w:tr>
+        <w:trPr/>
+        <w:tc>
+          <w:tcPr>
+            <w:tcW w:w="1559" w:type="dxa"/>
+            <w:vMerge/>
+            <w:tcBorders>
+              <w:start w:val="single" w:color="000000" w:sz="4" w:space="0"/>
+              <w:end w:val="single" w:color="000000" w:sz="4" w:space="0"/>
+            </w:tcBorders>
+            <w:tcMar/>
+          </w:tcPr>
+          <w:p>
+            <w:pPr>
+              <w:pStyle w:val="Normal"/>
+              <w:widowControl w:val="false"/>
+              <w:pBdr/>
+              <w:spacing w:line="276" w:lineRule="auto"/>
+              <w:rPr/>
+            </w:pPr>
+            <w:r>
+              <w:rPr/>
+            </w:r>
+          </w:p>
+        </w:tc>
+        <w:tc>
+          <w:tcPr>
+            <w:tcW w:w="2205" w:type="dxa"/>
+            <w:tcBorders>
+              <w:top w:val="single" w:color="000000" w:themeColor="text1" w:sz="4" w:space="0"/>
+              <w:left w:val="single" w:color="000000" w:themeColor="text1" w:sz="4"/>
+              <w:start w:val="single" w:color="000000" w:sz="4" w:space="0"/>
+              <w:bottom w:val="single" w:color="000000" w:themeColor="text1" w:sz="4" w:space="0"/>
+              <w:right w:val="single" w:color="000000" w:themeColor="text1" w:sz="4"/>
+              <w:end w:val="single" w:color="000000" w:sz="4" w:space="0"/>
+            </w:tcBorders>
+            <w:tcMar/>
+          </w:tcPr>
+          <w:p>
+            <w:pPr>
+              <w:pStyle w:val="Normal"/>
+              <w:rPr/>
+            </w:pPr>
+            <w:r>
+              <w:rPr>
+                <w:sz w:val="28"/>
+                <w:szCs w:val="28"/>
+              </w:rPr>
+              <w:t>cnpj</w:t>
+            </w:r>
+          </w:p>
+        </w:tc>
+        <w:tc>
+          <w:tcPr>
+            <w:tcW w:w="1201" w:type="dxa"/>
+            <w:tcBorders>
+              <w:top w:val="single" w:color="000000" w:themeColor="text1" w:sz="4" w:space="0"/>
+              <w:left w:val="single" w:color="000000" w:themeColor="text1" w:sz="4"/>
+              <w:start w:val="single" w:color="000000" w:sz="4" w:space="0"/>
+              <w:bottom w:val="single" w:color="000000" w:themeColor="text1" w:sz="4" w:space="0"/>
+              <w:right w:val="single" w:color="000000" w:themeColor="text1" w:sz="4"/>
+              <w:end w:val="single" w:color="000000" w:sz="4" w:space="0"/>
+            </w:tcBorders>
+            <w:tcMar/>
+          </w:tcPr>
+          <w:p>
+            <w:pPr>
+              <w:pStyle w:val="Normal"/>
+              <w:rPr/>
+            </w:pPr>
+            <w:r>
+              <w:rPr>
+                <w:sz w:val="28"/>
+                <w:szCs w:val="28"/>
+              </w:rPr>
+              <w:t>Char</w:t>
+            </w:r>
+          </w:p>
+        </w:tc>
+        <w:tc>
+          <w:tcPr>
+            <w:tcW w:w="1439" w:type="dxa"/>
+            <w:tcBorders>
+              <w:top w:val="single" w:color="000000" w:themeColor="text1" w:sz="4" w:space="0"/>
+              <w:left w:val="single" w:color="000000" w:themeColor="text1" w:sz="4"/>
+              <w:start w:val="single" w:color="000000" w:sz="4" w:space="0"/>
+              <w:bottom w:val="single" w:color="000000" w:themeColor="text1" w:sz="4" w:space="0"/>
+              <w:right w:val="single" w:color="000000" w:themeColor="text1" w:sz="4"/>
+              <w:end w:val="single" w:color="000000" w:sz="4" w:space="0"/>
+            </w:tcBorders>
+            <w:tcMar/>
+          </w:tcPr>
+          <w:p>
+            <w:pPr>
+              <w:pStyle w:val="Normal"/>
+              <w:rPr/>
+            </w:pPr>
+            <w:r>
+              <w:rPr>
+                <w:sz w:val="28"/>
+                <w:szCs w:val="28"/>
+              </w:rPr>
+              <w:t>14</w:t>
+            </w:r>
+          </w:p>
+        </w:tc>
+        <w:tc>
+          <w:tcPr>
+            <w:tcW w:w="1005" w:type="dxa"/>
+            <w:tcBorders>
+              <w:top w:val="single" w:color="000000" w:themeColor="text1" w:sz="4" w:space="0"/>
+              <w:left w:val="single" w:color="000000" w:themeColor="text1" w:sz="4"/>
+              <w:start w:val="single" w:color="000000" w:sz="4" w:space="0"/>
+              <w:bottom w:val="single" w:color="000000" w:themeColor="text1" w:sz="4" w:space="0"/>
+              <w:right w:val="single" w:color="000000" w:themeColor="text1" w:sz="4"/>
+              <w:end w:val="single" w:color="000000" w:sz="4" w:space="0"/>
+            </w:tcBorders>
+            <w:tcMar/>
+          </w:tcPr>
+          <w:p>
+            <w:pPr>
+              <w:pStyle w:val="Normal"/>
+              <w:rPr/>
+            </w:pPr>
+            <w:r>
+              <w:rPr>
+                <w:sz w:val="28"/>
+                <w:szCs w:val="28"/>
+              </w:rPr>
+              <w:t/>
+            </w:r>
+          </w:p>
+        </w:tc>
+        <w:tc>
+          <w:tcPr>
+            <w:tcW w:w="1171" w:type="dxa"/>
+            <w:tcBorders>
+              <w:top w:val="single" w:color="000000" w:themeColor="text1" w:sz="4" w:space="0"/>
+              <w:left w:val="single" w:color="000000" w:themeColor="text1" w:sz="4"/>
+              <w:start w:val="single" w:color="000000" w:sz="4" w:space="0"/>
+              <w:bottom w:val="single" w:color="000000" w:themeColor="text1" w:sz="4" w:space="0"/>
+              <w:right w:val="single" w:color="000000" w:themeColor="text1" w:sz="4"/>
+              <w:end w:val="single" w:color="000000" w:sz="4" w:space="0"/>
+            </w:tcBorders>
+            <w:tcMar/>
+          </w:tcPr>
+          <w:p>
+            <w:pPr>
+              <w:pStyle w:val="Normal"/>
+              <w:rPr/>
+            </w:pPr>
+            <w:r>
+              <w:rPr>
+                <w:sz w:val="28"/>
+                <w:szCs w:val="28"/>
+              </w:rPr>
+              <w:t/>
+            </w:r>
+          </w:p>
+        </w:tc>
+        <w:tc>
+          <w:tcPr>
+            <w:tcW w:w="1980" w:type="dxa"/>
+            <w:tcBorders>
+              <w:top w:val="single" w:color="000000" w:themeColor="text1" w:sz="4" w:space="0"/>
+              <w:left w:val="single" w:color="000000" w:themeColor="text1" w:sz="4"/>
+              <w:start w:val="single" w:color="000000" w:sz="4" w:space="0"/>
+              <w:bottom w:val="single" w:color="000000" w:themeColor="text1" w:sz="4" w:space="0"/>
+              <w:right w:val="single" w:color="000000" w:themeColor="text1" w:sz="4"/>
+              <w:end w:val="single" w:color="000000" w:sz="4" w:space="0"/>
+            </w:tcBorders>
+            <w:tcMar/>
+          </w:tcPr>
+          <w:p>
+            <w:pPr>
+              <w:pStyle w:val="Normal"/>
+              <w:rPr>
+                <w:u w:val="single"/>
+              </w:rPr>
+            </w:pPr>
+            <w:r>
+              <w:rPr>
+                <w:sz w:val="28"/>
+                <w:szCs w:val="28"/>
+              </w:rPr>
+              <w:t xml:space="preserve">Único. Somente números (14 dígitos). Obrigatório quando o tipo for J (RN05)</w:t>
+            </w:r>
+          </w:p>
+        </w:tc>
+      </w:tr>
+      <w:tr>
+        <w:trPr/>
+        <w:tc>
+          <w:tcPr>
+            <w:tcW w:w="1559" w:type="dxa"/>
+            <w:vMerge/>
+            <w:tcBorders>
+              <w:start w:val="single" w:color="000000" w:sz="4" w:space="0"/>
+              <w:end w:val="single" w:color="000000" w:sz="4" w:space="0"/>
+            </w:tcBorders>
+            <w:tcMar/>
+          </w:tcPr>
+          <w:p>
+            <w:pPr>
+              <w:pStyle w:val="Normal"/>
+              <w:widowControl w:val="false"/>
+              <w:pBdr/>
+              <w:spacing w:line="276" w:lineRule="auto"/>
+              <w:rPr/>
+            </w:pPr>
+            <w:r>
+              <w:rPr/>
+            </w:r>
+          </w:p>
+        </w:tc>
+        <w:tc>
+          <w:tcPr>
+            <w:tcW w:w="2205" w:type="dxa"/>
+            <w:tcBorders>
+              <w:top w:val="single" w:color="000000" w:themeColor="text1" w:sz="4" w:space="0"/>
+              <w:left w:val="single" w:color="000000" w:themeColor="text1" w:sz="4"/>
+              <w:start w:val="single" w:color="000000" w:sz="4" w:space="0"/>
+              <w:bottom w:val="single" w:color="000000" w:themeColor="text1" w:sz="4" w:space="0"/>
+              <w:right w:val="single" w:color="000000" w:themeColor="text1" w:sz="4"/>
+              <w:end w:val="single" w:color="000000" w:sz="4" w:space="0"/>
+            </w:tcBorders>
+            <w:tcMar/>
+          </w:tcPr>
+          <w:p>
+            <w:pPr>
+              <w:pStyle w:val="Normal"/>
+              <w:rPr/>
+            </w:pPr>
+            <w:r>
+              <w:rPr>
+                <w:sz w:val="28"/>
+                <w:szCs w:val="28"/>
+              </w:rPr>
+              <w:t>dataNascimento</w:t>
+            </w:r>
+          </w:p>
+        </w:tc>
+        <w:tc>
+          <w:tcPr>
+            <w:tcW w:w="1201" w:type="dxa"/>
+            <w:tcBorders>
+              <w:top w:val="single" w:color="000000" w:themeColor="text1" w:sz="4" w:space="0"/>
+              <w:left w:val="single" w:color="000000" w:themeColor="text1" w:sz="4"/>
+              <w:start w:val="single" w:color="000000" w:sz="4" w:space="0"/>
+              <w:bottom w:val="single" w:color="000000" w:themeColor="text1" w:sz="4" w:space="0"/>
+              <w:right w:val="single" w:color="000000" w:themeColor="text1" w:sz="4"/>
+              <w:end w:val="single" w:color="000000" w:sz="4" w:space="0"/>
+            </w:tcBorders>
+            <w:tcMar/>
+          </w:tcPr>
+          <w:p>
+            <w:pPr>
+              <w:pStyle w:val="Normal"/>
+              <w:rPr/>
+            </w:pPr>
+            <w:r>
+              <w:rPr>
+                <w:sz w:val="28"/>
+                <w:szCs w:val="28"/>
+              </w:rPr>
+              <w:t>Date</w:t>
+            </w:r>
+          </w:p>
+        </w:tc>
+        <w:tc>
+          <w:tcPr>
+            <w:tcW w:w="1439" w:type="dxa"/>
+            <w:tcBorders>
+              <w:top w:val="single" w:color="000000" w:themeColor="text1" w:sz="4" w:space="0"/>
+              <w:left w:val="single" w:color="000000" w:themeColor="text1" w:sz="4"/>
+              <w:start w:val="single" w:color="000000" w:sz="4" w:space="0"/>
+              <w:bottom w:val="single" w:color="000000" w:themeColor="text1" w:sz="4" w:space="0"/>
+              <w:right w:val="single" w:color="000000" w:themeColor="text1" w:sz="4"/>
+              <w:end w:val="single" w:color="000000" w:sz="4" w:space="0"/>
+            </w:tcBorders>
+            <w:tcMar/>
+          </w:tcPr>
+          <w:p>
+            <w:pPr>
+              <w:pStyle w:val="Normal"/>
+              <w:rPr/>
+            </w:pPr>
+            <w:r>
+              <w:rPr/>
+            </w:r>
+          </w:p>
+        </w:tc>
+        <w:tc>
+          <w:tcPr>
+            <w:tcW w:w="1005" w:type="dxa"/>
+            <w:tcBorders>
+              <w:top w:val="single" w:color="000000" w:themeColor="text1" w:sz="4" w:space="0"/>
+              <w:left w:val="single" w:color="000000" w:themeColor="text1" w:sz="4"/>
+              <w:start w:val="single" w:color="000000" w:sz="4" w:space="0"/>
+              <w:bottom w:val="single" w:color="000000" w:themeColor="text1" w:sz="4" w:space="0"/>
+              <w:right w:val="single" w:color="000000" w:themeColor="text1" w:sz="4"/>
+              <w:end w:val="single" w:color="000000" w:sz="4" w:space="0"/>
+            </w:tcBorders>
+            <w:tcMar/>
+          </w:tcPr>
+          <w:p>
+            <w:pPr>
+              <w:pStyle w:val="Normal"/>
+              <w:rPr/>
+            </w:pPr>
+            <w:r>
+              <w:rPr>
+                <w:sz w:val="28"/>
+                <w:szCs w:val="28"/>
+              </w:rPr>
+              <w:t/>
+            </w:r>
+          </w:p>
+        </w:tc>
+        <w:tc>
+          <w:tcPr>
+            <w:tcW w:w="1171" w:type="dxa"/>
+            <w:tcBorders>
+              <w:top w:val="single" w:color="000000" w:themeColor="text1" w:sz="4" w:space="0"/>
+              <w:left w:val="single" w:color="000000" w:themeColor="text1" w:sz="4"/>
+              <w:start w:val="single" w:color="000000" w:sz="4" w:space="0"/>
+              <w:bottom w:val="single" w:color="000000" w:themeColor="text1" w:sz="4" w:space="0"/>
+              <w:right w:val="single" w:color="000000" w:themeColor="text1" w:sz="4"/>
+              <w:end w:val="single" w:color="000000" w:sz="4" w:space="0"/>
+            </w:tcBorders>
+            <w:tcMar/>
+          </w:tcPr>
+          <w:p>
+            <w:pPr>
+              <w:pStyle w:val="Normal"/>
+              <w:rPr/>
+            </w:pPr>
+            <w:r>
+              <w:rPr>
+                <w:sz w:val="28"/>
+                <w:szCs w:val="28"/>
+              </w:rPr>
+              <w:t/>
+            </w:r>
+          </w:p>
+        </w:tc>
+        <w:tc>
+          <w:tcPr>
+            <w:tcW w:w="1980" w:type="dxa"/>
+            <w:tcBorders>
+              <w:top w:val="single" w:color="000000" w:themeColor="text1" w:sz="4" w:space="0"/>
+              <w:left w:val="single" w:color="000000" w:themeColor="text1" w:sz="4"/>
+              <w:start w:val="single" w:color="000000" w:sz="4" w:space="0"/>
+              <w:bottom w:val="single" w:color="000000" w:themeColor="text1" w:sz="4" w:space="0"/>
+              <w:right w:val="single" w:color="000000" w:themeColor="text1" w:sz="4"/>
+              <w:end w:val="single" w:color="000000" w:sz="4" w:space="0"/>
+            </w:tcBorders>
+            <w:tcMar/>
+          </w:tcPr>
+          <w:p>
+            <w:pPr>
+              <w:pStyle w:val="Normal"/>
+              <w:rPr/>
+            </w:pPr>
+            <w:r>
+              <w:rPr>
+                <w:sz w:val="28"/>
+                <w:szCs w:val="28"/>
+              </w:rPr>
+              <w:t>Obrigatória quando o tipo for F (RN05)</w:t>
             </w:r>
           </w:p>
         </w:tc>
@@ -5349,199 +5734,6 @@
         <w:tc>
           <w:tcPr>
             <w:tcW w:w="1559" w:type="dxa"/>
-            <w:vMerge w:val="restart"/>
-            <w:tcBorders>
-              <w:top w:val="single" w:color="000000" w:themeColor="text1" w:sz="4" w:space="0"/>
-              <w:left w:val="single" w:color="000000" w:themeColor="text1" w:sz="4"/>
-              <w:start w:val="single" w:color="000000" w:sz="4" w:space="0"/>
-              <w:bottom w:val="single" w:color="000000" w:themeColor="text1" w:sz="4" w:space="0"/>
-              <w:right w:val="single" w:color="000000" w:themeColor="text1" w:sz="4"/>
-              <w:end w:val="single" w:color="000000" w:sz="4" w:space="0"/>
-            </w:tcBorders>
-            <w:tcMar/>
-          </w:tcPr>
-          <w:p wp14:textId="77777777">
-            <w:pPr>
-              <w:pStyle w:val="Normal"/>
-              <w:rPr/>
-            </w:pPr>
-            <w:r>
-              <w:rPr>
-                <w:sz w:val="28"/>
-                <w:szCs w:val="28"/>
-              </w:rPr>
-              <w:t>Pessoa Física (especializa Pessoa)</w:t>
-            </w:r>
-          </w:p>
-        </w:tc>
-        <w:tc>
-          <w:tcPr>
-            <w:tcW w:w="2205" w:type="dxa"/>
-            <w:tcBorders>
-              <w:top w:val="single" w:color="000000" w:themeColor="text1" w:sz="4" w:space="0"/>
-              <w:left w:val="single" w:color="000000" w:themeColor="text1" w:sz="4"/>
-              <w:start w:val="single" w:color="000000" w:sz="4" w:space="0"/>
-              <w:bottom w:val="single" w:color="000000" w:themeColor="text1" w:sz="4" w:space="0"/>
-              <w:right w:val="single" w:color="000000" w:themeColor="text1" w:sz="4"/>
-              <w:end w:val="single" w:color="000000" w:sz="4" w:space="0"/>
-            </w:tcBorders>
-            <w:tcMar/>
-          </w:tcPr>
-          <w:p wp14:textId="77777777">
-            <w:pPr>
-              <w:pStyle w:val="Normal"/>
-              <w:rPr/>
-            </w:pPr>
-            <w:r>
-              <w:rPr>
-                <w:sz w:val="28"/>
-                <w:szCs w:val="28"/>
-              </w:rPr>
-              <w:t>cpf</w:t>
-            </w:r>
-          </w:p>
-        </w:tc>
-        <w:tc>
-          <w:tcPr>
-            <w:tcW w:w="1201" w:type="dxa"/>
-            <w:tcBorders>
-              <w:top w:val="single" w:color="000000" w:themeColor="text1" w:sz="4" w:space="0"/>
-              <w:left w:val="single" w:color="000000" w:themeColor="text1" w:sz="4"/>
-              <w:start w:val="single" w:color="000000" w:sz="4" w:space="0"/>
-              <w:bottom w:val="single" w:color="000000" w:themeColor="text1" w:sz="4" w:space="0"/>
-              <w:right w:val="single" w:color="000000" w:themeColor="text1" w:sz="4"/>
-              <w:end w:val="single" w:color="000000" w:sz="4" w:space="0"/>
-            </w:tcBorders>
-            <w:tcMar/>
-          </w:tcPr>
-          <w:p wp14:textId="77777777">
-            <w:pPr>
-              <w:pStyle w:val="Normal"/>
-              <w:rPr/>
-            </w:pPr>
-            <w:r>
-              <w:rPr>
-                <w:sz w:val="28"/>
-                <w:szCs w:val="28"/>
-              </w:rPr>
-              <w:t>Char</w:t>
-            </w:r>
-          </w:p>
-        </w:tc>
-        <w:tc>
-          <w:tcPr>
-            <w:tcW w:w="1439" w:type="dxa"/>
-            <w:tcBorders>
-              <w:top w:val="single" w:color="000000" w:themeColor="text1" w:sz="4" w:space="0"/>
-              <w:left w:val="single" w:color="000000" w:themeColor="text1" w:sz="4"/>
-              <w:start w:val="single" w:color="000000" w:sz="4" w:space="0"/>
-              <w:bottom w:val="single" w:color="000000" w:themeColor="text1" w:sz="4" w:space="0"/>
-              <w:right w:val="single" w:color="000000" w:themeColor="text1" w:sz="4"/>
-              <w:end w:val="single" w:color="000000" w:sz="4" w:space="0"/>
-            </w:tcBorders>
-            <w:tcMar/>
-          </w:tcPr>
-          <w:p wp14:textId="77777777">
-            <w:pPr>
-              <w:pStyle w:val="Normal"/>
-              <w:rPr/>
-            </w:pPr>
-            <w:r>
-              <w:rPr>
-                <w:sz w:val="28"/>
-                <w:szCs w:val="28"/>
-              </w:rPr>
-              <w:t>11</w:t>
-            </w:r>
-          </w:p>
-        </w:tc>
-        <w:tc>
-          <w:tcPr>
-            <w:tcW w:w="1005" w:type="dxa"/>
-            <w:tcBorders>
-              <w:top w:val="single" w:color="000000" w:themeColor="text1" w:sz="4" w:space="0"/>
-              <w:left w:val="single" w:color="000000" w:themeColor="text1" w:sz="4"/>
-              <w:start w:val="single" w:color="000000" w:sz="4" w:space="0"/>
-              <w:bottom w:val="single" w:color="000000" w:themeColor="text1" w:sz="4" w:space="0"/>
-              <w:right w:val="single" w:color="000000" w:themeColor="text1" w:sz="4"/>
-              <w:end w:val="single" w:color="000000" w:sz="4" w:space="0"/>
-            </w:tcBorders>
-            <w:tcMar/>
-          </w:tcPr>
-          <w:p wp14:textId="77777777">
-            <w:pPr>
-              <w:pStyle w:val="Normal"/>
-              <w:rPr/>
-            </w:pPr>
-            <w:r>
-              <w:rPr>
-                <w:sz w:val="28"/>
-                <w:szCs w:val="28"/>
-              </w:rPr>
-              <w:t>*</w:t>
-            </w:r>
-          </w:p>
-        </w:tc>
-        <w:tc>
-          <w:tcPr>
-            <w:tcW w:w="1171" w:type="dxa"/>
-            <w:tcBorders>
-              <w:top w:val="single" w:color="000000" w:themeColor="text1" w:sz="4" w:space="0"/>
-              <w:left w:val="single" w:color="000000" w:themeColor="text1" w:sz="4"/>
-              <w:start w:val="single" w:color="000000" w:sz="4" w:space="0"/>
-              <w:bottom w:val="single" w:color="000000" w:themeColor="text1" w:sz="4" w:space="0"/>
-              <w:right w:val="single" w:color="000000" w:themeColor="text1" w:sz="4"/>
-              <w:end w:val="single" w:color="000000" w:sz="4" w:space="0"/>
-            </w:tcBorders>
-            <w:tcMar/>
-          </w:tcPr>
-          <w:p wp14:textId="77777777">
-            <w:pPr>
-              <w:pStyle w:val="Normal"/>
-              <w:rPr/>
-            </w:pPr>
-            <w:r>
-              <w:rPr>
-                <w:sz w:val="28"/>
-                <w:szCs w:val="28"/>
-              </w:rPr>
-              <w:t>*</w:t>
-            </w:r>
-          </w:p>
-        </w:tc>
-        <w:tc>
-          <w:tcPr>
-            <w:tcW w:w="1980" w:type="dxa"/>
-            <w:tcBorders>
-              <w:top w:val="single" w:color="000000" w:themeColor="text1" w:sz="4" w:space="0"/>
-              <w:left w:val="single" w:color="000000" w:themeColor="text1" w:sz="4"/>
-              <w:start w:val="single" w:color="000000" w:sz="4" w:space="0"/>
-              <w:bottom w:val="single" w:color="000000" w:themeColor="text1" w:sz="4" w:space="0"/>
-              <w:right w:val="single" w:color="000000" w:themeColor="text1" w:sz="4"/>
-              <w:end w:val="single" w:color="000000" w:sz="4" w:space="0"/>
-            </w:tcBorders>
-            <w:tcMar/>
-          </w:tcPr>
-          <w:p wp14:textId="77777777">
-            <w:pPr>
-              <w:pStyle w:val="Normal"/>
-              <w:rPr/>
-            </w:pPr>
-            <w:r>
-              <w:rPr>
-                <w:sz w:val="28"/>
-                <w:szCs w:val="28"/>
-              </w:rPr>
-              <w:t xml:space="preserve">Único. Somente números (11 dígitos)</w:t>
-            </w:r>
-          </w:p>
-        </w:tc>
-      </w:tr>
-      <w:tr xmlns:wp14="http://schemas.microsoft.com/office/word/2010/wordml" wp14:textId="77777777">
-        <w:trPr/>
-        <w:tc>
-          <w:tcPr>
-            <w:tcW w:w="1559" w:type="dxa"/>
             <w:vMerge/>
             <w:tcBorders>
               <w:start w:val="single" w:color="000000" w:sz="4" w:space="0"/>
@@ -5585,7 +5777,7 @@
                 <w:sz w:val="28"/>
                 <w:szCs w:val="28"/>
               </w:rPr>
-              <w:t>dataNascimento</w:t>
+              <w:t>status</w:t>
             </w:r>
           </w:p>
         </w:tc>
@@ -5612,7 +5804,7 @@
                 <w:sz w:val="28"/>
                 <w:szCs w:val="28"/>
               </w:rPr>
-              <w:t>Date</w:t>
+              <w:t xml:space="preserve">Enum</w:t>
             </w:r>
           </w:p>
         </w:tc>
@@ -5634,9 +5826,6 @@
               <w:pStyle w:val="Normal"/>
               <w:rPr/>
             </w:pPr>
-            <w:r>
-              <w:rPr/>
-            </w:r>
           </w:p>
         </w:tc>
         <w:tc>
@@ -5708,201 +5897,11 @@
               <w:rPr/>
             </w:pPr>
             <w:r>
-              <w:rPr/>
-            </w:r>
-          </w:p>
-        </w:tc>
-      </w:tr>
-      <w:tr xmlns:wp14="http://schemas.microsoft.com/office/word/2010/wordml" wp14:textId="77777777">
-        <w:trPr/>
-        <w:tc>
-          <w:tcPr>
-            <w:tcW w:w="1559" w:type="dxa"/>
-            <w:tcBorders>
-              <w:top w:val="single" w:color="000000" w:themeColor="text1" w:sz="4" w:space="0"/>
-              <w:left w:val="single" w:color="000000" w:themeColor="text1" w:sz="4"/>
-              <w:start w:val="single" w:color="000000" w:sz="4" w:space="0"/>
-              <w:bottom w:val="single" w:color="000000" w:themeColor="text1" w:sz="4" w:space="0"/>
-              <w:right w:val="single" w:color="000000" w:themeColor="text1" w:sz="4"/>
-              <w:end w:val="single" w:color="000000" w:sz="4" w:space="0"/>
-            </w:tcBorders>
-            <w:tcMar/>
-          </w:tcPr>
-          <w:p wp14:textId="77777777">
-            <w:pPr>
-              <w:pStyle w:val="Normal"/>
-              <w:rPr/>
-            </w:pPr>
-            <w:r>
-              <w:rPr>
-                <w:sz w:val="28"/>
-                <w:szCs w:val="28"/>
-              </w:rPr>
-              <w:t>Pessoa Jurídica (especializa Pessoa)</w:t>
-            </w:r>
-          </w:p>
-        </w:tc>
-        <w:tc>
-          <w:tcPr>
-            <w:tcW w:w="2205" w:type="dxa"/>
-            <w:tcBorders>
-              <w:top w:val="single" w:color="000000" w:themeColor="text1" w:sz="4" w:space="0"/>
-              <w:left w:val="single" w:color="000000" w:themeColor="text1" w:sz="4"/>
-              <w:start w:val="single" w:color="000000" w:sz="4" w:space="0"/>
-              <w:bottom w:val="single" w:color="000000" w:themeColor="text1" w:sz="4" w:space="0"/>
-              <w:right w:val="single" w:color="000000" w:themeColor="text1" w:sz="4"/>
-              <w:end w:val="single" w:color="000000" w:sz="4" w:space="0"/>
-            </w:tcBorders>
-            <w:tcMar/>
-          </w:tcPr>
-          <w:p wp14:textId="77777777">
-            <w:pPr>
-              <w:pStyle w:val="Normal"/>
-              <w:rPr/>
-            </w:pPr>
-            <w:r>
-              <w:rPr>
-                <w:sz w:val="28"/>
-                <w:szCs w:val="28"/>
-              </w:rPr>
-              <w:t>cnpj</w:t>
-            </w:r>
-          </w:p>
-        </w:tc>
-        <w:tc>
-          <w:tcPr>
-            <w:tcW w:w="1201" w:type="dxa"/>
-            <w:tcBorders>
-              <w:top w:val="single" w:color="000000" w:themeColor="text1" w:sz="4" w:space="0"/>
-              <w:left w:val="single" w:color="000000" w:themeColor="text1" w:sz="4"/>
-              <w:start w:val="single" w:color="000000" w:sz="4" w:space="0"/>
-              <w:bottom w:val="single" w:color="000000" w:themeColor="text1" w:sz="4" w:space="0"/>
-              <w:right w:val="single" w:color="000000" w:themeColor="text1" w:sz="4"/>
-              <w:end w:val="single" w:color="000000" w:sz="4" w:space="0"/>
-            </w:tcBorders>
-            <w:tcMar/>
-          </w:tcPr>
-          <w:p wp14:textId="77777777">
-            <w:pPr>
-              <w:pStyle w:val="Normal"/>
-              <w:rPr/>
-            </w:pPr>
-            <w:r>
-              <w:rPr>
-                <w:sz w:val="28"/>
-                <w:szCs w:val="28"/>
-              </w:rPr>
-              <w:t>Char</w:t>
-            </w:r>
-          </w:p>
-        </w:tc>
-        <w:tc>
-          <w:tcPr>
-            <w:tcW w:w="1439" w:type="dxa"/>
-            <w:tcBorders>
-              <w:top w:val="single" w:color="000000" w:themeColor="text1" w:sz="4" w:space="0"/>
-              <w:left w:val="single" w:color="000000" w:themeColor="text1" w:sz="4"/>
-              <w:start w:val="single" w:color="000000" w:sz="4" w:space="0"/>
-              <w:bottom w:val="single" w:color="000000" w:themeColor="text1" w:sz="4" w:space="0"/>
-              <w:right w:val="single" w:color="000000" w:themeColor="text1" w:sz="4"/>
-              <w:end w:val="single" w:color="000000" w:sz="4" w:space="0"/>
-            </w:tcBorders>
-            <w:tcMar/>
-          </w:tcPr>
-          <w:p wp14:textId="77777777">
-            <w:pPr>
-              <w:pStyle w:val="Normal"/>
-              <w:rPr/>
-            </w:pPr>
-            <w:r>
-              <w:rPr>
-                <w:sz w:val="28"/>
-                <w:szCs w:val="28"/>
-              </w:rPr>
-              <w:t>14</w:t>
-            </w:r>
-          </w:p>
-        </w:tc>
-        <w:tc>
-          <w:tcPr>
-            <w:tcW w:w="1005" w:type="dxa"/>
-            <w:tcBorders>
-              <w:top w:val="single" w:color="000000" w:themeColor="text1" w:sz="4" w:space="0"/>
-              <w:left w:val="single" w:color="000000" w:themeColor="text1" w:sz="4"/>
-              <w:start w:val="single" w:color="000000" w:sz="4" w:space="0"/>
-              <w:bottom w:val="single" w:color="000000" w:themeColor="text1" w:sz="4" w:space="0"/>
-              <w:right w:val="single" w:color="000000" w:themeColor="text1" w:sz="4"/>
-              <w:end w:val="single" w:color="000000" w:sz="4" w:space="0"/>
-            </w:tcBorders>
-            <w:tcMar/>
-          </w:tcPr>
-          <w:p wp14:textId="77777777">
-            <w:pPr>
-              <w:pStyle w:val="Normal"/>
-              <w:rPr/>
-            </w:pPr>
-            <w:r>
-              <w:rPr>
-                <w:sz w:val="28"/>
-                <w:szCs w:val="28"/>
-              </w:rPr>
-              <w:t>*</w:t>
-            </w:r>
-          </w:p>
-        </w:tc>
-        <w:tc>
-          <w:tcPr>
-            <w:tcW w:w="1171" w:type="dxa"/>
-            <w:tcBorders>
-              <w:top w:val="single" w:color="000000" w:themeColor="text1" w:sz="4" w:space="0"/>
-              <w:left w:val="single" w:color="000000" w:themeColor="text1" w:sz="4"/>
-              <w:start w:val="single" w:color="000000" w:sz="4" w:space="0"/>
-              <w:bottom w:val="single" w:color="000000" w:themeColor="text1" w:sz="4" w:space="0"/>
-              <w:right w:val="single" w:color="000000" w:themeColor="text1" w:sz="4"/>
-              <w:end w:val="single" w:color="000000" w:sz="4" w:space="0"/>
-            </w:tcBorders>
-            <w:tcMar/>
-          </w:tcPr>
-          <w:p wp14:textId="77777777">
-            <w:pPr>
-              <w:pStyle w:val="Normal"/>
-              <w:rPr/>
-            </w:pPr>
-            <w:r>
-              <w:rPr>
-                <w:sz w:val="28"/>
-                <w:szCs w:val="28"/>
-              </w:rPr>
-              <w:t>*</w:t>
-            </w:r>
-          </w:p>
-        </w:tc>
-        <w:tc>
-          <w:tcPr>
-            <w:tcW w:w="1980" w:type="dxa"/>
-            <w:tcBorders>
-              <w:top w:val="single" w:color="000000" w:themeColor="text1" w:sz="4" w:space="0"/>
-              <w:left w:val="single" w:color="000000" w:themeColor="text1" w:sz="4"/>
-              <w:start w:val="single" w:color="000000" w:sz="4" w:space="0"/>
-              <w:bottom w:val="single" w:color="000000" w:themeColor="text1" w:sz="4" w:space="0"/>
-              <w:right w:val="single" w:color="000000" w:themeColor="text1" w:sz="4"/>
-              <w:end w:val="single" w:color="000000" w:sz="4" w:space="0"/>
-            </w:tcBorders>
-            <w:tcMar/>
-          </w:tcPr>
-          <w:p wp14:textId="77777777">
-            <w:pPr>
-              <w:pStyle w:val="Normal"/>
-              <w:rPr>
-                <w:u w:val="single"/>
-              </w:rPr>
-            </w:pPr>
-            <w:r>
-              <w:rPr>
-                <w:sz w:val="28"/>
-                <w:szCs w:val="28"/>
-              </w:rPr>
-              <w:t xml:space="preserve">Único. Somente números (14 dígitos)</w:t>
+              <w:rPr>
+                <w:sz w:val="28"/>
+                <w:szCs w:val="28"/>
+              </w:rPr>
+              <w:t xml:space="preserve">A = Ativo, B = Bloqueado. Padrão: A</w:t>
             </w:r>
           </w:p>
         </w:tc>

</xml_diff>